<commit_message>
ajout doc au formay pdf
</commit_message>
<xml_diff>
--- a/assistant complexe.docx
+++ b/assistant complexe.docx
@@ -572,13 +572,6 @@
               </w:rPr>
               <w:t>HEUR</w:t>
             </w:r>
-            <w:r>
-              <w:rPr>
-                <w:rFonts w:cs="Arial"/>
-                <w:szCs w:val="18"/>
-              </w:rPr>
-              <w:t xml:space="preserve"> – Philippe Gallen</w:t>
-            </w:r>
           </w:p>
         </w:tc>
       </w:tr>
@@ -1013,10 +1006,10 @@
         <w:tblLook w:val="04A0" w:firstRow="1" w:lastRow="0" w:firstColumn="1" w:lastColumn="0" w:noHBand="0" w:noVBand="1"/>
       </w:tblPr>
       <w:tblGrid>
-        <w:gridCol w:w="1118"/>
-        <w:gridCol w:w="1464"/>
-        <w:gridCol w:w="2484"/>
-        <w:gridCol w:w="4806"/>
+        <w:gridCol w:w="1115"/>
+        <w:gridCol w:w="1514"/>
+        <w:gridCol w:w="2472"/>
+        <w:gridCol w:w="4771"/>
       </w:tblGrid>
       <w:tr>
         <w:tc>
@@ -1145,7 +1138,14 @@
                 <w:rFonts w:cs="Arial"/>
                 <w:szCs w:val="18"/>
               </w:rPr>
-              <w:t>0./07/2025</w:t>
+              <w:t>07</w:t>
+            </w:r>
+            <w:r>
+              <w:rPr>
+                <w:rFonts w:cs="Arial"/>
+                <w:szCs w:val="18"/>
+              </w:rPr>
+              <w:t>/07/2025</w:t>
             </w:r>
           </w:p>
         </w:tc>
@@ -1165,7 +1165,7 @@
                 <w:rFonts w:cs="Arial"/>
                 <w:szCs w:val="18"/>
               </w:rPr>
-              <w:t>Philippe Gallen</w:t>
+              <w:t>Gérôme PECHEUR</w:t>
             </w:r>
           </w:p>
         </w:tc>
@@ -1186,7 +1186,7 @@
                 <w:rFonts w:cs="Arial"/>
                 <w:szCs w:val="18"/>
               </w:rPr>
-              <w:t>Version de diffusion 1</w:t>
+              <w:t>Première version diffusée</w:t>
             </w:r>
           </w:p>
         </w:tc>
@@ -7818,6 +7818,7 @@
     <w:rsid w:val="00D50511"/>
     <w:rsid w:val="00D7017E"/>
     <w:rsid w:val="00DB2D73"/>
+    <w:rsid w:val="00DB4639"/>
     <w:rsid w:val="00E17E2D"/>
     <w:rsid w:val="00E40FFF"/>
     <w:rsid w:val="00EC264E"/>
@@ -8591,6 +8592,10 @@
 </file>
 
 <file path=customXml/item1.xml><?xml version="1.0" encoding="utf-8"?>
+<b:Sources xmlns:b="http://schemas.openxmlformats.org/officeDocument/2006/bibliography" xmlns="http://schemas.openxmlformats.org/officeDocument/2006/bibliography" SelectedStyle="\APA.XSL" StyleName="APA"/>
+</file>
+
+<file path=customXml/item2.xml><?xml version="1.0" encoding="utf-8"?>
 <p:properties xmlns:p="http://schemas.microsoft.com/office/2006/metadata/properties" xmlns:xsi="http://www.w3.org/2001/XMLSchema-instance" xmlns:pc="http://schemas.microsoft.com/office/infopath/2007/PartnerControls">
   <documentManagement>
     <lcf76f155ced4ddcb4097134ff3c332f xmlns="b295003c-aa87-407e-9024-fdee4e88f6fa">
@@ -8600,11 +8605,16 @@
 </p:properties>
 </file>
 
-<file path=customXml/item2.xml><?xml version="1.0" encoding="utf-8"?>
-<b:Sources xmlns:b="http://schemas.openxmlformats.org/officeDocument/2006/bibliography" xmlns="http://schemas.openxmlformats.org/officeDocument/2006/bibliography" SelectedStyle="\APA.XSL" StyleName="APA"/>
+<file path=customXml/item3.xml><?xml version="1.0" encoding="utf-8"?>
+<?mso-contentType ?>
+<FormTemplates xmlns="http://schemas.microsoft.com/sharepoint/v3/contenttype/forms">
+  <Display>DocumentLibraryForm</Display>
+  <Edit>DocumentLibraryForm</Edit>
+  <New>DocumentLibraryForm</New>
+</FormTemplates>
 </file>
 
-<file path=customXml/item3.xml><?xml version="1.0" encoding="utf-8"?>
+<file path=customXml/item4.xml><?xml version="1.0" encoding="utf-8"?>
 <ct:contentTypeSchema xmlns:ct="http://schemas.microsoft.com/office/2006/metadata/contentType" xmlns:ma="http://schemas.microsoft.com/office/2006/metadata/properties/metaAttributes" ct:_="" ma:_="" ma:contentTypeName="Document" ma:contentTypeID="0x010100A3FA4CB5114F4B43B99F0B6DC8751D90" ma:contentTypeVersion="10" ma:contentTypeDescription="Crée un document." ma:contentTypeScope="" ma:versionID="501205be520febb413c56432ff8e6df1">
   <xsd:schema xmlns:xsd="http://www.w3.org/2001/XMLSchema" xmlns:xs="http://www.w3.org/2001/XMLSchema" xmlns:p="http://schemas.microsoft.com/office/2006/metadata/properties" xmlns:ns2="b295003c-aa87-407e-9024-fdee4e88f6fa" targetNamespace="http://schemas.microsoft.com/office/2006/metadata/properties" ma:root="true" ma:fieldsID="0378f5bf275aa5e8e5bb75b38d3da7db" ns2:_="">
     <xsd:import namespace="b295003c-aa87-407e-9024-fdee4e88f6fa"/>
@@ -8782,16 +8792,15 @@
 </ct:contentTypeSchema>
 </file>
 
-<file path=customXml/item4.xml><?xml version="1.0" encoding="utf-8"?>
-<?mso-contentType ?>
-<FormTemplates xmlns="http://schemas.microsoft.com/sharepoint/v3/contenttype/forms">
-  <Display>DocumentLibraryForm</Display>
-  <Edit>DocumentLibraryForm</Edit>
-  <New>DocumentLibraryForm</New>
-</FormTemplates>
+<file path=customXml/itemProps1.xml><?xml version="1.0" encoding="utf-8"?>
+<ds:datastoreItem xmlns:ds="http://schemas.openxmlformats.org/officeDocument/2006/customXml" ds:itemID="{0FF0F878-5F0F-460C-9013-40E72731A637}">
+  <ds:schemaRefs>
+    <ds:schemaRef ds:uri="http://schemas.openxmlformats.org/officeDocument/2006/bibliography"/>
+  </ds:schemaRefs>
+</ds:datastoreItem>
 </file>
 
-<file path=customXml/itemProps1.xml><?xml version="1.0" encoding="utf-8"?>
+<file path=customXml/itemProps2.xml><?xml version="1.0" encoding="utf-8"?>
 <ds:datastoreItem xmlns:ds="http://schemas.openxmlformats.org/officeDocument/2006/customXml" ds:itemID="{1159403A-C237-488E-8C5E-DABF9FCE7043}">
   <ds:schemaRefs>
     <ds:schemaRef ds:uri="http://schemas.microsoft.com/office/2006/metadata/properties"/>
@@ -8801,15 +8810,15 @@
 </ds:datastoreItem>
 </file>
 
-<file path=customXml/itemProps2.xml><?xml version="1.0" encoding="utf-8"?>
-<ds:datastoreItem xmlns:ds="http://schemas.openxmlformats.org/officeDocument/2006/customXml" ds:itemID="{0FF0F878-5F0F-460C-9013-40E72731A637}">
+<file path=customXml/itemProps3.xml><?xml version="1.0" encoding="utf-8"?>
+<ds:datastoreItem xmlns:ds="http://schemas.openxmlformats.org/officeDocument/2006/customXml" ds:itemID="{EEE2973D-7DD7-4773-855D-5CAD81242BDE}">
   <ds:schemaRefs>
-    <ds:schemaRef ds:uri="http://schemas.openxmlformats.org/officeDocument/2006/bibliography"/>
+    <ds:schemaRef ds:uri="http://schemas.microsoft.com/sharepoint/v3/contenttype/forms"/>
   </ds:schemaRefs>
 </ds:datastoreItem>
 </file>
 
-<file path=customXml/itemProps3.xml><?xml version="1.0" encoding="utf-8"?>
+<file path=customXml/itemProps4.xml><?xml version="1.0" encoding="utf-8"?>
 <ds:datastoreItem xmlns:ds="http://schemas.openxmlformats.org/officeDocument/2006/customXml" ds:itemID="{B747A848-EED6-42A4-AAA3-C39C067A5137}">
   <ds:schemaRefs>
     <ds:schemaRef ds:uri="http://schemas.microsoft.com/office/2006/metadata/contentType"/>
@@ -8825,12 +8834,4 @@
     <ds:schemaRef ds:uri="http://schemas.microsoft.com/internal/obd"/>
   </ds:schemaRefs>
 </ds:datastoreItem>
-</file>
-
-<file path=customXml/itemProps4.xml><?xml version="1.0" encoding="utf-8"?>
-<ds:datastoreItem xmlns:ds="http://schemas.openxmlformats.org/officeDocument/2006/customXml" ds:itemID="{EEE2973D-7DD7-4773-855D-5CAD81242BDE}">
-  <ds:schemaRefs>
-    <ds:schemaRef ds:uri="http://schemas.microsoft.com/sharepoint/v3/contenttype/forms"/>
-  </ds:schemaRefs>
-</ds:datastoreItem>
 </file>
</xml_diff>

<commit_message>
modification de la doc
</commit_message>
<xml_diff>
--- a/assistant complexe.docx
+++ b/assistant complexe.docx
@@ -177,7 +177,27 @@
                 <w:sz w:val="28"/>
                 <w:szCs w:val="28"/>
               </w:rPr>
-              <w:t>1.0.0</w:t>
+              <w:t>1.</w:t>
+            </w:r>
+            <w:r>
+              <w:rPr>
+                <w:rFonts w:ascii="Times New Roman" w:hAnsi="Times New Roman" w:cs="Times New Roman"/>
+                <w:b/>
+                <w:noProof/>
+                <w:sz w:val="28"/>
+                <w:szCs w:val="28"/>
+              </w:rPr>
+              <w:t>1</w:t>
+            </w:r>
+            <w:r>
+              <w:rPr>
+                <w:rFonts w:ascii="Times New Roman" w:hAnsi="Times New Roman" w:cs="Times New Roman"/>
+                <w:b/>
+                <w:noProof/>
+                <w:sz w:val="28"/>
+                <w:szCs w:val="28"/>
+              </w:rPr>
+              <w:t>.0</w:t>
             </w:r>
           </w:p>
         </w:tc>
@@ -220,24 +240,6 @@
         </w:tc>
       </w:tr>
     </w:tbl>
-    <w:p>
-      <w:pPr>
-        <w:ind w:firstLine="397"/>
-        <w:rPr>
-          <w:rFonts w:eastAsia="Times New Roman" w:cs="Times New Roman"/>
-          <w:sz w:val="16"/>
-        </w:rPr>
-      </w:pPr>
-    </w:p>
-    <w:p>
-      <w:pPr>
-        <w:ind w:firstLine="397"/>
-        <w:rPr>
-          <w:rFonts w:eastAsia="Times New Roman" w:cs="Times New Roman"/>
-          <w:sz w:val="16"/>
-        </w:rPr>
-      </w:pPr>
-    </w:p>
     <w:p>
       <w:pPr>
         <w:rPr>
@@ -426,7 +428,23 @@
                     <w:b/>
                     <w:szCs w:val="18"/>
                   </w:rPr>
-                  <w:t>1.0.0</w:t>
+                  <w:t>1.</w:t>
+                </w:r>
+                <w:r>
+                  <w:rPr>
+                    <w:rFonts w:cs="Arial"/>
+                    <w:b/>
+                    <w:szCs w:val="18"/>
+                  </w:rPr>
+                  <w:t>1</w:t>
+                </w:r>
+                <w:r>
+                  <w:rPr>
+                    <w:rFonts w:cs="Arial"/>
+                    <w:b/>
+                    <w:szCs w:val="18"/>
+                  </w:rPr>
+                  <w:t>.0</w:t>
                 </w:r>
               </w:sdtContent>
             </w:sdt>
@@ -445,7 +463,7 @@
               <w:docPart w:val="C16F81A3EFFC41CF93FB4F105A9B07C8"/>
             </w:placeholder>
             <w:dataBinding w:prefixMappings="xmlns:ns0='http://schemas.microsoft.com/office/2006/metadata/properties' xmlns:ns1='http://www.w3.org/2001/XMLSchema-instance' xmlns:ns2='http://schemas.microsoft.com/office/infopath/2007/PartnerControls' xmlns:ns3='a1322699-2fbb-4cce-8aba-176c4fa97253' xmlns:ns4='http://schemas.microsoft.com/sharepoint/v3' xmlns:ns5='http://schemas.microsoft.com/sharepoint/v3/fields' xmlns:ns6='f0ff482e-aa3b-417e-9d65-5f4cb2656651' " w:xpath="/ns0:properties[1]/documentManagement[1]/ns5:_DCDateCreated[1]" w:storeItemID="{1159403A-C237-488E-8C5E-DABF9FCE7043}"/>
-            <w:date w:fullDate="2025-02-17T00:00:00Z">
+            <w:date w:fullDate="2025-07-22T00:00:00Z">
               <w:dateFormat w:val="dd/MM/yyyy"/>
               <w:lid w:val="fr-FR"/>
               <w:storeMappedDataAs w:val="dateTime"/>
@@ -475,28 +493,14 @@
                     <w:rFonts w:cs="Arial"/>
                     <w:szCs w:val="18"/>
                   </w:rPr>
-                  <w:t>17</w:t>
+                  <w:t>22/07</w:t>
                 </w:r>
                 <w:r>
                   <w:rPr>
                     <w:rFonts w:cs="Arial"/>
                     <w:szCs w:val="18"/>
                   </w:rPr>
-                  <w:t>/</w:t>
-                </w:r>
-                <w:r>
-                  <w:rPr>
-                    <w:rFonts w:cs="Arial"/>
-                    <w:szCs w:val="18"/>
-                  </w:rPr>
-                  <w:t>0</w:t>
-                </w:r>
-                <w:r>
-                  <w:rPr>
-                    <w:rFonts w:cs="Arial"/>
-                    <w:szCs w:val="18"/>
-                  </w:rPr>
-                  <w:t>2/202</w:t>
+                  <w:t>/202</w:t>
                 </w:r>
                 <w:r>
                   <w:rPr>
@@ -1103,6 +1107,65 @@
         <w:tc>
           <w:tcPr>
             <w:tcW w:w="1122" w:type="dxa"/>
+            <w:shd w:val="clear" w:color="auto" w:fill="D9D9D9" w:themeFill="background1" w:themeFillShade="D9"/>
+          </w:tcPr>
+          <w:p>
+            <w:pPr>
+              <w:rPr>
+                <w:rFonts w:cs="Arial"/>
+                <w:szCs w:val="18"/>
+              </w:rPr>
+            </w:pPr>
+          </w:p>
+        </w:tc>
+        <w:tc>
+          <w:tcPr>
+            <w:tcW w:w="1400" w:type="dxa"/>
+            <w:shd w:val="clear" w:color="auto" w:fill="D9D9D9" w:themeFill="background1" w:themeFillShade="D9"/>
+          </w:tcPr>
+          <w:p>
+            <w:pPr>
+              <w:rPr>
+                <w:rFonts w:cs="Arial"/>
+                <w:szCs w:val="18"/>
+              </w:rPr>
+            </w:pPr>
+          </w:p>
+        </w:tc>
+        <w:tc>
+          <w:tcPr>
+            <w:tcW w:w="2500" w:type="dxa"/>
+            <w:shd w:val="clear" w:color="auto" w:fill="D9D9D9" w:themeFill="background1" w:themeFillShade="D9"/>
+          </w:tcPr>
+          <w:p>
+            <w:pPr>
+              <w:rPr>
+                <w:rFonts w:cs="Arial"/>
+                <w:szCs w:val="18"/>
+              </w:rPr>
+            </w:pPr>
+          </w:p>
+        </w:tc>
+        <w:tc>
+          <w:tcPr>
+            <w:tcW w:w="4850" w:type="dxa"/>
+            <w:shd w:val="clear" w:color="auto" w:fill="D9D9D9" w:themeFill="background1" w:themeFillShade="D9"/>
+          </w:tcPr>
+          <w:p>
+            <w:pPr>
+              <w:jc w:val="center"/>
+              <w:rPr>
+                <w:rFonts w:cs="Arial"/>
+                <w:szCs w:val="18"/>
+              </w:rPr>
+            </w:pPr>
+          </w:p>
+        </w:tc>
+      </w:tr>
+      <w:tr>
+        <w:tc>
+          <w:tcPr>
+            <w:tcW w:w="1122" w:type="dxa"/>
           </w:tcPr>
           <w:p>
             <w:pPr>
@@ -1187,6 +1250,98 @@
                 <w:szCs w:val="18"/>
               </w:rPr>
               <w:t>Première version diffusée</w:t>
+            </w:r>
+          </w:p>
+        </w:tc>
+      </w:tr>
+      <w:tr>
+        <w:tc>
+          <w:tcPr>
+            <w:tcW w:w="1122" w:type="dxa"/>
+          </w:tcPr>
+          <w:p>
+            <w:pPr>
+              <w:ind w:firstLine="34"/>
+              <w:jc w:val="center"/>
+              <w:rPr>
+                <w:rFonts w:cs="Arial"/>
+                <w:szCs w:val="18"/>
+              </w:rPr>
+            </w:pPr>
+            <w:r>
+              <w:rPr>
+                <w:rFonts w:cs="Arial"/>
+                <w:szCs w:val="18"/>
+              </w:rPr>
+              <w:t>1.1.0</w:t>
+            </w:r>
+          </w:p>
+        </w:tc>
+        <w:tc>
+          <w:tcPr>
+            <w:tcW w:w="1400" w:type="dxa"/>
+          </w:tcPr>
+          <w:p>
+            <w:pPr>
+              <w:rPr>
+                <w:rFonts w:cs="Arial"/>
+                <w:szCs w:val="18"/>
+              </w:rPr>
+            </w:pPr>
+            <w:r>
+              <w:rPr>
+                <w:rFonts w:cs="Arial"/>
+                <w:szCs w:val="18"/>
+              </w:rPr>
+              <w:t>22/07/2025</w:t>
+            </w:r>
+          </w:p>
+        </w:tc>
+        <w:tc>
+          <w:tcPr>
+            <w:tcW w:w="2500" w:type="dxa"/>
+          </w:tcPr>
+          <w:p>
+            <w:pPr>
+              <w:rPr>
+                <w:rFonts w:cs="Arial"/>
+                <w:szCs w:val="18"/>
+              </w:rPr>
+            </w:pPr>
+            <w:r>
+              <w:rPr>
+                <w:rFonts w:cs="Arial"/>
+                <w:szCs w:val="18"/>
+              </w:rPr>
+              <w:t>Philippe</w:t>
+            </w:r>
+            <w:r>
+              <w:rPr>
+                <w:rFonts w:cs="Arial"/>
+                <w:szCs w:val="18"/>
+              </w:rPr>
+              <w:t xml:space="preserve"> GALLEN</w:t>
+            </w:r>
+          </w:p>
+        </w:tc>
+        <w:tc>
+          <w:tcPr>
+            <w:tcW w:w="4850" w:type="dxa"/>
+          </w:tcPr>
+          <w:p>
+            <w:pPr>
+              <w:ind w:firstLine="0"/>
+              <w:rPr>
+                <w:rFonts w:cs="Arial"/>
+                <w:szCs w:val="18"/>
+              </w:rPr>
+            </w:pPr>
+            <w:r>
+              <w:rPr>
+                <w:rFonts w:cs="Arial"/>
+                <w:szCs w:val="18"/>
+              </w:rPr>
+              <w:t>Transaction par le plugin Espace Collaboratif</w:t>
             </w:r>
           </w:p>
         </w:tc>
@@ -1257,7 +1412,7 @@
           <w:r>
             <w:fldChar w:fldCharType="separate"/>
           </w:r>
-          <w:hyperlink w:anchor="_Toc189661223" w:history="1">
+          <w:hyperlink w:anchor="_Toc204093306" w:history="1">
             <w:r>
               <w:rPr>
                 <w:rStyle w:val="Lienhypertexte"/>
@@ -1295,7 +1450,7 @@
               <w:rPr>
                 <w:webHidden/>
               </w:rPr>
-              <w:instrText xml:space="preserve"> PAGEREF _Toc189661223 \h </w:instrText>
+              <w:instrText xml:space="preserve"> PAGEREF _Toc204093306 \h </w:instrText>
             </w:r>
             <w:r>
               <w:rPr>
@@ -1332,7 +1487,7 @@
               <w:szCs w:val="22"/>
             </w:rPr>
           </w:pPr>
-          <w:hyperlink w:anchor="_Toc189661224" w:history="1">
+          <w:hyperlink w:anchor="_Toc204093307" w:history="1">
             <w:r>
               <w:rPr>
                 <w:rStyle w:val="Lienhypertexte"/>
@@ -1370,7 +1525,7 @@
               <w:rPr>
                 <w:webHidden/>
               </w:rPr>
-              <w:instrText xml:space="preserve"> PAGEREF _Toc189661224 \h </w:instrText>
+              <w:instrText xml:space="preserve"> PAGEREF _Toc204093307 \h </w:instrText>
             </w:r>
             <w:r>
               <w:rPr>
@@ -1407,7 +1562,7 @@
               <w:szCs w:val="22"/>
             </w:rPr>
           </w:pPr>
-          <w:hyperlink w:anchor="_Toc189661225" w:history="1">
+          <w:hyperlink w:anchor="_Toc204093308" w:history="1">
             <w:r>
               <w:rPr>
                 <w:rStyle w:val="Lienhypertexte"/>
@@ -1445,7 +1600,7 @@
               <w:rPr>
                 <w:webHidden/>
               </w:rPr>
-              <w:instrText xml:space="preserve"> PAGEREF _Toc189661225 \h </w:instrText>
+              <w:instrText xml:space="preserve"> PAGEREF _Toc204093308 \h </w:instrText>
             </w:r>
             <w:r>
               <w:rPr>
@@ -1482,7 +1637,7 @@
               <w:szCs w:val="22"/>
             </w:rPr>
           </w:pPr>
-          <w:hyperlink w:anchor="_Toc189661226" w:history="1">
+          <w:hyperlink w:anchor="_Toc204093309" w:history="1">
             <w:r>
               <w:rPr>
                 <w:rStyle w:val="Lienhypertexte"/>
@@ -1520,7 +1675,7 @@
               <w:rPr>
                 <w:webHidden/>
               </w:rPr>
-              <w:instrText xml:space="preserve"> PAGEREF _Toc189661226 \h </w:instrText>
+              <w:instrText xml:space="preserve"> PAGEREF _Toc204093309 \h </w:instrText>
             </w:r>
             <w:r>
               <w:rPr>
@@ -1557,7 +1712,7 @@
               <w:szCs w:val="22"/>
             </w:rPr>
           </w:pPr>
-          <w:hyperlink w:anchor="_Toc189661227" w:history="1">
+          <w:hyperlink w:anchor="_Toc204093310" w:history="1">
             <w:r>
               <w:rPr>
                 <w:rStyle w:val="Lienhypertexte"/>
@@ -1595,7 +1750,7 @@
               <w:rPr>
                 <w:webHidden/>
               </w:rPr>
-              <w:instrText xml:space="preserve"> PAGEREF _Toc189661227 \h </w:instrText>
+              <w:instrText xml:space="preserve"> PAGEREF _Toc204093310 \h </w:instrText>
             </w:r>
             <w:r>
               <w:rPr>
@@ -1631,7 +1786,7 @@
               <w:szCs w:val="22"/>
             </w:rPr>
           </w:pPr>
-          <w:hyperlink w:anchor="_Toc189661228" w:history="1">
+          <w:hyperlink w:anchor="_Toc204093311" w:history="1">
             <w:r>
               <w:rPr>
                 <w:rStyle w:val="Lienhypertexte"/>
@@ -1668,7 +1823,7 @@
               <w:rPr>
                 <w:webHidden/>
               </w:rPr>
-              <w:instrText xml:space="preserve"> PAGEREF _Toc189661228 \h </w:instrText>
+              <w:instrText xml:space="preserve"> PAGEREF _Toc204093311 \h </w:instrText>
             </w:r>
             <w:r>
               <w:rPr>
@@ -1704,7 +1859,7 @@
               <w:szCs w:val="22"/>
             </w:rPr>
           </w:pPr>
-          <w:hyperlink w:anchor="_Toc189661229" w:history="1">
+          <w:hyperlink w:anchor="_Toc204093312" w:history="1">
             <w:r>
               <w:rPr>
                 <w:rStyle w:val="Lienhypertexte"/>
@@ -1741,7 +1896,7 @@
               <w:rPr>
                 <w:webHidden/>
               </w:rPr>
-              <w:instrText xml:space="preserve"> PAGEREF _Toc189661229 \h </w:instrText>
+              <w:instrText xml:space="preserve"> PAGEREF _Toc204093312 \h </w:instrText>
             </w:r>
             <w:r>
               <w:rPr>
@@ -1778,7 +1933,7 @@
               <w:szCs w:val="22"/>
             </w:rPr>
           </w:pPr>
-          <w:hyperlink w:anchor="_Toc189661230" w:history="1">
+          <w:hyperlink w:anchor="_Toc204093313" w:history="1">
             <w:r>
               <w:rPr>
                 <w:rStyle w:val="Lienhypertexte"/>
@@ -1816,7 +1971,7 @@
               <w:rPr>
                 <w:webHidden/>
               </w:rPr>
-              <w:instrText xml:space="preserve"> PAGEREF _Toc189661230 \h </w:instrText>
+              <w:instrText xml:space="preserve"> PAGEREF _Toc204093313 \h </w:instrText>
             </w:r>
             <w:r>
               <w:rPr>
@@ -1853,7 +2008,7 @@
               <w:szCs w:val="22"/>
             </w:rPr>
           </w:pPr>
-          <w:hyperlink w:anchor="_Toc189661231" w:history="1">
+          <w:hyperlink w:anchor="_Toc204093314" w:history="1">
             <w:r>
               <w:rPr>
                 <w:rStyle w:val="Lienhypertexte"/>
@@ -1891,7 +2046,7 @@
               <w:rPr>
                 <w:webHidden/>
               </w:rPr>
-              <w:instrText xml:space="preserve"> PAGEREF _Toc189661231 \h </w:instrText>
+              <w:instrText xml:space="preserve"> PAGEREF _Toc204093314 \h </w:instrText>
             </w:r>
             <w:r>
               <w:rPr>
@@ -1927,7 +2082,7 @@
               <w:szCs w:val="22"/>
             </w:rPr>
           </w:pPr>
-          <w:hyperlink w:anchor="_Toc189661232" w:history="1">
+          <w:hyperlink w:anchor="_Toc204093315" w:history="1">
             <w:r>
               <w:rPr>
                 <w:rStyle w:val="Lienhypertexte"/>
@@ -1946,7 +2101,7 @@
               <w:rPr>
                 <w:rStyle w:val="Lienhypertexte"/>
               </w:rPr>
-              <w:t>Log</w:t>
+              <w:t>A propos de</w:t>
             </w:r>
             <w:r>
               <w:rPr>
@@ -1964,80 +2119,7 @@
               <w:rPr>
                 <w:webHidden/>
               </w:rPr>
-              <w:instrText xml:space="preserve"> PAGEREF _Toc189661232 \h </w:instrText>
-            </w:r>
-            <w:r>
-              <w:rPr>
-                <w:webHidden/>
-              </w:rPr>
-            </w:r>
-            <w:r>
-              <w:rPr>
-                <w:webHidden/>
-              </w:rPr>
-              <w:fldChar w:fldCharType="separate"/>
-            </w:r>
-            <w:r>
-              <w:rPr>
-                <w:webHidden/>
-              </w:rPr>
-              <w:t>5</w:t>
-            </w:r>
-            <w:r>
-              <w:rPr>
-                <w:webHidden/>
-              </w:rPr>
-              <w:fldChar w:fldCharType="end"/>
-            </w:r>
-          </w:hyperlink>
-        </w:p>
-        <w:p>
-          <w:pPr>
-            <w:pStyle w:val="TM2"/>
-            <w:rPr>
-              <w:rFonts w:asciiTheme="minorHAnsi" w:eastAsiaTheme="minorEastAsia" w:hAnsiTheme="minorHAnsi" w:cstheme="minorBidi"/>
-              <w:sz w:val="22"/>
-              <w:szCs w:val="22"/>
-            </w:rPr>
-          </w:pPr>
-          <w:hyperlink w:anchor="_Toc189661233" w:history="1">
-            <w:r>
-              <w:rPr>
-                <w:rStyle w:val="Lienhypertexte"/>
-              </w:rPr>
-              <w:t>7.2</w:t>
-            </w:r>
-            <w:r>
-              <w:rPr>
-                <w:rFonts w:asciiTheme="minorHAnsi" w:eastAsiaTheme="minorEastAsia" w:hAnsiTheme="minorHAnsi" w:cstheme="minorBidi"/>
-                <w:sz w:val="22"/>
-                <w:szCs w:val="22"/>
-              </w:rPr>
-              <w:tab/>
-            </w:r>
-            <w:r>
-              <w:rPr>
-                <w:rStyle w:val="Lienhypertexte"/>
-              </w:rPr>
-              <w:t>A propos de</w:t>
-            </w:r>
-            <w:r>
-              <w:rPr>
-                <w:webHidden/>
-              </w:rPr>
-              <w:tab/>
-            </w:r>
-            <w:r>
-              <w:rPr>
-                <w:webHidden/>
-              </w:rPr>
-              <w:fldChar w:fldCharType="begin"/>
-            </w:r>
-            <w:r>
-              <w:rPr>
-                <w:webHidden/>
-              </w:rPr>
-              <w:instrText xml:space="preserve"> PAGEREF _Toc189661233 \h </w:instrText>
+              <w:instrText xml:space="preserve"> PAGEREF _Toc204093315 \h </w:instrText>
             </w:r>
             <w:r>
               <w:rPr>
@@ -2074,7 +2156,7 @@
               <w:szCs w:val="22"/>
             </w:rPr>
           </w:pPr>
-          <w:hyperlink w:anchor="_Toc189661234" w:history="1">
+          <w:hyperlink w:anchor="_Toc204093316" w:history="1">
             <w:r>
               <w:rPr>
                 <w:rStyle w:val="Lienhypertexte"/>
@@ -2112,7 +2194,7 @@
               <w:rPr>
                 <w:webHidden/>
               </w:rPr>
-              <w:instrText xml:space="preserve"> PAGEREF _Toc189661234 \h </w:instrText>
+              <w:instrText xml:space="preserve"> PAGEREF _Toc204093316 \h </w:instrText>
             </w:r>
             <w:r>
               <w:rPr>
@@ -2148,7 +2230,7 @@
               <w:szCs w:val="22"/>
             </w:rPr>
           </w:pPr>
-          <w:hyperlink w:anchor="_Toc189661235" w:history="1">
+          <w:hyperlink w:anchor="_Toc204093317" w:history="1">
             <w:r>
               <w:rPr>
                 <w:rStyle w:val="Lienhypertexte"/>
@@ -2185,7 +2267,7 @@
               <w:rPr>
                 <w:webHidden/>
               </w:rPr>
-              <w:instrText xml:space="preserve"> PAGEREF _Toc189661235 \h </w:instrText>
+              <w:instrText xml:space="preserve"> PAGEREF _Toc204093317 \h </w:instrText>
             </w:r>
             <w:r>
               <w:rPr>
@@ -2238,7 +2320,7 @@
       <w:pPr>
         <w:pStyle w:val="Titre1"/>
       </w:pPr>
-      <w:bookmarkStart w:id="0" w:name="_Toc189661223"/>
+      <w:bookmarkStart w:id="0" w:name="_Toc204093306"/>
       <w:r>
         <w:lastRenderedPageBreak/>
         <w:t>Prérequis</w:t>
@@ -2273,6 +2355,9 @@
         <w:t xml:space="preserve"> « IGN Espace collaboratif » version 4.2.2</w:t>
       </w:r>
       <w:r>
+        <w:t xml:space="preserve"> (minimum)</w:t>
+      </w:r>
+      <w:r>
         <w:t xml:space="preserve"> auquel il fait accès pour modifier la BDTopo.</w:t>
       </w:r>
     </w:p>
@@ -2310,7 +2395,13 @@
         <w:t>de la BDTopo</w:t>
       </w:r>
       <w:r>
-        <w:t xml:space="preserve"> que l’on trouve dans les guichet en écriture directe BDTopo ‘sdis découverte’ et ‘sdis expert’.</w:t>
+        <w:t xml:space="preserve"> que l’on trouve dans les guichet en écriture directe BDTopo </w:t>
+      </w:r>
+      <w:r>
+        <w:t xml:space="preserve">‘sdis formation’, </w:t>
+      </w:r>
+      <w:r>
+        <w:t>‘sdis découverte’ et ‘sdis expert’.</w:t>
       </w:r>
     </w:p>
     <w:p>
@@ -2345,7 +2436,7 @@
       <w:pPr>
         <w:pStyle w:val="Titre1"/>
       </w:pPr>
-      <w:bookmarkStart w:id="1" w:name="_Toc189661224"/>
+      <w:bookmarkStart w:id="1" w:name="_Toc204093307"/>
       <w:r>
         <w:t>Résumé</w:t>
       </w:r>
@@ -2428,7 +2519,7 @@
       <w:pPr>
         <w:pStyle w:val="Titre1"/>
       </w:pPr>
-      <w:bookmarkStart w:id="2" w:name="_Toc189661225"/>
+      <w:bookmarkStart w:id="2" w:name="_Toc204093308"/>
       <w:r>
         <w:t>Installation</w:t>
       </w:r>
@@ -2509,7 +2600,7 @@
       <w:pPr>
         <w:pStyle w:val="Titre1"/>
       </w:pPr>
-      <w:bookmarkStart w:id="3" w:name="_Toc189661226"/>
+      <w:bookmarkStart w:id="3" w:name="_Toc204093309"/>
       <w:r>
         <w:t>Présentation</w:t>
       </w:r>
@@ -2526,10 +2617,10 @@
           <w:noProof/>
         </w:rPr>
         <w:drawing>
-          <wp:inline distT="0" distB="0" distL="0" distR="0" wp14:anchorId="697D769F" wp14:editId="0D3C9CFD">
-            <wp:extent cx="4457700" cy="1971675"/>
-            <wp:effectExtent l="0" t="0" r="0" b="9525"/>
-            <wp:docPr id="6" name="Image 6"/>
+          <wp:inline distT="0" distB="0" distL="0" distR="0" wp14:anchorId="3D60F057" wp14:editId="4AF11EE8">
+            <wp:extent cx="4419600" cy="1943100"/>
+            <wp:effectExtent l="0" t="0" r="0" b="0"/>
+            <wp:docPr id="18" name="Image 18"/>
             <wp:cNvGraphicFramePr>
               <a:graphicFrameLocks xmlns:a="http://schemas.openxmlformats.org/drawingml/2006/main" noChangeAspect="1"/>
             </wp:cNvGraphicFramePr>
@@ -2549,7 +2640,7 @@
                   <pic:spPr>
                     <a:xfrm>
                       <a:off x="0" y="0"/>
-                      <a:ext cx="4457700" cy="1971675"/>
+                      <a:ext cx="4419600" cy="1943100"/>
                     </a:xfrm>
                     <a:prstGeom prst="rect">
                       <a:avLst/>
@@ -2881,10 +2972,10 @@
           <w:noProof/>
         </w:rPr>
         <w:drawing>
-          <wp:inline distT="0" distB="0" distL="0" distR="0" wp14:anchorId="3C2DAA14" wp14:editId="0F7082FA">
-            <wp:extent cx="186871" cy="180314"/>
-            <wp:effectExtent l="0" t="0" r="3810" b="0"/>
-            <wp:docPr id="9" name="Image 9"/>
+          <wp:inline distT="0" distB="0" distL="0" distR="0" wp14:anchorId="5C5CACC2" wp14:editId="6A5C713B">
+            <wp:extent cx="714375" cy="371475"/>
+            <wp:effectExtent l="0" t="0" r="9525" b="9525"/>
+            <wp:docPr id="19" name="Image 19"/>
             <wp:cNvGraphicFramePr>
               <a:graphicFrameLocks xmlns:a="http://schemas.openxmlformats.org/drawingml/2006/main" noChangeAspect="1"/>
             </wp:cNvGraphicFramePr>
@@ -2904,7 +2995,7 @@
                   <pic:spPr>
                     <a:xfrm>
                       <a:off x="0" y="0"/>
-                      <a:ext cx="200399" cy="193367"/>
+                      <a:ext cx="714375" cy="371475"/>
                     </a:xfrm>
                     <a:prstGeom prst="rect">
                       <a:avLst/>
@@ -2917,69 +3008,7 @@
         </w:drawing>
       </w:r>
       <w:r>
-        <w:t xml:space="preserve"> permet d’afficher le rapport des modifications</w:t>
-      </w:r>
-    </w:p>
-    <w:p/>
-    <w:p>
-      <w:r>
-        <w:t xml:space="preserve">Le bouton </w:t>
-      </w:r>
-      <w:r>
-        <w:rPr>
-          <w:noProof/>
-        </w:rPr>
-        <w:drawing>
-          <wp:inline distT="0" distB="0" distL="0" distR="0" wp14:anchorId="31185801" wp14:editId="42F17E07">
-            <wp:extent cx="158837" cy="171450"/>
-            <wp:effectExtent l="0" t="0" r="0" b="0"/>
-            <wp:docPr id="5" name="Image 5"/>
-            <wp:cNvGraphicFramePr>
-              <a:graphicFrameLocks xmlns:a="http://schemas.openxmlformats.org/drawingml/2006/main" noChangeAspect="1"/>
-            </wp:cNvGraphicFramePr>
-            <a:graphic xmlns:a="http://schemas.openxmlformats.org/drawingml/2006/main">
-              <a:graphicData uri="http://schemas.openxmlformats.org/drawingml/2006/picture">
-                <pic:pic xmlns:pic="http://schemas.openxmlformats.org/drawingml/2006/picture">
-                  <pic:nvPicPr>
-                    <pic:cNvPr id="0" name="Picture 3"/>
-                    <pic:cNvPicPr>
-                      <a:picLocks noChangeAspect="1" noChangeArrowheads="1"/>
-                    </pic:cNvPicPr>
-                  </pic:nvPicPr>
-                  <pic:blipFill>
-                    <a:blip r:embed="rId21">
-                      <a:extLst>
-                        <a:ext uri="{28A0092B-C50C-407E-A947-70E740481C1C}">
-                          <a14:useLocalDpi xmlns:a14="http://schemas.microsoft.com/office/drawing/2010/main" val="0"/>
-                        </a:ext>
-                      </a:extLst>
-                    </a:blip>
-                    <a:srcRect/>
-                    <a:stretch>
-                      <a:fillRect/>
-                    </a:stretch>
-                  </pic:blipFill>
-                  <pic:spPr bwMode="auto">
-                    <a:xfrm>
-                      <a:off x="0" y="0"/>
-                      <a:ext cx="159457" cy="172120"/>
-                    </a:xfrm>
-                    <a:prstGeom prst="rect">
-                      <a:avLst/>
-                    </a:prstGeom>
-                    <a:noFill/>
-                    <a:ln>
-                      <a:noFill/>
-                    </a:ln>
-                  </pic:spPr>
-                </pic:pic>
-              </a:graphicData>
-            </a:graphic>
-          </wp:inline>
-        </w:drawing>
-      </w:r>
-      <w:r>
-        <w:t xml:space="preserve"> permet d’annuler la dernière modification effective et uniquement la dernière.</w:t>
+        <w:t xml:space="preserve"> permet de modifier la couleur de la sélection</w:t>
       </w:r>
     </w:p>
     <w:p/>
@@ -3007,7 +3036,7 @@
                     <pic:cNvPicPr/>
                   </pic:nvPicPr>
                   <pic:blipFill>
-                    <a:blip r:embed="rId22">
+                    <a:blip r:embed="rId21">
                       <a:extLst>
                         <a:ext uri="{28A0092B-C50C-407E-A947-70E740481C1C}">
                           <a14:useLocalDpi xmlns:a14="http://schemas.microsoft.com/office/drawing/2010/main" val="0"/>
@@ -3057,8 +3086,8 @@
       <w:bookmarkStart w:id="7" w:name="_Toc223756091"/>
       <w:bookmarkStart w:id="8" w:name="_Toc223425647"/>
       <w:bookmarkStart w:id="9" w:name="_Toc223756092"/>
-      <w:bookmarkStart w:id="10" w:name="_Toc189661227"/>
-      <w:bookmarkStart w:id="11" w:name="_Toc215049623"/>
+      <w:bookmarkStart w:id="10" w:name="_Toc215049623"/>
+      <w:bookmarkStart w:id="11" w:name="_Toc204093310"/>
       <w:bookmarkEnd w:id="4"/>
       <w:bookmarkEnd w:id="5"/>
       <w:bookmarkEnd w:id="6"/>
@@ -3072,7 +3101,7 @@
       <w:r>
         <w:t>élection</w:t>
       </w:r>
-      <w:bookmarkEnd w:id="10"/>
+      <w:bookmarkEnd w:id="11"/>
     </w:p>
     <w:p/>
     <w:p>
@@ -3089,7 +3118,7 @@
       <w:pPr>
         <w:pStyle w:val="Titre2"/>
       </w:pPr>
-      <w:bookmarkStart w:id="12" w:name="_Toc189661228"/>
+      <w:bookmarkStart w:id="12" w:name="_Toc204093311"/>
       <w:r>
         <w:t>Sélection unique</w:t>
       </w:r>
@@ -3115,7 +3144,7 @@
       <w:pPr>
         <w:pStyle w:val="Titre2"/>
       </w:pPr>
-      <w:bookmarkStart w:id="13" w:name="_Toc189661229"/>
+      <w:bookmarkStart w:id="13" w:name="_Toc204093312"/>
       <w:r>
         <w:t>Sélection multiple</w:t>
       </w:r>
@@ -3199,7 +3228,7 @@
                     <pic:cNvPicPr/>
                   </pic:nvPicPr>
                   <pic:blipFill>
-                    <a:blip r:embed="rId22">
+                    <a:blip r:embed="rId21">
                       <a:extLst>
                         <a:ext uri="{28A0092B-C50C-407E-A947-70E740481C1C}">
                           <a14:useLocalDpi xmlns:a14="http://schemas.microsoft.com/office/drawing/2010/main" val="0"/>
@@ -3263,7 +3292,7 @@
       <w:pPr>
         <w:pStyle w:val="Titre1"/>
       </w:pPr>
-      <w:bookmarkStart w:id="14" w:name="_Toc189661230"/>
+      <w:bookmarkStart w:id="14" w:name="_Toc204093313"/>
       <w:r>
         <w:t>Modifications</w:t>
       </w:r>
@@ -3288,7 +3317,21 @@
         <w:t xml:space="preserve"> de route, </w:t>
       </w:r>
       <w:r>
-        <w:t>l’interface affiche la liste des complexes associés.</w:t>
+        <w:t>l’interface affiche la liste des complexes associés</w:t>
+      </w:r>
+      <w:r>
+        <w:t xml:space="preserve"> </w:t>
+      </w:r>
+      <w:proofErr w:type="gramStart"/>
+      <w:r>
+        <w:t>si ils</w:t>
+      </w:r>
+      <w:proofErr w:type="gramEnd"/>
+      <w:r>
+        <w:t xml:space="preserve"> sont dans l’emprise du projet</w:t>
+      </w:r>
+      <w:r>
+        <w:t>.</w:t>
       </w:r>
     </w:p>
     <w:p>
@@ -3318,10 +3361,10 @@
           <w:noProof/>
         </w:rPr>
         <w:drawing>
-          <wp:inline distT="0" distB="0" distL="0" distR="0" wp14:anchorId="428D8336" wp14:editId="7A11E8F9">
-            <wp:extent cx="4648849" cy="1705213"/>
-            <wp:effectExtent l="0" t="0" r="0" b="9525"/>
-            <wp:docPr id="32" name="Image 32"/>
+          <wp:inline distT="0" distB="0" distL="0" distR="0" wp14:anchorId="69687751" wp14:editId="3F82E59C">
+            <wp:extent cx="4206240" cy="1829988"/>
+            <wp:effectExtent l="0" t="0" r="3810" b="0"/>
+            <wp:docPr id="15" name="Image 15"/>
             <wp:cNvGraphicFramePr>
               <a:graphicFrameLocks xmlns:a="http://schemas.openxmlformats.org/drawingml/2006/main" noChangeAspect="1"/>
             </wp:cNvGraphicFramePr>
@@ -3329,17 +3372,11 @@
               <a:graphicData uri="http://schemas.openxmlformats.org/drawingml/2006/picture">
                 <pic:pic xmlns:pic="http://schemas.openxmlformats.org/drawingml/2006/picture">
                   <pic:nvPicPr>
-                    <pic:cNvPr id="32" name="Image 32"/>
+                    <pic:cNvPr id="1" name=""/>
                     <pic:cNvPicPr/>
                   </pic:nvPicPr>
                   <pic:blipFill>
-                    <a:blip r:embed="rId23">
-                      <a:extLst>
-                        <a:ext uri="{28A0092B-C50C-407E-A947-70E740481C1C}">
-                          <a14:useLocalDpi xmlns:a14="http://schemas.microsoft.com/office/drawing/2010/main" val="0"/>
-                        </a:ext>
-                      </a:extLst>
-                    </a:blip>
+                    <a:blip r:embed="rId22"/>
                     <a:stretch>
                       <a:fillRect/>
                     </a:stretch>
@@ -3347,7 +3384,7 @@
                   <pic:spPr>
                     <a:xfrm>
                       <a:off x="0" y="0"/>
-                      <a:ext cx="4648849" cy="1705213"/>
+                      <a:ext cx="4217095" cy="1834710"/>
                     </a:xfrm>
                     <a:prstGeom prst="rect">
                       <a:avLst/>
@@ -3383,10 +3420,10 @@
           <w:noProof/>
         </w:rPr>
         <w:drawing>
-          <wp:inline distT="0" distB="0" distL="0" distR="0" wp14:anchorId="456352F6" wp14:editId="18A03567">
-            <wp:extent cx="4648849" cy="1705213"/>
-            <wp:effectExtent l="0" t="0" r="0" b="9525"/>
-            <wp:docPr id="34" name="Image 34"/>
+          <wp:inline distT="0" distB="0" distL="0" distR="0" wp14:anchorId="0B6BB38A" wp14:editId="600AA340">
+            <wp:extent cx="4206240" cy="1849295"/>
+            <wp:effectExtent l="0" t="0" r="3810" b="0"/>
+            <wp:docPr id="17" name="Image 17"/>
             <wp:cNvGraphicFramePr>
               <a:graphicFrameLocks xmlns:a="http://schemas.openxmlformats.org/drawingml/2006/main" noChangeAspect="1"/>
             </wp:cNvGraphicFramePr>
@@ -3394,17 +3431,11 @@
               <a:graphicData uri="http://schemas.openxmlformats.org/drawingml/2006/picture">
                 <pic:pic xmlns:pic="http://schemas.openxmlformats.org/drawingml/2006/picture">
                   <pic:nvPicPr>
-                    <pic:cNvPr id="34" name="Image 34"/>
+                    <pic:cNvPr id="1" name=""/>
                     <pic:cNvPicPr/>
                   </pic:nvPicPr>
                   <pic:blipFill>
-                    <a:blip r:embed="rId24">
-                      <a:extLst>
-                        <a:ext uri="{28A0092B-C50C-407E-A947-70E740481C1C}">
-                          <a14:useLocalDpi xmlns:a14="http://schemas.microsoft.com/office/drawing/2010/main" val="0"/>
-                        </a:ext>
-                      </a:extLst>
-                    </a:blip>
+                    <a:blip r:embed="rId14"/>
                     <a:stretch>
                       <a:fillRect/>
                     </a:stretch>
@@ -3412,7 +3443,7 @@
                   <pic:spPr>
                     <a:xfrm>
                       <a:off x="0" y="0"/>
-                      <a:ext cx="4648849" cy="1705213"/>
+                      <a:ext cx="4212184" cy="1851908"/>
                     </a:xfrm>
                     <a:prstGeom prst="rect">
                       <a:avLst/>
@@ -3437,6 +3468,11 @@
     </w:p>
     <w:p>
       <w:pPr>
+        <w:ind w:left="737"/>
+      </w:pPr>
+    </w:p>
+    <w:p>
+      <w:pPr>
         <w:pStyle w:val="Paragraphedeliste"/>
         <w:numPr>
           <w:ilvl w:val="0"/>
@@ -3450,13 +3486,17 @@
     <w:p>
       <w:pPr>
         <w:pStyle w:val="Paragraphedeliste"/>
+      </w:pPr>
+    </w:p>
+    <w:p>
+      <w:pPr>
+        <w:pStyle w:val="Paragraphedeliste"/>
         <w:numPr>
           <w:ilvl w:val="0"/>
           <w:numId w:val="9"/>
         </w:numPr>
       </w:pPr>
       <w:r>
-        <w:lastRenderedPageBreak/>
         <w:t xml:space="preserve">Sélectionner les constituants avec :  </w:t>
       </w:r>
       <w:r>
@@ -3641,68 +3681,67 @@
     <w:p/>
     <w:p>
       <w:pPr>
-        <w:jc w:val="center"/>
-      </w:pPr>
-    </w:p>
-    <w:p>
-      <w:pPr>
-        <w:jc w:val="center"/>
-      </w:pPr>
-    </w:p>
-    <w:p>
-      <w:pPr>
-        <w:pStyle w:val="Titre1"/>
-      </w:pPr>
-      <w:bookmarkStart w:id="15" w:name="_Toc189661231"/>
-      <w:r>
-        <w:t>Extra</w:t>
-      </w:r>
-      <w:r>
+        <w:pStyle w:val="Paragraphedeliste"/>
+        <w:numPr>
+          <w:ilvl w:val="0"/>
+          <w:numId w:val="7"/>
+        </w:numPr>
+      </w:pPr>
+      <w:r>
+        <w:rPr>
+          <w:highlight w:val="yellow"/>
+        </w:rPr>
+        <w:t>Les modifications faites avec l’outil ne seront effective</w:t>
+      </w:r>
+      <w:r>
+        <w:rPr>
+          <w:highlight w:val="yellow"/>
+        </w:rPr>
         <w:t>s</w:t>
       </w:r>
-      <w:bookmarkEnd w:id="15"/>
-    </w:p>
-    <w:p>
-      <w:pPr>
-        <w:pStyle w:val="Titre2"/>
-      </w:pPr>
-      <w:bookmarkStart w:id="16" w:name="_Toc189661232"/>
-      <w:r>
-        <w:t>Log</w:t>
-      </w:r>
-      <w:bookmarkEnd w:id="16"/>
-    </w:p>
-    <w:p/>
-    <w:p>
-      <w:pPr>
-        <w:ind w:firstLine="576"/>
-      </w:pPr>
-      <w:r>
-        <w:t xml:space="preserve">Après chaque transaction, un fichier de log est </w:t>
-      </w:r>
-      <w:r>
-        <w:t>généré</w:t>
-      </w:r>
-      <w:r>
-        <w:t xml:space="preserve"> au format xlsx.</w:t>
-      </w:r>
-    </w:p>
-    <w:p>
-      <w:pPr>
-        <w:ind w:firstLine="576"/>
-      </w:pPr>
-      <w:r>
-        <w:t xml:space="preserve">Il est visualisable via : </w:t>
-      </w:r>
+      <w:r>
+        <w:rPr>
+          <w:highlight w:val="yellow"/>
+        </w:rPr>
+        <w:t xml:space="preserve"> (objets modifiés sur le serveur)</w:t>
+      </w:r>
+      <w:r>
+        <w:rPr>
+          <w:highlight w:val="yellow"/>
+        </w:rPr>
+        <w:t xml:space="preserve"> que</w:t>
+      </w:r>
+      <w:r>
+        <w:rPr>
+          <w:highlight w:val="yellow"/>
+        </w:rPr>
+        <w:t xml:space="preserve"> lorsqu’on enregistrera les modifications</w:t>
+      </w:r>
+      <w:r>
+        <w:t xml:space="preserve"> par l’outil natif de </w:t>
+      </w:r>
+      <w:proofErr w:type="spellStart"/>
+      <w:r>
+        <w:t>QGis</w:t>
+      </w:r>
+      <w:proofErr w:type="spellEnd"/>
+      <w:r>
+        <w:t xml:space="preserve"> (</w:t>
+      </w:r>
+      <w:proofErr w:type="gramStart"/>
+      <w:r>
+        <w:t xml:space="preserve">disquette)   </w:t>
+      </w:r>
+      <w:proofErr w:type="gramEnd"/>
       <w:r>
         <w:rPr>
           <w:noProof/>
         </w:rPr>
         <w:drawing>
-          <wp:inline distT="0" distB="0" distL="0" distR="0" wp14:anchorId="15EC93E5" wp14:editId="6CB93CA8">
-            <wp:extent cx="314369" cy="247685"/>
-            <wp:effectExtent l="0" t="0" r="9525" b="0"/>
-            <wp:docPr id="21" name="Image 21"/>
+          <wp:inline distT="0" distB="0" distL="0" distR="0" wp14:anchorId="375891CA" wp14:editId="5E91FBA4">
+            <wp:extent cx="798021" cy="319208"/>
+            <wp:effectExtent l="0" t="0" r="2540" b="5080"/>
+            <wp:docPr id="10" name="Image 10"/>
             <wp:cNvGraphicFramePr>
               <a:graphicFrameLocks xmlns:a="http://schemas.openxmlformats.org/drawingml/2006/main" noChangeAspect="1"/>
             </wp:cNvGraphicFramePr>
@@ -3710,17 +3749,11 @@
               <a:graphicData uri="http://schemas.openxmlformats.org/drawingml/2006/picture">
                 <pic:pic xmlns:pic="http://schemas.openxmlformats.org/drawingml/2006/picture">
                   <pic:nvPicPr>
-                    <pic:cNvPr id="21" name="Image 21"/>
+                    <pic:cNvPr id="1" name=""/>
                     <pic:cNvPicPr/>
                   </pic:nvPicPr>
                   <pic:blipFill>
-                    <a:blip r:embed="rId25">
-                      <a:extLst>
-                        <a:ext uri="{28A0092B-C50C-407E-A947-70E740481C1C}">
-                          <a14:useLocalDpi xmlns:a14="http://schemas.microsoft.com/office/drawing/2010/main" val="0"/>
-                        </a:ext>
-                      </a:extLst>
-                    </a:blip>
+                    <a:blip r:embed="rId23"/>
                     <a:stretch>
                       <a:fillRect/>
                     </a:stretch>
@@ -3728,7 +3761,7 @@
                   <pic:spPr>
                     <a:xfrm>
                       <a:off x="0" y="0"/>
-                      <a:ext cx="314369" cy="247685"/>
+                      <a:ext cx="805048" cy="322019"/>
                     </a:xfrm>
                     <a:prstGeom prst="rect">
                       <a:avLst/>
@@ -3740,87 +3773,43 @@
           </wp:inline>
         </w:drawing>
       </w:r>
-    </w:p>
-    <w:bookmarkEnd w:id="11"/>
+      <w:r>
+        <w:t xml:space="preserve"> </w:t>
+      </w:r>
+    </w:p>
+    <w:p>
+      <w:pPr>
+        <w:jc w:val="center"/>
+      </w:pPr>
+    </w:p>
+    <w:p>
+      <w:pPr>
+        <w:pStyle w:val="Titre1"/>
+      </w:pPr>
+      <w:bookmarkStart w:id="15" w:name="_Toc204093314"/>
+      <w:r>
+        <w:t>Extra</w:t>
+      </w:r>
+      <w:r>
+        <w:t>s</w:t>
+      </w:r>
+      <w:bookmarkEnd w:id="15"/>
+    </w:p>
+    <w:bookmarkEnd w:id="10"/>
     <w:p>
       <w:pPr>
         <w:spacing w:line="276" w:lineRule="auto"/>
-        <w:ind w:firstLine="576"/>
-      </w:pPr>
-      <w:r>
-        <w:t>Ce fichier contient toutes les modifications effectuées. Les champs modifiés apparaissent en rouge.</w:t>
-      </w:r>
-    </w:p>
-    <w:p>
-      <w:pPr>
-        <w:spacing w:line="276" w:lineRule="auto"/>
-      </w:pPr>
-    </w:p>
-    <w:p>
-      <w:pPr>
-        <w:spacing w:line="276" w:lineRule="auto"/>
-      </w:pPr>
-      <w:r>
-        <w:rPr>
-          <w:noProof/>
-        </w:rPr>
-        <w:drawing>
-          <wp:inline distT="0" distB="0" distL="0" distR="0" wp14:anchorId="0D4898D1" wp14:editId="3B3A2103">
-            <wp:extent cx="6253480" cy="527050"/>
-            <wp:effectExtent l="0" t="0" r="0" b="6350"/>
-            <wp:docPr id="38" name="Image 38"/>
-            <wp:cNvGraphicFramePr>
-              <a:graphicFrameLocks xmlns:a="http://schemas.openxmlformats.org/drawingml/2006/main" noChangeAspect="1"/>
-            </wp:cNvGraphicFramePr>
-            <a:graphic xmlns:a="http://schemas.openxmlformats.org/drawingml/2006/main">
-              <a:graphicData uri="http://schemas.openxmlformats.org/drawingml/2006/picture">
-                <pic:pic xmlns:pic="http://schemas.openxmlformats.org/drawingml/2006/picture">
-                  <pic:nvPicPr>
-                    <pic:cNvPr id="38" name="Image 38"/>
-                    <pic:cNvPicPr/>
-                  </pic:nvPicPr>
-                  <pic:blipFill>
-                    <a:blip r:embed="rId26">
-                      <a:extLst>
-                        <a:ext uri="{28A0092B-C50C-407E-A947-70E740481C1C}">
-                          <a14:useLocalDpi xmlns:a14="http://schemas.microsoft.com/office/drawing/2010/main" val="0"/>
-                        </a:ext>
-                      </a:extLst>
-                    </a:blip>
-                    <a:stretch>
-                      <a:fillRect/>
-                    </a:stretch>
-                  </pic:blipFill>
-                  <pic:spPr>
-                    <a:xfrm>
-                      <a:off x="0" y="0"/>
-                      <a:ext cx="6253480" cy="527050"/>
-                    </a:xfrm>
-                    <a:prstGeom prst="rect">
-                      <a:avLst/>
-                    </a:prstGeom>
-                  </pic:spPr>
-                </pic:pic>
-              </a:graphicData>
-            </a:graphic>
-          </wp:inline>
-        </w:drawing>
-      </w:r>
-    </w:p>
-    <w:p>
-      <w:pPr>
-        <w:spacing w:line="276" w:lineRule="auto"/>
       </w:pPr>
     </w:p>
     <w:p>
       <w:pPr>
         <w:pStyle w:val="Titre2"/>
       </w:pPr>
-      <w:bookmarkStart w:id="17" w:name="_Toc189661233"/>
+      <w:bookmarkStart w:id="16" w:name="_Toc204093315"/>
       <w:r>
         <w:t>A propos de</w:t>
       </w:r>
-      <w:bookmarkEnd w:id="17"/>
+      <w:bookmarkEnd w:id="16"/>
     </w:p>
     <w:p>
       <w:pPr>
@@ -3854,7 +3843,7 @@
                     <pic:cNvPicPr/>
                   </pic:nvPicPr>
                   <pic:blipFill>
-                    <a:blip r:embed="rId27">
+                    <a:blip r:embed="rId24">
                       <a:extLst>
                         <a:ext uri="{28A0092B-C50C-407E-A947-70E740481C1C}">
                           <a14:useLocalDpi xmlns:a14="http://schemas.microsoft.com/office/drawing/2010/main" val="0"/>
@@ -3909,7 +3898,7 @@
                     <pic:cNvPicPr/>
                   </pic:nvPicPr>
                   <pic:blipFill>
-                    <a:blip r:embed="rId28">
+                    <a:blip r:embed="rId25">
                       <a:extLst>
                         <a:ext uri="{28A0092B-C50C-407E-A947-70E740481C1C}">
                           <a14:useLocalDpi xmlns:a14="http://schemas.microsoft.com/office/drawing/2010/main" val="0"/>
@@ -3960,31 +3949,37 @@
     <w:p/>
     <w:p/>
     <w:p/>
+    <w:p/>
+    <w:p/>
+    <w:p/>
+    <w:p/>
+    <w:p/>
+    <w:p/>
+    <w:p/>
     <w:p>
       <w:pPr>
         <w:pStyle w:val="Titre1"/>
       </w:pPr>
-      <w:bookmarkStart w:id="18" w:name="_Toc189661234"/>
-      <w:r>
-        <w:lastRenderedPageBreak/>
+      <w:bookmarkStart w:id="17" w:name="_Toc204093316"/>
+      <w:r>
         <w:t>Annexes</w:t>
       </w:r>
+      <w:bookmarkEnd w:id="17"/>
+    </w:p>
+    <w:p/>
+    <w:p>
+      <w:pPr>
+        <w:pStyle w:val="Titre2"/>
+      </w:pPr>
+      <w:bookmarkStart w:id="18" w:name="_Toc204093317"/>
+      <w:r>
+        <w:t xml:space="preserve">Package </w:t>
+      </w:r>
+      <w:proofErr w:type="spellStart"/>
+      <w:r>
+        <w:t>openpyxl</w:t>
+      </w:r>
       <w:bookmarkEnd w:id="18"/>
-    </w:p>
-    <w:p/>
-    <w:p>
-      <w:pPr>
-        <w:pStyle w:val="Titre2"/>
-      </w:pPr>
-      <w:bookmarkStart w:id="19" w:name="_Toc189661235"/>
-      <w:r>
-        <w:t xml:space="preserve">Package </w:t>
-      </w:r>
-      <w:proofErr w:type="spellStart"/>
-      <w:r>
-        <w:t>openpyxl</w:t>
-      </w:r>
-      <w:bookmarkEnd w:id="19"/>
       <w:proofErr w:type="spellEnd"/>
     </w:p>
     <w:p>
@@ -4090,7 +4085,7 @@
                     <pic:cNvPicPr/>
                   </pic:nvPicPr>
                   <pic:blipFill>
-                    <a:blip r:embed="rId29">
+                    <a:blip r:embed="rId26">
                       <a:extLst>
                         <a:ext uri="{28A0092B-C50C-407E-A947-70E740481C1C}">
                           <a14:useLocalDpi xmlns:a14="http://schemas.microsoft.com/office/drawing/2010/main" val="0"/>
@@ -4158,7 +4153,7 @@
                     <pic:cNvPicPr/>
                   </pic:nvPicPr>
                   <pic:blipFill>
-                    <a:blip r:embed="rId30">
+                    <a:blip r:embed="rId27">
                       <a:extLst>
                         <a:ext uri="{28A0092B-C50C-407E-A947-70E740481C1C}">
                           <a14:useLocalDpi xmlns:a14="http://schemas.microsoft.com/office/drawing/2010/main" val="0"/>
@@ -4251,7 +4246,7 @@
                     <pic:cNvPicPr/>
                   </pic:nvPicPr>
                   <pic:blipFill>
-                    <a:blip r:embed="rId31">
+                    <a:blip r:embed="rId28">
                       <a:extLst>
                         <a:ext uri="{28A0092B-C50C-407E-A947-70E740481C1C}">
                           <a14:useLocalDpi xmlns:a14="http://schemas.microsoft.com/office/drawing/2010/main" val="0"/>
@@ -4290,8 +4285,8 @@
     </w:p>
     <w:p/>
     <w:sectPr>
-      <w:footerReference w:type="default" r:id="rId32"/>
-      <w:footerReference w:type="first" r:id="rId33"/>
+      <w:footerReference w:type="default" r:id="rId29"/>
+      <w:footerReference w:type="first" r:id="rId30"/>
       <w:pgSz w:w="11906" w:h="16838" w:code="9"/>
       <w:pgMar w:top="851" w:right="924" w:bottom="1616" w:left="1134" w:header="709" w:footer="607" w:gutter="0"/>
       <w:cols w:space="708"/>
@@ -4523,7 +4518,7 @@
             <w:tag w:val="_DCDateCreated"/>
             <w:id w:val="317545533"/>
             <w:dataBinding w:prefixMappings="xmlns:ns0='http://schemas.microsoft.com/office/2006/metadata/properties' xmlns:ns1='http://www.w3.org/2001/XMLSchema-instance' xmlns:ns2='http://schemas.microsoft.com/office/infopath/2007/PartnerControls' xmlns:ns3='a1322699-2fbb-4cce-8aba-176c4fa97253' xmlns:ns4='http://schemas.microsoft.com/sharepoint/v3' xmlns:ns5='http://schemas.microsoft.com/sharepoint/v3/fields' xmlns:ns6='f0ff482e-aa3b-417e-9d65-5f4cb2656651' " w:xpath="/ns0:properties[1]/documentManagement[1]/ns5:_DCDateCreated[1]" w:storeItemID="{1159403A-C237-488E-8C5E-DABF9FCE7043}"/>
-            <w:date w:fullDate="2025-07-02T00:00:00Z">
+            <w:date w:fullDate="2025-07-22T00:00:00Z">
               <w:dateFormat w:val="dd/MM/yyyy"/>
               <w:lid w:val="fr-FR"/>
               <w:storeMappedDataAs w:val="dateTime"/>
@@ -4555,7 +4550,15 @@
                   <w:szCs w:val="18"/>
                   <w:lang w:eastAsia="en-US"/>
                 </w:rPr>
-                <w:t>02/07</w:t>
+                <w:t>2</w:t>
+              </w:r>
+              <w:r>
+                <w:rPr>
+                  <w:rFonts w:cs="Arial"/>
+                  <w:szCs w:val="18"/>
+                  <w:lang w:eastAsia="en-US"/>
+                </w:rPr>
+                <w:t>2/07</w:t>
               </w:r>
               <w:r>
                 <w:rPr>
@@ -5812,7 +5815,7 @@
   <w:abstractNum w:abstractNumId="8" w15:restartNumberingAfterBreak="0">
     <w:nsid w:val="7EA133B7"/>
     <w:multiLevelType w:val="hybridMultilevel"/>
-    <w:tmpl w:val="18BE9546"/>
+    <w:tmpl w:val="996AE492"/>
     <w:lvl w:ilvl="0" w:tplc="040C0001">
       <w:start w:val="1"/>
       <w:numFmt w:val="bullet"/>
@@ -7813,7 +7816,9 @@
     <w:rsid w:val="00BD0A3D"/>
     <w:rsid w:val="00C13EA8"/>
     <w:rsid w:val="00C2639B"/>
+    <w:rsid w:val="00C47703"/>
     <w:rsid w:val="00CA38A7"/>
+    <w:rsid w:val="00CD254D"/>
     <w:rsid w:val="00CE6C6B"/>
     <w:rsid w:val="00D50511"/>
     <w:rsid w:val="00D7017E"/>

</xml_diff>

<commit_message>
modif de la doc pour la version 1.1.1
</commit_message>
<xml_diff>
--- a/assistant complexe.docx
+++ b/assistant complexe.docx
@@ -197,7 +197,17 @@
                 <w:sz w:val="28"/>
                 <w:szCs w:val="28"/>
               </w:rPr>
-              <w:t>.0</w:t>
+              <w:t>.</w:t>
+            </w:r>
+            <w:r>
+              <w:rPr>
+                <w:rFonts w:ascii="Times New Roman" w:hAnsi="Times New Roman" w:cs="Times New Roman"/>
+                <w:b/>
+                <w:noProof/>
+                <w:sz w:val="28"/>
+                <w:szCs w:val="28"/>
+              </w:rPr>
+              <w:t>1</w:t>
             </w:r>
           </w:p>
         </w:tc>
@@ -444,7 +454,15 @@
                     <w:b/>
                     <w:szCs w:val="18"/>
                   </w:rPr>
-                  <w:t>.0</w:t>
+                  <w:t>.</w:t>
+                </w:r>
+                <w:r>
+                  <w:rPr>
+                    <w:rFonts w:cs="Arial"/>
+                    <w:b/>
+                    <w:szCs w:val="18"/>
+                  </w:rPr>
+                  <w:t>1</w:t>
                 </w:r>
               </w:sdtContent>
             </w:sdt>
@@ -1018,7 +1036,7 @@
       <w:tr>
         <w:tc>
           <w:tcPr>
-            <w:tcW w:w="1122" w:type="dxa"/>
+            <w:tcW w:w="1115" w:type="dxa"/>
             <w:shd w:val="clear" w:color="auto" w:fill="D9D9D9" w:themeFill="background1" w:themeFillShade="D9"/>
           </w:tcPr>
           <w:p>
@@ -1040,7 +1058,7 @@
         </w:tc>
         <w:tc>
           <w:tcPr>
-            <w:tcW w:w="1400" w:type="dxa"/>
+            <w:tcW w:w="1514" w:type="dxa"/>
             <w:shd w:val="clear" w:color="auto" w:fill="D9D9D9" w:themeFill="background1" w:themeFillShade="D9"/>
           </w:tcPr>
           <w:p>
@@ -1061,7 +1079,7 @@
         </w:tc>
         <w:tc>
           <w:tcPr>
-            <w:tcW w:w="2500" w:type="dxa"/>
+            <w:tcW w:w="2472" w:type="dxa"/>
             <w:shd w:val="clear" w:color="auto" w:fill="D9D9D9" w:themeFill="background1" w:themeFillShade="D9"/>
           </w:tcPr>
           <w:p>
@@ -1082,7 +1100,7 @@
         </w:tc>
         <w:tc>
           <w:tcPr>
-            <w:tcW w:w="4850" w:type="dxa"/>
+            <w:tcW w:w="4771" w:type="dxa"/>
             <w:shd w:val="clear" w:color="auto" w:fill="D9D9D9" w:themeFill="background1" w:themeFillShade="D9"/>
           </w:tcPr>
           <w:p>
@@ -1106,7 +1124,7 @@
       <w:tr>
         <w:tc>
           <w:tcPr>
-            <w:tcW w:w="1122" w:type="dxa"/>
+            <w:tcW w:w="1115" w:type="dxa"/>
             <w:shd w:val="clear" w:color="auto" w:fill="D9D9D9" w:themeFill="background1" w:themeFillShade="D9"/>
           </w:tcPr>
           <w:p>
@@ -1120,7 +1138,7 @@
         </w:tc>
         <w:tc>
           <w:tcPr>
-            <w:tcW w:w="1400" w:type="dxa"/>
+            <w:tcW w:w="1514" w:type="dxa"/>
             <w:shd w:val="clear" w:color="auto" w:fill="D9D9D9" w:themeFill="background1" w:themeFillShade="D9"/>
           </w:tcPr>
           <w:p>
@@ -1134,7 +1152,7 @@
         </w:tc>
         <w:tc>
           <w:tcPr>
-            <w:tcW w:w="2500" w:type="dxa"/>
+            <w:tcW w:w="2472" w:type="dxa"/>
             <w:shd w:val="clear" w:color="auto" w:fill="D9D9D9" w:themeFill="background1" w:themeFillShade="D9"/>
           </w:tcPr>
           <w:p>
@@ -1148,7 +1166,7 @@
         </w:tc>
         <w:tc>
           <w:tcPr>
-            <w:tcW w:w="4850" w:type="dxa"/>
+            <w:tcW w:w="4771" w:type="dxa"/>
             <w:shd w:val="clear" w:color="auto" w:fill="D9D9D9" w:themeFill="background1" w:themeFillShade="D9"/>
           </w:tcPr>
           <w:p>
@@ -1165,7 +1183,7 @@
       <w:tr>
         <w:tc>
           <w:tcPr>
-            <w:tcW w:w="1122" w:type="dxa"/>
+            <w:tcW w:w="1115" w:type="dxa"/>
           </w:tcPr>
           <w:p>
             <w:pPr>
@@ -1187,7 +1205,7 @@
         </w:tc>
         <w:tc>
           <w:tcPr>
-            <w:tcW w:w="1400" w:type="dxa"/>
+            <w:tcW w:w="1514" w:type="dxa"/>
           </w:tcPr>
           <w:p>
             <w:pPr>
@@ -1214,7 +1232,7 @@
         </w:tc>
         <w:tc>
           <w:tcPr>
-            <w:tcW w:w="2500" w:type="dxa"/>
+            <w:tcW w:w="2472" w:type="dxa"/>
           </w:tcPr>
           <w:p>
             <w:pPr>
@@ -1234,7 +1252,7 @@
         </w:tc>
         <w:tc>
           <w:tcPr>
-            <w:tcW w:w="4850" w:type="dxa"/>
+            <w:tcW w:w="4771" w:type="dxa"/>
           </w:tcPr>
           <w:p>
             <w:pPr>
@@ -1257,7 +1275,7 @@
       <w:tr>
         <w:tc>
           <w:tcPr>
-            <w:tcW w:w="1122" w:type="dxa"/>
+            <w:tcW w:w="1115" w:type="dxa"/>
           </w:tcPr>
           <w:p>
             <w:pPr>
@@ -1279,7 +1297,7 @@
         </w:tc>
         <w:tc>
           <w:tcPr>
-            <w:tcW w:w="1400" w:type="dxa"/>
+            <w:tcW w:w="1514" w:type="dxa"/>
           </w:tcPr>
           <w:p>
             <w:pPr>
@@ -1299,7 +1317,7 @@
         </w:tc>
         <w:tc>
           <w:tcPr>
-            <w:tcW w:w="2500" w:type="dxa"/>
+            <w:tcW w:w="2472" w:type="dxa"/>
           </w:tcPr>
           <w:p>
             <w:pPr>
@@ -1326,7 +1344,7 @@
         </w:tc>
         <w:tc>
           <w:tcPr>
-            <w:tcW w:w="4850" w:type="dxa"/>
+            <w:tcW w:w="4771" w:type="dxa"/>
           </w:tcPr>
           <w:p>
             <w:pPr>
@@ -1342,6 +1360,90 @@
                 <w:szCs w:val="18"/>
               </w:rPr>
               <w:t>Transaction par le plugin Espace Collaboratif</w:t>
+            </w:r>
+          </w:p>
+        </w:tc>
+      </w:tr>
+      <w:tr>
+        <w:tc>
+          <w:tcPr>
+            <w:tcW w:w="1115" w:type="dxa"/>
+          </w:tcPr>
+          <w:p>
+            <w:pPr>
+              <w:ind w:firstLine="34"/>
+              <w:jc w:val="center"/>
+              <w:rPr>
+                <w:rFonts w:cs="Arial"/>
+                <w:szCs w:val="18"/>
+              </w:rPr>
+            </w:pPr>
+            <w:r>
+              <w:rPr>
+                <w:rFonts w:cs="Arial"/>
+                <w:szCs w:val="18"/>
+              </w:rPr>
+              <w:t>1.1.1</w:t>
+            </w:r>
+          </w:p>
+        </w:tc>
+        <w:tc>
+          <w:tcPr>
+            <w:tcW w:w="1514" w:type="dxa"/>
+          </w:tcPr>
+          <w:p>
+            <w:pPr>
+              <w:rPr>
+                <w:rFonts w:cs="Arial"/>
+                <w:szCs w:val="18"/>
+              </w:rPr>
+            </w:pPr>
+            <w:r>
+              <w:rPr>
+                <w:rFonts w:cs="Arial"/>
+                <w:szCs w:val="18"/>
+              </w:rPr>
+              <w:t>21/01/2026</w:t>
+            </w:r>
+          </w:p>
+        </w:tc>
+        <w:tc>
+          <w:tcPr>
+            <w:tcW w:w="2472" w:type="dxa"/>
+          </w:tcPr>
+          <w:p>
+            <w:pPr>
+              <w:rPr>
+                <w:rFonts w:cs="Arial"/>
+                <w:szCs w:val="18"/>
+              </w:rPr>
+            </w:pPr>
+            <w:r>
+              <w:rPr>
+                <w:rFonts w:cs="Arial"/>
+                <w:szCs w:val="18"/>
+              </w:rPr>
+              <w:t>Philippe GALLEN</w:t>
+            </w:r>
+          </w:p>
+        </w:tc>
+        <w:tc>
+          <w:tcPr>
+            <w:tcW w:w="4771" w:type="dxa"/>
+          </w:tcPr>
+          <w:p>
+            <w:pPr>
+              <w:rPr>
+                <w:rFonts w:cs="Arial"/>
+                <w:szCs w:val="18"/>
+              </w:rPr>
+            </w:pPr>
+            <w:r>
+              <w:rPr>
+                <w:rFonts w:cs="Arial"/>
+                <w:szCs w:val="18"/>
+              </w:rPr>
+              <w:t>Adaptation à la version 1.1.1</w:t>
             </w:r>
           </w:p>
         </w:tc>
@@ -2322,7 +2424,6 @@
       </w:pPr>
       <w:bookmarkStart w:id="0" w:name="_Toc204093306"/>
       <w:r>
-        <w:lastRenderedPageBreak/>
         <w:t>Prérequis</w:t>
       </w:r>
       <w:bookmarkEnd w:id="0"/>
@@ -2375,21 +2476,8 @@
       <w:r>
         <w:t xml:space="preserve">ouche </w:t>
       </w:r>
-      <w:proofErr w:type="spellStart"/>
-      <w:r>
-        <w:t>troncon_de_</w:t>
-      </w:r>
-      <w:proofErr w:type="gramStart"/>
-      <w:r>
-        <w:t>route</w:t>
-      </w:r>
-      <w:proofErr w:type="spellEnd"/>
-      <w:r>
-        <w:t>  éditable</w:t>
-      </w:r>
-      <w:proofErr w:type="gramEnd"/>
-      <w:r>
-        <w:t xml:space="preserve"> </w:t>
+      <w:r>
+        <w:t xml:space="preserve">troncon_de_route  éditable </w:t>
       </w:r>
       <w:r>
         <w:t>de la BDTopo</w:t>
@@ -2413,15 +2501,7 @@
         </w:numPr>
       </w:pPr>
       <w:r>
-        <w:t xml:space="preserve">Package </w:t>
-      </w:r>
-      <w:proofErr w:type="spellStart"/>
-      <w:r>
-        <w:t>openpyxl</w:t>
-      </w:r>
-      <w:proofErr w:type="spellEnd"/>
-      <w:r>
-        <w:t xml:space="preserve"> (voir installation en annexe à la fin de ce document).</w:t>
+        <w:t>Package openpyxl (voir installation en annexe à la fin de ce document).</w:t>
       </w:r>
     </w:p>
     <w:p/>
@@ -2450,31 +2530,7 @@
     </w:p>
     <w:p>
       <w:r>
-        <w:t>Le numéro ou le nom des routes (départementales, autoroutes, nationales, intercommunales, communales, chemins ruraux) est affiché dans les tronçons de route (</w:t>
-      </w:r>
-      <w:proofErr w:type="spellStart"/>
-      <w:r>
-        <w:t>CPX_Numéro</w:t>
-      </w:r>
-      <w:proofErr w:type="spellEnd"/>
-      <w:r>
-        <w:t xml:space="preserve">, </w:t>
-      </w:r>
-      <w:proofErr w:type="spellStart"/>
-      <w:r>
-        <w:t>CPX_Numéro</w:t>
-      </w:r>
-      <w:proofErr w:type="spellEnd"/>
-      <w:r>
-        <w:t xml:space="preserve"> de route européenne, </w:t>
-      </w:r>
-      <w:proofErr w:type="spellStart"/>
-      <w:r>
-        <w:t>CPX_Toponyme</w:t>
-      </w:r>
-      <w:proofErr w:type="spellEnd"/>
-      <w:r>
-        <w:t xml:space="preserve"> route nommée)</w:t>
+        <w:t>Le numéro ou le nom des routes (départementales, autoroutes, nationales, intercommunales, communales, chemins ruraux) est affiché dans les tronçons de route (CPX_Numéro, CPX_Numéro de route européenne, CPX_Toponyme route nommée)</w:t>
       </w:r>
       <w:r>
         <w:t xml:space="preserve"> mais ces routes numérotées ou nommées sont gérées par des objets Route numérotées ou nommées.</w:t>
@@ -2617,10 +2673,10 @@
           <w:noProof/>
         </w:rPr>
         <w:drawing>
-          <wp:inline distT="0" distB="0" distL="0" distR="0" wp14:anchorId="3D60F057" wp14:editId="4AF11EE8">
-            <wp:extent cx="4419600" cy="1943100"/>
+          <wp:inline distT="0" distB="0" distL="0" distR="0" wp14:anchorId="5D45B29E" wp14:editId="55E246D1">
+            <wp:extent cx="4420217" cy="1924319"/>
             <wp:effectExtent l="0" t="0" r="0" b="0"/>
-            <wp:docPr id="18" name="Image 18"/>
+            <wp:docPr id="5" name="Image 5"/>
             <wp:cNvGraphicFramePr>
               <a:graphicFrameLocks xmlns:a="http://schemas.openxmlformats.org/drawingml/2006/main" noChangeAspect="1"/>
             </wp:cNvGraphicFramePr>
@@ -2640,7 +2696,7 @@
                   <pic:spPr>
                     <a:xfrm>
                       <a:off x="0" y="0"/>
-                      <a:ext cx="4419600" cy="1943100"/>
+                      <a:ext cx="4420217" cy="1924319"/>
                     </a:xfrm>
                     <a:prstGeom prst="rect">
                       <a:avLst/>
@@ -3086,8 +3142,8 @@
       <w:bookmarkStart w:id="7" w:name="_Toc223756091"/>
       <w:bookmarkStart w:id="8" w:name="_Toc223425647"/>
       <w:bookmarkStart w:id="9" w:name="_Toc223756092"/>
-      <w:bookmarkStart w:id="10" w:name="_Toc215049623"/>
-      <w:bookmarkStart w:id="11" w:name="_Toc204093310"/>
+      <w:bookmarkStart w:id="10" w:name="_Toc204093310"/>
+      <w:bookmarkStart w:id="11" w:name="_Toc215049623"/>
       <w:bookmarkEnd w:id="4"/>
       <w:bookmarkEnd w:id="5"/>
       <w:bookmarkEnd w:id="6"/>
@@ -3101,7 +3157,7 @@
       <w:r>
         <w:t>élection</w:t>
       </w:r>
-      <w:bookmarkEnd w:id="11"/>
+      <w:bookmarkEnd w:id="10"/>
     </w:p>
     <w:p/>
     <w:p>
@@ -3320,15 +3376,7 @@
         <w:t>l’interface affiche la liste des complexes associés</w:t>
       </w:r>
       <w:r>
-        <w:t xml:space="preserve"> </w:t>
-      </w:r>
-      <w:proofErr w:type="gramStart"/>
-      <w:r>
-        <w:t>si ils</w:t>
-      </w:r>
-      <w:proofErr w:type="gramEnd"/>
-      <w:r>
-        <w:t xml:space="preserve"> sont dans l’emprise du projet</w:t>
+        <w:t xml:space="preserve"> si ils sont dans l’emprise du projet</w:t>
       </w:r>
       <w:r>
         <w:t>.</w:t>
@@ -3435,7 +3483,7 @@
                     <pic:cNvPicPr/>
                   </pic:nvPicPr>
                   <pic:blipFill>
-                    <a:blip r:embed="rId14"/>
+                    <a:blip r:embed="rId23"/>
                     <a:stretch>
                       <a:fillRect/>
                     </a:stretch>
@@ -3718,21 +3766,8 @@
         <w:t xml:space="preserve"> lorsqu’on enregistrera les modifications</w:t>
       </w:r>
       <w:r>
-        <w:t xml:space="preserve"> par l’outil natif de </w:t>
-      </w:r>
-      <w:proofErr w:type="spellStart"/>
-      <w:r>
-        <w:t>QGis</w:t>
-      </w:r>
-      <w:proofErr w:type="spellEnd"/>
-      <w:r>
-        <w:t xml:space="preserve"> (</w:t>
-      </w:r>
-      <w:proofErr w:type="gramStart"/>
-      <w:r>
-        <w:t xml:space="preserve">disquette)   </w:t>
-      </w:r>
-      <w:proofErr w:type="gramEnd"/>
+        <w:t xml:space="preserve"> par l’outil natif de QGis (disquette)   </w:t>
+      </w:r>
       <w:r>
         <w:rPr>
           <w:noProof/>
@@ -3753,7 +3788,7 @@
                     <pic:cNvPicPr/>
                   </pic:nvPicPr>
                   <pic:blipFill>
-                    <a:blip r:embed="rId23"/>
+                    <a:blip r:embed="rId24"/>
                     <a:stretch>
                       <a:fillRect/>
                     </a:stretch>
@@ -3795,7 +3830,7 @@
       </w:r>
       <w:bookmarkEnd w:id="15"/>
     </w:p>
-    <w:bookmarkEnd w:id="10"/>
+    <w:bookmarkEnd w:id="11"/>
     <w:p>
       <w:pPr>
         <w:spacing w:line="276" w:lineRule="auto"/>
@@ -3843,7 +3878,7 @@
                     <pic:cNvPicPr/>
                   </pic:nvPicPr>
                   <pic:blipFill>
-                    <a:blip r:embed="rId24">
+                    <a:blip r:embed="rId25">
                       <a:extLst>
                         <a:ext uri="{28A0092B-C50C-407E-A947-70E740481C1C}">
                           <a14:useLocalDpi xmlns:a14="http://schemas.microsoft.com/office/drawing/2010/main" val="0"/>
@@ -3898,7 +3933,7 @@
                     <pic:cNvPicPr/>
                   </pic:nvPicPr>
                   <pic:blipFill>
-                    <a:blip r:embed="rId25">
+                    <a:blip r:embed="rId26">
                       <a:extLst>
                         <a:ext uri="{28A0092B-C50C-407E-A947-70E740481C1C}">
                           <a14:useLocalDpi xmlns:a14="http://schemas.microsoft.com/office/drawing/2010/main" val="0"/>
@@ -3973,26 +4008,13 @@
       </w:pPr>
       <w:bookmarkStart w:id="18" w:name="_Toc204093317"/>
       <w:r>
-        <w:t xml:space="preserve">Package </w:t>
-      </w:r>
-      <w:proofErr w:type="spellStart"/>
-      <w:r>
-        <w:t>openpyxl</w:t>
+        <w:t>Package openpyxl</w:t>
       </w:r>
       <w:bookmarkEnd w:id="18"/>
-      <w:proofErr w:type="spellEnd"/>
-    </w:p>
-    <w:p>
-      <w:r>
-        <w:t>Si le package « </w:t>
-      </w:r>
-      <w:proofErr w:type="spellStart"/>
-      <w:r>
-        <w:t>openpyxl</w:t>
-      </w:r>
-      <w:proofErr w:type="spellEnd"/>
-      <w:r>
-        <w:t> » n’est pas installé sur le poste le message d’erreur ci-dessous apparait lors d’une transaction.</w:t>
+    </w:p>
+    <w:p>
+      <w:r>
+        <w:t>Si le package « openpyxl » n’est pas installé sur le poste le message d’erreur ci-dessous apparait lors d’une transaction.</w:t>
       </w:r>
     </w:p>
     <w:p/>
@@ -4085,7 +4107,7 @@
                     <pic:cNvPicPr/>
                   </pic:nvPicPr>
                   <pic:blipFill>
-                    <a:blip r:embed="rId26">
+                    <a:blip r:embed="rId27">
                       <a:extLst>
                         <a:ext uri="{28A0092B-C50C-407E-A947-70E740481C1C}">
                           <a14:useLocalDpi xmlns:a14="http://schemas.microsoft.com/office/drawing/2010/main" val="0"/>
@@ -4153,7 +4175,7 @@
                     <pic:cNvPicPr/>
                   </pic:nvPicPr>
                   <pic:blipFill>
-                    <a:blip r:embed="rId27">
+                    <a:blip r:embed="rId28">
                       <a:extLst>
                         <a:ext uri="{28A0092B-C50C-407E-A947-70E740481C1C}">
                           <a14:useLocalDpi xmlns:a14="http://schemas.microsoft.com/office/drawing/2010/main" val="0"/>
@@ -4193,29 +4215,8 @@
         <w:t>python-qgis-ltr.bat</w:t>
       </w:r>
       <w:r>
-        <w:t xml:space="preserve"> -m </w:t>
-      </w:r>
-      <w:proofErr w:type="spellStart"/>
-      <w:r>
-        <w:t>pip</w:t>
-      </w:r>
-      <w:proofErr w:type="spellEnd"/>
-      <w:r>
-        <w:t xml:space="preserve"> </w:t>
-      </w:r>
-      <w:proofErr w:type="spellStart"/>
-      <w:r>
-        <w:t>install</w:t>
-      </w:r>
-      <w:proofErr w:type="spellEnd"/>
-      <w:r>
-        <w:t xml:space="preserve"> </w:t>
-      </w:r>
-      <w:proofErr w:type="spellStart"/>
-      <w:r>
-        <w:t>openpyxl</w:t>
-      </w:r>
-      <w:proofErr w:type="spellEnd"/>
+        <w:t xml:space="preserve"> -m pip install openpyxl</w:t>
+      </w:r>
     </w:p>
     <w:p>
       <w:pPr>
@@ -4246,7 +4247,7 @@
                     <pic:cNvPicPr/>
                   </pic:nvPicPr>
                   <pic:blipFill>
-                    <a:blip r:embed="rId28">
+                    <a:blip r:embed="rId29">
                       <a:extLst>
                         <a:ext uri="{28A0092B-C50C-407E-A947-70E740481C1C}">
                           <a14:useLocalDpi xmlns:a14="http://schemas.microsoft.com/office/drawing/2010/main" val="0"/>
@@ -4285,8 +4286,8 @@
     </w:p>
     <w:p/>
     <w:sectPr>
-      <w:footerReference w:type="default" r:id="rId29"/>
-      <w:footerReference w:type="first" r:id="rId30"/>
+      <w:footerReference w:type="default" r:id="rId30"/>
+      <w:footerReference w:type="first" r:id="rId31"/>
       <w:pgSz w:w="11906" w:h="16838" w:code="9"/>
       <w:pgMar w:top="851" w:right="924" w:bottom="1616" w:left="1134" w:header="709" w:footer="607" w:gutter="0"/>
       <w:cols w:space="708"/>
@@ -4518,7 +4519,7 @@
             <w:tag w:val="_DCDateCreated"/>
             <w:id w:val="317545533"/>
             <w:dataBinding w:prefixMappings="xmlns:ns0='http://schemas.microsoft.com/office/2006/metadata/properties' xmlns:ns1='http://www.w3.org/2001/XMLSchema-instance' xmlns:ns2='http://schemas.microsoft.com/office/infopath/2007/PartnerControls' xmlns:ns3='a1322699-2fbb-4cce-8aba-176c4fa97253' xmlns:ns4='http://schemas.microsoft.com/sharepoint/v3' xmlns:ns5='http://schemas.microsoft.com/sharepoint/v3/fields' xmlns:ns6='f0ff482e-aa3b-417e-9d65-5f4cb2656651' " w:xpath="/ns0:properties[1]/documentManagement[1]/ns5:_DCDateCreated[1]" w:storeItemID="{1159403A-C237-488E-8C5E-DABF9FCE7043}"/>
-            <w:date w:fullDate="2025-07-22T00:00:00Z">
+            <w:date w:fullDate="2026-01-21T00:00:00Z">
               <w:dateFormat w:val="dd/MM/yyyy"/>
               <w:lid w:val="fr-FR"/>
               <w:storeMappedDataAs w:val="dateTime"/>
@@ -4558,7 +4559,7 @@
                   <w:szCs w:val="18"/>
                   <w:lang w:eastAsia="en-US"/>
                 </w:rPr>
-                <w:t>2/07</w:t>
+                <w:t>1</w:t>
               </w:r>
               <w:r>
                 <w:rPr>
@@ -4566,7 +4567,31 @@
                   <w:szCs w:val="18"/>
                   <w:lang w:eastAsia="en-US"/>
                 </w:rPr>
-                <w:t>/2025</w:t>
+                <w:t>/0</w:t>
+              </w:r>
+              <w:r>
+                <w:rPr>
+                  <w:rFonts w:cs="Arial"/>
+                  <w:szCs w:val="18"/>
+                  <w:lang w:eastAsia="en-US"/>
+                </w:rPr>
+                <w:t>1</w:t>
+              </w:r>
+              <w:r>
+                <w:rPr>
+                  <w:rFonts w:cs="Arial"/>
+                  <w:szCs w:val="18"/>
+                  <w:lang w:eastAsia="en-US"/>
+                </w:rPr>
+                <w:t>/202</w:t>
+              </w:r>
+              <w:r>
+                <w:rPr>
+                  <w:rFonts w:cs="Arial"/>
+                  <w:szCs w:val="18"/>
+                  <w:lang w:eastAsia="en-US"/>
+                </w:rPr>
+                <w:t>6</w:t>
               </w:r>
             </w:p>
           </w:sdtContent>
@@ -7738,7 +7763,7 @@
     <w:charset w:val="00"/>
     <w:family w:val="swiss"/>
     <w:pitch w:val="variable"/>
-    <w:sig w:usb0="E4002EFF" w:usb1="C000247B" w:usb2="00000009" w:usb3="00000000" w:csb0="000001FF" w:csb1="00000000"/>
+    <w:sig w:usb0="E4002EFF" w:usb1="C200247B" w:usb2="00000009" w:usb3="00000000" w:csb0="000001FF" w:csb1="00000000"/>
   </w:font>
   <w:font w:name="Tahoma">
     <w:panose1 w:val="020B0604030504040204"/>
@@ -7766,7 +7791,7 @@
     <w:charset w:val="00"/>
     <w:family w:val="swiss"/>
     <w:pitch w:val="variable"/>
-    <w:sig w:usb0="E4002EFF" w:usb1="C000247B" w:usb2="00000009" w:usb3="00000000" w:csb0="000001FF" w:csb1="00000000"/>
+    <w:sig w:usb0="E4002EFF" w:usb1="C200247B" w:usb2="00000009" w:usb3="00000000" w:csb0="000001FF" w:csb1="00000000"/>
   </w:font>
 </w:fonts>
 </file>
@@ -7798,6 +7823,7 @@
     <w:rsid w:val="003259A4"/>
     <w:rsid w:val="003E4E0E"/>
     <w:rsid w:val="004A3B91"/>
+    <w:rsid w:val="004C00D8"/>
     <w:rsid w:val="0054019A"/>
     <w:rsid w:val="00596E3A"/>
     <w:rsid w:val="005A3F1B"/>
@@ -7826,6 +7852,7 @@
     <w:rsid w:val="00DB4639"/>
     <w:rsid w:val="00E17E2D"/>
     <w:rsid w:val="00E40FFF"/>
+    <w:rsid w:val="00EB500B"/>
     <w:rsid w:val="00EC264E"/>
     <w:rsid w:val="00F04089"/>
     <w:rsid w:val="00F349D7"/>
@@ -8597,10 +8624,6 @@
 </file>
 
 <file path=customXml/item1.xml><?xml version="1.0" encoding="utf-8"?>
-<b:Sources xmlns:b="http://schemas.openxmlformats.org/officeDocument/2006/bibliography" xmlns="http://schemas.openxmlformats.org/officeDocument/2006/bibliography" SelectedStyle="\APA.XSL" StyleName="APA"/>
-</file>
-
-<file path=customXml/item2.xml><?xml version="1.0" encoding="utf-8"?>
 <p:properties xmlns:p="http://schemas.microsoft.com/office/2006/metadata/properties" xmlns:xsi="http://www.w3.org/2001/XMLSchema-instance" xmlns:pc="http://schemas.microsoft.com/office/infopath/2007/PartnerControls">
   <documentManagement>
     <lcf76f155ced4ddcb4097134ff3c332f xmlns="b295003c-aa87-407e-9024-fdee4e88f6fa">
@@ -8610,7 +8633,7 @@
 </p:properties>
 </file>
 
-<file path=customXml/item3.xml><?xml version="1.0" encoding="utf-8"?>
+<file path=customXml/item2.xml><?xml version="1.0" encoding="utf-8"?>
 <?mso-contentType ?>
 <FormTemplates xmlns="http://schemas.microsoft.com/sharepoint/v3/contenttype/forms">
   <Display>DocumentLibraryForm</Display>
@@ -8619,7 +8642,7 @@
 </FormTemplates>
 </file>
 
-<file path=customXml/item4.xml><?xml version="1.0" encoding="utf-8"?>
+<file path=customXml/item3.xml><?xml version="1.0" encoding="utf-8"?>
 <ct:contentTypeSchema xmlns:ct="http://schemas.microsoft.com/office/2006/metadata/contentType" xmlns:ma="http://schemas.microsoft.com/office/2006/metadata/properties/metaAttributes" ct:_="" ma:_="" ma:contentTypeName="Document" ma:contentTypeID="0x010100A3FA4CB5114F4B43B99F0B6DC8751D90" ma:contentTypeVersion="10" ma:contentTypeDescription="Crée un document." ma:contentTypeScope="" ma:versionID="501205be520febb413c56432ff8e6df1">
   <xsd:schema xmlns:xsd="http://www.w3.org/2001/XMLSchema" xmlns:xs="http://www.w3.org/2001/XMLSchema" xmlns:p="http://schemas.microsoft.com/office/2006/metadata/properties" xmlns:ns2="b295003c-aa87-407e-9024-fdee4e88f6fa" targetNamespace="http://schemas.microsoft.com/office/2006/metadata/properties" ma:root="true" ma:fieldsID="0378f5bf275aa5e8e5bb75b38d3da7db" ns2:_="">
     <xsd:import namespace="b295003c-aa87-407e-9024-fdee4e88f6fa"/>
@@ -8797,15 +8820,11 @@
 </ct:contentTypeSchema>
 </file>
 
-<file path=customXml/itemProps1.xml><?xml version="1.0" encoding="utf-8"?>
-<ds:datastoreItem xmlns:ds="http://schemas.openxmlformats.org/officeDocument/2006/customXml" ds:itemID="{0FF0F878-5F0F-460C-9013-40E72731A637}">
-  <ds:schemaRefs>
-    <ds:schemaRef ds:uri="http://schemas.openxmlformats.org/officeDocument/2006/bibliography"/>
-  </ds:schemaRefs>
-</ds:datastoreItem>
+<file path=customXml/item4.xml><?xml version="1.0" encoding="utf-8"?>
+<b:Sources xmlns:b="http://schemas.openxmlformats.org/officeDocument/2006/bibliography" xmlns="http://schemas.openxmlformats.org/officeDocument/2006/bibliography" SelectedStyle="\APA.XSL" StyleName="APA"/>
 </file>
 
-<file path=customXml/itemProps2.xml><?xml version="1.0" encoding="utf-8"?>
+<file path=customXml/itemProps1.xml><?xml version="1.0" encoding="utf-8"?>
 <ds:datastoreItem xmlns:ds="http://schemas.openxmlformats.org/officeDocument/2006/customXml" ds:itemID="{1159403A-C237-488E-8C5E-DABF9FCE7043}">
   <ds:schemaRefs>
     <ds:schemaRef ds:uri="http://schemas.microsoft.com/office/2006/metadata/properties"/>
@@ -8815,7 +8834,7 @@
 </ds:datastoreItem>
 </file>
 
-<file path=customXml/itemProps3.xml><?xml version="1.0" encoding="utf-8"?>
+<file path=customXml/itemProps2.xml><?xml version="1.0" encoding="utf-8"?>
 <ds:datastoreItem xmlns:ds="http://schemas.openxmlformats.org/officeDocument/2006/customXml" ds:itemID="{EEE2973D-7DD7-4773-855D-5CAD81242BDE}">
   <ds:schemaRefs>
     <ds:schemaRef ds:uri="http://schemas.microsoft.com/sharepoint/v3/contenttype/forms"/>
@@ -8823,7 +8842,7 @@
 </ds:datastoreItem>
 </file>
 
-<file path=customXml/itemProps4.xml><?xml version="1.0" encoding="utf-8"?>
+<file path=customXml/itemProps3.xml><?xml version="1.0" encoding="utf-8"?>
 <ds:datastoreItem xmlns:ds="http://schemas.openxmlformats.org/officeDocument/2006/customXml" ds:itemID="{B747A848-EED6-42A4-AAA3-C39C067A5137}">
   <ds:schemaRefs>
     <ds:schemaRef ds:uri="http://schemas.microsoft.com/office/2006/metadata/contentType"/>
@@ -8839,4 +8858,12 @@
     <ds:schemaRef ds:uri="http://schemas.microsoft.com/internal/obd"/>
   </ds:schemaRefs>
 </ds:datastoreItem>
+</file>
+
+<file path=customXml/itemProps4.xml><?xml version="1.0" encoding="utf-8"?>
+<ds:datastoreItem xmlns:ds="http://schemas.openxmlformats.org/officeDocument/2006/customXml" ds:itemID="{0FF0F878-5F0F-460C-9013-40E72731A637}">
+  <ds:schemaRefs>
+    <ds:schemaRef ds:uri="http://schemas.openxmlformats.org/officeDocument/2006/bibliography"/>
+  </ds:schemaRefs>
+</ds:datastoreItem>
 </file>
</xml_diff>

<commit_message>
mise au propre apres crash
</commit_message>
<xml_diff>
--- a/assistant complexe.docx
+++ b/assistant complexe.docx
@@ -197,7 +197,17 @@
                 <w:sz w:val="28"/>
                 <w:szCs w:val="28"/>
               </w:rPr>
-              <w:t>.0</w:t>
+              <w:t>.</w:t>
+            </w:r>
+            <w:r>
+              <w:rPr>
+                <w:rFonts w:ascii="Times New Roman" w:hAnsi="Times New Roman" w:cs="Times New Roman"/>
+                <w:b/>
+                <w:noProof/>
+                <w:sz w:val="28"/>
+                <w:szCs w:val="28"/>
+              </w:rPr>
+              <w:t>1</w:t>
             </w:r>
           </w:p>
         </w:tc>
@@ -444,7 +454,15 @@
                     <w:b/>
                     <w:szCs w:val="18"/>
                   </w:rPr>
-                  <w:t>.0</w:t>
+                  <w:t>.</w:t>
+                </w:r>
+                <w:r>
+                  <w:rPr>
+                    <w:rFonts w:cs="Arial"/>
+                    <w:b/>
+                    <w:szCs w:val="18"/>
+                  </w:rPr>
+                  <w:t>1</w:t>
                 </w:r>
               </w:sdtContent>
             </w:sdt>
@@ -1018,7 +1036,7 @@
       <w:tr>
         <w:tc>
           <w:tcPr>
-            <w:tcW w:w="1122" w:type="dxa"/>
+            <w:tcW w:w="1115" w:type="dxa"/>
             <w:shd w:val="clear" w:color="auto" w:fill="D9D9D9" w:themeFill="background1" w:themeFillShade="D9"/>
           </w:tcPr>
           <w:p>
@@ -1040,7 +1058,7 @@
         </w:tc>
         <w:tc>
           <w:tcPr>
-            <w:tcW w:w="1400" w:type="dxa"/>
+            <w:tcW w:w="1514" w:type="dxa"/>
             <w:shd w:val="clear" w:color="auto" w:fill="D9D9D9" w:themeFill="background1" w:themeFillShade="D9"/>
           </w:tcPr>
           <w:p>
@@ -1061,7 +1079,7 @@
         </w:tc>
         <w:tc>
           <w:tcPr>
-            <w:tcW w:w="2500" w:type="dxa"/>
+            <w:tcW w:w="2472" w:type="dxa"/>
             <w:shd w:val="clear" w:color="auto" w:fill="D9D9D9" w:themeFill="background1" w:themeFillShade="D9"/>
           </w:tcPr>
           <w:p>
@@ -1082,7 +1100,7 @@
         </w:tc>
         <w:tc>
           <w:tcPr>
-            <w:tcW w:w="4850" w:type="dxa"/>
+            <w:tcW w:w="4771" w:type="dxa"/>
             <w:shd w:val="clear" w:color="auto" w:fill="D9D9D9" w:themeFill="background1" w:themeFillShade="D9"/>
           </w:tcPr>
           <w:p>
@@ -1106,7 +1124,7 @@
       <w:tr>
         <w:tc>
           <w:tcPr>
-            <w:tcW w:w="1122" w:type="dxa"/>
+            <w:tcW w:w="1115" w:type="dxa"/>
             <w:shd w:val="clear" w:color="auto" w:fill="D9D9D9" w:themeFill="background1" w:themeFillShade="D9"/>
           </w:tcPr>
           <w:p>
@@ -1120,7 +1138,7 @@
         </w:tc>
         <w:tc>
           <w:tcPr>
-            <w:tcW w:w="1400" w:type="dxa"/>
+            <w:tcW w:w="1514" w:type="dxa"/>
             <w:shd w:val="clear" w:color="auto" w:fill="D9D9D9" w:themeFill="background1" w:themeFillShade="D9"/>
           </w:tcPr>
           <w:p>
@@ -1134,7 +1152,7 @@
         </w:tc>
         <w:tc>
           <w:tcPr>
-            <w:tcW w:w="2500" w:type="dxa"/>
+            <w:tcW w:w="2472" w:type="dxa"/>
             <w:shd w:val="clear" w:color="auto" w:fill="D9D9D9" w:themeFill="background1" w:themeFillShade="D9"/>
           </w:tcPr>
           <w:p>
@@ -1148,7 +1166,7 @@
         </w:tc>
         <w:tc>
           <w:tcPr>
-            <w:tcW w:w="4850" w:type="dxa"/>
+            <w:tcW w:w="4771" w:type="dxa"/>
             <w:shd w:val="clear" w:color="auto" w:fill="D9D9D9" w:themeFill="background1" w:themeFillShade="D9"/>
           </w:tcPr>
           <w:p>
@@ -1165,7 +1183,7 @@
       <w:tr>
         <w:tc>
           <w:tcPr>
-            <w:tcW w:w="1122" w:type="dxa"/>
+            <w:tcW w:w="1115" w:type="dxa"/>
           </w:tcPr>
           <w:p>
             <w:pPr>
@@ -1187,7 +1205,7 @@
         </w:tc>
         <w:tc>
           <w:tcPr>
-            <w:tcW w:w="1400" w:type="dxa"/>
+            <w:tcW w:w="1514" w:type="dxa"/>
           </w:tcPr>
           <w:p>
             <w:pPr>
@@ -1214,7 +1232,7 @@
         </w:tc>
         <w:tc>
           <w:tcPr>
-            <w:tcW w:w="2500" w:type="dxa"/>
+            <w:tcW w:w="2472" w:type="dxa"/>
           </w:tcPr>
           <w:p>
             <w:pPr>
@@ -1234,7 +1252,7 @@
         </w:tc>
         <w:tc>
           <w:tcPr>
-            <w:tcW w:w="4850" w:type="dxa"/>
+            <w:tcW w:w="4771" w:type="dxa"/>
           </w:tcPr>
           <w:p>
             <w:pPr>
@@ -1257,7 +1275,7 @@
       <w:tr>
         <w:tc>
           <w:tcPr>
-            <w:tcW w:w="1122" w:type="dxa"/>
+            <w:tcW w:w="1115" w:type="dxa"/>
           </w:tcPr>
           <w:p>
             <w:pPr>
@@ -1279,7 +1297,7 @@
         </w:tc>
         <w:tc>
           <w:tcPr>
-            <w:tcW w:w="1400" w:type="dxa"/>
+            <w:tcW w:w="1514" w:type="dxa"/>
           </w:tcPr>
           <w:p>
             <w:pPr>
@@ -1299,7 +1317,7 @@
         </w:tc>
         <w:tc>
           <w:tcPr>
-            <w:tcW w:w="2500" w:type="dxa"/>
+            <w:tcW w:w="2472" w:type="dxa"/>
           </w:tcPr>
           <w:p>
             <w:pPr>
@@ -1326,7 +1344,7 @@
         </w:tc>
         <w:tc>
           <w:tcPr>
-            <w:tcW w:w="4850" w:type="dxa"/>
+            <w:tcW w:w="4771" w:type="dxa"/>
           </w:tcPr>
           <w:p>
             <w:pPr>
@@ -1342,6 +1360,90 @@
                 <w:szCs w:val="18"/>
               </w:rPr>
               <w:t>Transaction par le plugin Espace Collaboratif</w:t>
+            </w:r>
+          </w:p>
+        </w:tc>
+      </w:tr>
+      <w:tr>
+        <w:tc>
+          <w:tcPr>
+            <w:tcW w:w="1115" w:type="dxa"/>
+          </w:tcPr>
+          <w:p>
+            <w:pPr>
+              <w:ind w:firstLine="34"/>
+              <w:jc w:val="center"/>
+              <w:rPr>
+                <w:rFonts w:cs="Arial"/>
+                <w:szCs w:val="18"/>
+              </w:rPr>
+            </w:pPr>
+            <w:r>
+              <w:rPr>
+                <w:rFonts w:cs="Arial"/>
+                <w:szCs w:val="18"/>
+              </w:rPr>
+              <w:t>1.1.1</w:t>
+            </w:r>
+          </w:p>
+        </w:tc>
+        <w:tc>
+          <w:tcPr>
+            <w:tcW w:w="1514" w:type="dxa"/>
+          </w:tcPr>
+          <w:p>
+            <w:pPr>
+              <w:rPr>
+                <w:rFonts w:cs="Arial"/>
+                <w:szCs w:val="18"/>
+              </w:rPr>
+            </w:pPr>
+            <w:r>
+              <w:rPr>
+                <w:rFonts w:cs="Arial"/>
+                <w:szCs w:val="18"/>
+              </w:rPr>
+              <w:t>21/01/2026</w:t>
+            </w:r>
+          </w:p>
+        </w:tc>
+        <w:tc>
+          <w:tcPr>
+            <w:tcW w:w="2472" w:type="dxa"/>
+          </w:tcPr>
+          <w:p>
+            <w:pPr>
+              <w:rPr>
+                <w:rFonts w:cs="Arial"/>
+                <w:szCs w:val="18"/>
+              </w:rPr>
+            </w:pPr>
+            <w:r>
+              <w:rPr>
+                <w:rFonts w:cs="Arial"/>
+                <w:szCs w:val="18"/>
+              </w:rPr>
+              <w:t>Philippe GALLEN</w:t>
+            </w:r>
+          </w:p>
+        </w:tc>
+        <w:tc>
+          <w:tcPr>
+            <w:tcW w:w="4771" w:type="dxa"/>
+          </w:tcPr>
+          <w:p>
+            <w:pPr>
+              <w:rPr>
+                <w:rFonts w:cs="Arial"/>
+                <w:szCs w:val="18"/>
+              </w:rPr>
+            </w:pPr>
+            <w:r>
+              <w:rPr>
+                <w:rFonts w:cs="Arial"/>
+                <w:szCs w:val="18"/>
+              </w:rPr>
+              <w:t>Adaptation à la version 1.1.1</w:t>
             </w:r>
           </w:p>
         </w:tc>
@@ -2322,7 +2424,6 @@
       </w:pPr>
       <w:bookmarkStart w:id="0" w:name="_Toc204093306"/>
       <w:r>
-        <w:lastRenderedPageBreak/>
         <w:t>Prérequis</w:t>
       </w:r>
       <w:bookmarkEnd w:id="0"/>
@@ -2375,21 +2476,8 @@
       <w:r>
         <w:t xml:space="preserve">ouche </w:t>
       </w:r>
-      <w:proofErr w:type="spellStart"/>
-      <w:r>
-        <w:t>troncon_de_</w:t>
-      </w:r>
-      <w:proofErr w:type="gramStart"/>
-      <w:r>
-        <w:t>route</w:t>
-      </w:r>
-      <w:proofErr w:type="spellEnd"/>
-      <w:r>
-        <w:t>  éditable</w:t>
-      </w:r>
-      <w:proofErr w:type="gramEnd"/>
-      <w:r>
-        <w:t xml:space="preserve"> </w:t>
+      <w:r>
+        <w:t xml:space="preserve">troncon_de_route  éditable </w:t>
       </w:r>
       <w:r>
         <w:t>de la BDTopo</w:t>
@@ -2413,15 +2501,7 @@
         </w:numPr>
       </w:pPr>
       <w:r>
-        <w:t xml:space="preserve">Package </w:t>
-      </w:r>
-      <w:proofErr w:type="spellStart"/>
-      <w:r>
-        <w:t>openpyxl</w:t>
-      </w:r>
-      <w:proofErr w:type="spellEnd"/>
-      <w:r>
-        <w:t xml:space="preserve"> (voir installation en annexe à la fin de ce document).</w:t>
+        <w:t>Package openpyxl (voir installation en annexe à la fin de ce document).</w:t>
       </w:r>
     </w:p>
     <w:p/>
@@ -2450,31 +2530,7 @@
     </w:p>
     <w:p>
       <w:r>
-        <w:t>Le numéro ou le nom des routes (départementales, autoroutes, nationales, intercommunales, communales, chemins ruraux) est affiché dans les tronçons de route (</w:t>
-      </w:r>
-      <w:proofErr w:type="spellStart"/>
-      <w:r>
-        <w:t>CPX_Numéro</w:t>
-      </w:r>
-      <w:proofErr w:type="spellEnd"/>
-      <w:r>
-        <w:t xml:space="preserve">, </w:t>
-      </w:r>
-      <w:proofErr w:type="spellStart"/>
-      <w:r>
-        <w:t>CPX_Numéro</w:t>
-      </w:r>
-      <w:proofErr w:type="spellEnd"/>
-      <w:r>
-        <w:t xml:space="preserve"> de route européenne, </w:t>
-      </w:r>
-      <w:proofErr w:type="spellStart"/>
-      <w:r>
-        <w:t>CPX_Toponyme</w:t>
-      </w:r>
-      <w:proofErr w:type="spellEnd"/>
-      <w:r>
-        <w:t xml:space="preserve"> route nommée)</w:t>
+        <w:t>Le numéro ou le nom des routes (départementales, autoroutes, nationales, intercommunales, communales, chemins ruraux) est affiché dans les tronçons de route (CPX_Numéro, CPX_Numéro de route européenne, CPX_Toponyme route nommée)</w:t>
       </w:r>
       <w:r>
         <w:t xml:space="preserve"> mais ces routes numérotées ou nommées sont gérées par des objets Route numérotées ou nommées.</w:t>
@@ -2617,10 +2673,10 @@
           <w:noProof/>
         </w:rPr>
         <w:drawing>
-          <wp:inline distT="0" distB="0" distL="0" distR="0" wp14:anchorId="3D60F057" wp14:editId="4AF11EE8">
-            <wp:extent cx="4419600" cy="1943100"/>
+          <wp:inline distT="0" distB="0" distL="0" distR="0" wp14:anchorId="5D45B29E" wp14:editId="55E246D1">
+            <wp:extent cx="4420217" cy="1924319"/>
             <wp:effectExtent l="0" t="0" r="0" b="0"/>
-            <wp:docPr id="18" name="Image 18"/>
+            <wp:docPr id="5" name="Image 5"/>
             <wp:cNvGraphicFramePr>
               <a:graphicFrameLocks xmlns:a="http://schemas.openxmlformats.org/drawingml/2006/main" noChangeAspect="1"/>
             </wp:cNvGraphicFramePr>
@@ -2640,7 +2696,7 @@
                   <pic:spPr>
                     <a:xfrm>
                       <a:off x="0" y="0"/>
-                      <a:ext cx="4419600" cy="1943100"/>
+                      <a:ext cx="4420217" cy="1924319"/>
                     </a:xfrm>
                     <a:prstGeom prst="rect">
                       <a:avLst/>
@@ -3086,8 +3142,8 @@
       <w:bookmarkStart w:id="7" w:name="_Toc223756091"/>
       <w:bookmarkStart w:id="8" w:name="_Toc223425647"/>
       <w:bookmarkStart w:id="9" w:name="_Toc223756092"/>
-      <w:bookmarkStart w:id="10" w:name="_Toc215049623"/>
-      <w:bookmarkStart w:id="11" w:name="_Toc204093310"/>
+      <w:bookmarkStart w:id="10" w:name="_Toc204093310"/>
+      <w:bookmarkStart w:id="11" w:name="_Toc215049623"/>
       <w:bookmarkEnd w:id="4"/>
       <w:bookmarkEnd w:id="5"/>
       <w:bookmarkEnd w:id="6"/>
@@ -3101,7 +3157,7 @@
       <w:r>
         <w:t>élection</w:t>
       </w:r>
-      <w:bookmarkEnd w:id="11"/>
+      <w:bookmarkEnd w:id="10"/>
     </w:p>
     <w:p/>
     <w:p>
@@ -3320,15 +3376,7 @@
         <w:t>l’interface affiche la liste des complexes associés</w:t>
       </w:r>
       <w:r>
-        <w:t xml:space="preserve"> </w:t>
-      </w:r>
-      <w:proofErr w:type="gramStart"/>
-      <w:r>
-        <w:t>si ils</w:t>
-      </w:r>
-      <w:proofErr w:type="gramEnd"/>
-      <w:r>
-        <w:t xml:space="preserve"> sont dans l’emprise du projet</w:t>
+        <w:t xml:space="preserve"> si ils sont dans l’emprise du projet</w:t>
       </w:r>
       <w:r>
         <w:t>.</w:t>
@@ -3435,7 +3483,7 @@
                     <pic:cNvPicPr/>
                   </pic:nvPicPr>
                   <pic:blipFill>
-                    <a:blip r:embed="rId14"/>
+                    <a:blip r:embed="rId23"/>
                     <a:stretch>
                       <a:fillRect/>
                     </a:stretch>
@@ -3718,21 +3766,8 @@
         <w:t xml:space="preserve"> lorsqu’on enregistrera les modifications</w:t>
       </w:r>
       <w:r>
-        <w:t xml:space="preserve"> par l’outil natif de </w:t>
-      </w:r>
-      <w:proofErr w:type="spellStart"/>
-      <w:r>
-        <w:t>QGis</w:t>
-      </w:r>
-      <w:proofErr w:type="spellEnd"/>
-      <w:r>
-        <w:t xml:space="preserve"> (</w:t>
-      </w:r>
-      <w:proofErr w:type="gramStart"/>
-      <w:r>
-        <w:t xml:space="preserve">disquette)   </w:t>
-      </w:r>
-      <w:proofErr w:type="gramEnd"/>
+        <w:t xml:space="preserve"> par l’outil natif de QGis (disquette)   </w:t>
+      </w:r>
       <w:r>
         <w:rPr>
           <w:noProof/>
@@ -3753,7 +3788,7 @@
                     <pic:cNvPicPr/>
                   </pic:nvPicPr>
                   <pic:blipFill>
-                    <a:blip r:embed="rId23"/>
+                    <a:blip r:embed="rId24"/>
                     <a:stretch>
                       <a:fillRect/>
                     </a:stretch>
@@ -3795,7 +3830,7 @@
       </w:r>
       <w:bookmarkEnd w:id="15"/>
     </w:p>
-    <w:bookmarkEnd w:id="10"/>
+    <w:bookmarkEnd w:id="11"/>
     <w:p>
       <w:pPr>
         <w:spacing w:line="276" w:lineRule="auto"/>
@@ -3843,7 +3878,7 @@
                     <pic:cNvPicPr/>
                   </pic:nvPicPr>
                   <pic:blipFill>
-                    <a:blip r:embed="rId24">
+                    <a:blip r:embed="rId25">
                       <a:extLst>
                         <a:ext uri="{28A0092B-C50C-407E-A947-70E740481C1C}">
                           <a14:useLocalDpi xmlns:a14="http://schemas.microsoft.com/office/drawing/2010/main" val="0"/>
@@ -3898,7 +3933,7 @@
                     <pic:cNvPicPr/>
                   </pic:nvPicPr>
                   <pic:blipFill>
-                    <a:blip r:embed="rId25">
+                    <a:blip r:embed="rId26">
                       <a:extLst>
                         <a:ext uri="{28A0092B-C50C-407E-A947-70E740481C1C}">
                           <a14:useLocalDpi xmlns:a14="http://schemas.microsoft.com/office/drawing/2010/main" val="0"/>
@@ -3973,26 +4008,13 @@
       </w:pPr>
       <w:bookmarkStart w:id="18" w:name="_Toc204093317"/>
       <w:r>
-        <w:t xml:space="preserve">Package </w:t>
-      </w:r>
-      <w:proofErr w:type="spellStart"/>
-      <w:r>
-        <w:t>openpyxl</w:t>
+        <w:t>Package openpyxl</w:t>
       </w:r>
       <w:bookmarkEnd w:id="18"/>
-      <w:proofErr w:type="spellEnd"/>
-    </w:p>
-    <w:p>
-      <w:r>
-        <w:t>Si le package « </w:t>
-      </w:r>
-      <w:proofErr w:type="spellStart"/>
-      <w:r>
-        <w:t>openpyxl</w:t>
-      </w:r>
-      <w:proofErr w:type="spellEnd"/>
-      <w:r>
-        <w:t> » n’est pas installé sur le poste le message d’erreur ci-dessous apparait lors d’une transaction.</w:t>
+    </w:p>
+    <w:p>
+      <w:r>
+        <w:t>Si le package « openpyxl » n’est pas installé sur le poste le message d’erreur ci-dessous apparait lors d’une transaction.</w:t>
       </w:r>
     </w:p>
     <w:p/>
@@ -4085,7 +4107,7 @@
                     <pic:cNvPicPr/>
                   </pic:nvPicPr>
                   <pic:blipFill>
-                    <a:blip r:embed="rId26">
+                    <a:blip r:embed="rId27">
                       <a:extLst>
                         <a:ext uri="{28A0092B-C50C-407E-A947-70E740481C1C}">
                           <a14:useLocalDpi xmlns:a14="http://schemas.microsoft.com/office/drawing/2010/main" val="0"/>
@@ -4153,7 +4175,7 @@
                     <pic:cNvPicPr/>
                   </pic:nvPicPr>
                   <pic:blipFill>
-                    <a:blip r:embed="rId27">
+                    <a:blip r:embed="rId28">
                       <a:extLst>
                         <a:ext uri="{28A0092B-C50C-407E-A947-70E740481C1C}">
                           <a14:useLocalDpi xmlns:a14="http://schemas.microsoft.com/office/drawing/2010/main" val="0"/>
@@ -4193,29 +4215,8 @@
         <w:t>python-qgis-ltr.bat</w:t>
       </w:r>
       <w:r>
-        <w:t xml:space="preserve"> -m </w:t>
-      </w:r>
-      <w:proofErr w:type="spellStart"/>
-      <w:r>
-        <w:t>pip</w:t>
-      </w:r>
-      <w:proofErr w:type="spellEnd"/>
-      <w:r>
-        <w:t xml:space="preserve"> </w:t>
-      </w:r>
-      <w:proofErr w:type="spellStart"/>
-      <w:r>
-        <w:t>install</w:t>
-      </w:r>
-      <w:proofErr w:type="spellEnd"/>
-      <w:r>
-        <w:t xml:space="preserve"> </w:t>
-      </w:r>
-      <w:proofErr w:type="spellStart"/>
-      <w:r>
-        <w:t>openpyxl</w:t>
-      </w:r>
-      <w:proofErr w:type="spellEnd"/>
+        <w:t xml:space="preserve"> -m pip install openpyxl</w:t>
+      </w:r>
     </w:p>
     <w:p>
       <w:pPr>
@@ -4246,7 +4247,7 @@
                     <pic:cNvPicPr/>
                   </pic:nvPicPr>
                   <pic:blipFill>
-                    <a:blip r:embed="rId28">
+                    <a:blip r:embed="rId29">
                       <a:extLst>
                         <a:ext uri="{28A0092B-C50C-407E-A947-70E740481C1C}">
                           <a14:useLocalDpi xmlns:a14="http://schemas.microsoft.com/office/drawing/2010/main" val="0"/>
@@ -4285,8 +4286,8 @@
     </w:p>
     <w:p/>
     <w:sectPr>
-      <w:footerReference w:type="default" r:id="rId29"/>
-      <w:footerReference w:type="first" r:id="rId30"/>
+      <w:footerReference w:type="default" r:id="rId30"/>
+      <w:footerReference w:type="first" r:id="rId31"/>
       <w:pgSz w:w="11906" w:h="16838" w:code="9"/>
       <w:pgMar w:top="851" w:right="924" w:bottom="1616" w:left="1134" w:header="709" w:footer="607" w:gutter="0"/>
       <w:cols w:space="708"/>
@@ -4518,7 +4519,7 @@
             <w:tag w:val="_DCDateCreated"/>
             <w:id w:val="317545533"/>
             <w:dataBinding w:prefixMappings="xmlns:ns0='http://schemas.microsoft.com/office/2006/metadata/properties' xmlns:ns1='http://www.w3.org/2001/XMLSchema-instance' xmlns:ns2='http://schemas.microsoft.com/office/infopath/2007/PartnerControls' xmlns:ns3='a1322699-2fbb-4cce-8aba-176c4fa97253' xmlns:ns4='http://schemas.microsoft.com/sharepoint/v3' xmlns:ns5='http://schemas.microsoft.com/sharepoint/v3/fields' xmlns:ns6='f0ff482e-aa3b-417e-9d65-5f4cb2656651' " w:xpath="/ns0:properties[1]/documentManagement[1]/ns5:_DCDateCreated[1]" w:storeItemID="{1159403A-C237-488E-8C5E-DABF9FCE7043}"/>
-            <w:date w:fullDate="2025-07-22T00:00:00Z">
+            <w:date w:fullDate="2026-01-21T00:00:00Z">
               <w:dateFormat w:val="dd/MM/yyyy"/>
               <w:lid w:val="fr-FR"/>
               <w:storeMappedDataAs w:val="dateTime"/>
@@ -4558,7 +4559,7 @@
                   <w:szCs w:val="18"/>
                   <w:lang w:eastAsia="en-US"/>
                 </w:rPr>
-                <w:t>2/07</w:t>
+                <w:t>1</w:t>
               </w:r>
               <w:r>
                 <w:rPr>
@@ -4566,7 +4567,31 @@
                   <w:szCs w:val="18"/>
                   <w:lang w:eastAsia="en-US"/>
                 </w:rPr>
-                <w:t>/2025</w:t>
+                <w:t>/0</w:t>
+              </w:r>
+              <w:r>
+                <w:rPr>
+                  <w:rFonts w:cs="Arial"/>
+                  <w:szCs w:val="18"/>
+                  <w:lang w:eastAsia="en-US"/>
+                </w:rPr>
+                <w:t>1</w:t>
+              </w:r>
+              <w:r>
+                <w:rPr>
+                  <w:rFonts w:cs="Arial"/>
+                  <w:szCs w:val="18"/>
+                  <w:lang w:eastAsia="en-US"/>
+                </w:rPr>
+                <w:t>/202</w:t>
+              </w:r>
+              <w:r>
+                <w:rPr>
+                  <w:rFonts w:cs="Arial"/>
+                  <w:szCs w:val="18"/>
+                  <w:lang w:eastAsia="en-US"/>
+                </w:rPr>
+                <w:t>6</w:t>
               </w:r>
             </w:p>
           </w:sdtContent>
@@ -7738,7 +7763,7 @@
     <w:charset w:val="00"/>
     <w:family w:val="swiss"/>
     <w:pitch w:val="variable"/>
-    <w:sig w:usb0="E4002EFF" w:usb1="C000247B" w:usb2="00000009" w:usb3="00000000" w:csb0="000001FF" w:csb1="00000000"/>
+    <w:sig w:usb0="E4002EFF" w:usb1="C200247B" w:usb2="00000009" w:usb3="00000000" w:csb0="000001FF" w:csb1="00000000"/>
   </w:font>
   <w:font w:name="Tahoma">
     <w:panose1 w:val="020B0604030504040204"/>
@@ -7766,7 +7791,7 @@
     <w:charset w:val="00"/>
     <w:family w:val="swiss"/>
     <w:pitch w:val="variable"/>
-    <w:sig w:usb0="E4002EFF" w:usb1="C000247B" w:usb2="00000009" w:usb3="00000000" w:csb0="000001FF" w:csb1="00000000"/>
+    <w:sig w:usb0="E4002EFF" w:usb1="C200247B" w:usb2="00000009" w:usb3="00000000" w:csb0="000001FF" w:csb1="00000000"/>
   </w:font>
 </w:fonts>
 </file>
@@ -7798,6 +7823,7 @@
     <w:rsid w:val="003259A4"/>
     <w:rsid w:val="003E4E0E"/>
     <w:rsid w:val="004A3B91"/>
+    <w:rsid w:val="004C00D8"/>
     <w:rsid w:val="0054019A"/>
     <w:rsid w:val="00596E3A"/>
     <w:rsid w:val="005A3F1B"/>
@@ -7826,6 +7852,7 @@
     <w:rsid w:val="00DB4639"/>
     <w:rsid w:val="00E17E2D"/>
     <w:rsid w:val="00E40FFF"/>
+    <w:rsid w:val="00EB500B"/>
     <w:rsid w:val="00EC264E"/>
     <w:rsid w:val="00F04089"/>
     <w:rsid w:val="00F349D7"/>
@@ -8597,10 +8624,6 @@
 </file>
 
 <file path=customXml/item1.xml><?xml version="1.0" encoding="utf-8"?>
-<b:Sources xmlns:b="http://schemas.openxmlformats.org/officeDocument/2006/bibliography" xmlns="http://schemas.openxmlformats.org/officeDocument/2006/bibliography" SelectedStyle="\APA.XSL" StyleName="APA"/>
-</file>
-
-<file path=customXml/item2.xml><?xml version="1.0" encoding="utf-8"?>
 <p:properties xmlns:p="http://schemas.microsoft.com/office/2006/metadata/properties" xmlns:xsi="http://www.w3.org/2001/XMLSchema-instance" xmlns:pc="http://schemas.microsoft.com/office/infopath/2007/PartnerControls">
   <documentManagement>
     <lcf76f155ced4ddcb4097134ff3c332f xmlns="b295003c-aa87-407e-9024-fdee4e88f6fa">
@@ -8610,7 +8633,7 @@
 </p:properties>
 </file>
 
-<file path=customXml/item3.xml><?xml version="1.0" encoding="utf-8"?>
+<file path=customXml/item2.xml><?xml version="1.0" encoding="utf-8"?>
 <?mso-contentType ?>
 <FormTemplates xmlns="http://schemas.microsoft.com/sharepoint/v3/contenttype/forms">
   <Display>DocumentLibraryForm</Display>
@@ -8619,7 +8642,7 @@
 </FormTemplates>
 </file>
 
-<file path=customXml/item4.xml><?xml version="1.0" encoding="utf-8"?>
+<file path=customXml/item3.xml><?xml version="1.0" encoding="utf-8"?>
 <ct:contentTypeSchema xmlns:ct="http://schemas.microsoft.com/office/2006/metadata/contentType" xmlns:ma="http://schemas.microsoft.com/office/2006/metadata/properties/metaAttributes" ct:_="" ma:_="" ma:contentTypeName="Document" ma:contentTypeID="0x010100A3FA4CB5114F4B43B99F0B6DC8751D90" ma:contentTypeVersion="10" ma:contentTypeDescription="Crée un document." ma:contentTypeScope="" ma:versionID="501205be520febb413c56432ff8e6df1">
   <xsd:schema xmlns:xsd="http://www.w3.org/2001/XMLSchema" xmlns:xs="http://www.w3.org/2001/XMLSchema" xmlns:p="http://schemas.microsoft.com/office/2006/metadata/properties" xmlns:ns2="b295003c-aa87-407e-9024-fdee4e88f6fa" targetNamespace="http://schemas.microsoft.com/office/2006/metadata/properties" ma:root="true" ma:fieldsID="0378f5bf275aa5e8e5bb75b38d3da7db" ns2:_="">
     <xsd:import namespace="b295003c-aa87-407e-9024-fdee4e88f6fa"/>
@@ -8797,15 +8820,11 @@
 </ct:contentTypeSchema>
 </file>
 
-<file path=customXml/itemProps1.xml><?xml version="1.0" encoding="utf-8"?>
-<ds:datastoreItem xmlns:ds="http://schemas.openxmlformats.org/officeDocument/2006/customXml" ds:itemID="{0FF0F878-5F0F-460C-9013-40E72731A637}">
-  <ds:schemaRefs>
-    <ds:schemaRef ds:uri="http://schemas.openxmlformats.org/officeDocument/2006/bibliography"/>
-  </ds:schemaRefs>
-</ds:datastoreItem>
+<file path=customXml/item4.xml><?xml version="1.0" encoding="utf-8"?>
+<b:Sources xmlns:b="http://schemas.openxmlformats.org/officeDocument/2006/bibliography" xmlns="http://schemas.openxmlformats.org/officeDocument/2006/bibliography" SelectedStyle="\APA.XSL" StyleName="APA"/>
 </file>
 
-<file path=customXml/itemProps2.xml><?xml version="1.0" encoding="utf-8"?>
+<file path=customXml/itemProps1.xml><?xml version="1.0" encoding="utf-8"?>
 <ds:datastoreItem xmlns:ds="http://schemas.openxmlformats.org/officeDocument/2006/customXml" ds:itemID="{1159403A-C237-488E-8C5E-DABF9FCE7043}">
   <ds:schemaRefs>
     <ds:schemaRef ds:uri="http://schemas.microsoft.com/office/2006/metadata/properties"/>
@@ -8815,7 +8834,7 @@
 </ds:datastoreItem>
 </file>
 
-<file path=customXml/itemProps3.xml><?xml version="1.0" encoding="utf-8"?>
+<file path=customXml/itemProps2.xml><?xml version="1.0" encoding="utf-8"?>
 <ds:datastoreItem xmlns:ds="http://schemas.openxmlformats.org/officeDocument/2006/customXml" ds:itemID="{EEE2973D-7DD7-4773-855D-5CAD81242BDE}">
   <ds:schemaRefs>
     <ds:schemaRef ds:uri="http://schemas.microsoft.com/sharepoint/v3/contenttype/forms"/>
@@ -8823,7 +8842,7 @@
 </ds:datastoreItem>
 </file>
 
-<file path=customXml/itemProps4.xml><?xml version="1.0" encoding="utf-8"?>
+<file path=customXml/itemProps3.xml><?xml version="1.0" encoding="utf-8"?>
 <ds:datastoreItem xmlns:ds="http://schemas.openxmlformats.org/officeDocument/2006/customXml" ds:itemID="{B747A848-EED6-42A4-AAA3-C39C067A5137}">
   <ds:schemaRefs>
     <ds:schemaRef ds:uri="http://schemas.microsoft.com/office/2006/metadata/contentType"/>
@@ -8839,4 +8858,12 @@
     <ds:schemaRef ds:uri="http://schemas.microsoft.com/internal/obd"/>
   </ds:schemaRefs>
 </ds:datastoreItem>
+</file>
+
+<file path=customXml/itemProps4.xml><?xml version="1.0" encoding="utf-8"?>
+<ds:datastoreItem xmlns:ds="http://schemas.openxmlformats.org/officeDocument/2006/customXml" ds:itemID="{0FF0F878-5F0F-460C-9013-40E72731A637}">
+  <ds:schemaRefs>
+    <ds:schemaRef ds:uri="http://schemas.openxmlformats.org/officeDocument/2006/bibliography"/>
+  </ds:schemaRefs>
+</ds:datastoreItem>
 </file>
</xml_diff>

<commit_message>
correction: refs #7 #8
</commit_message>
<xml_diff>
--- a/assistant complexe.docx
+++ b/assistant complexe.docx
@@ -1,6 +1,6 @@
 
 <file path=word/document.xml><?xml version="1.0" encoding="utf-8"?>
-<w:document xmlns:wpc="http://schemas.microsoft.com/office/word/2010/wordprocessingCanvas" xmlns:cx="http://schemas.microsoft.com/office/drawing/2014/chartex" xmlns:cx1="http://schemas.microsoft.com/office/drawing/2015/9/8/chartex" xmlns:cx2="http://schemas.microsoft.com/office/drawing/2015/10/21/chartex" xmlns:cx3="http://schemas.microsoft.com/office/drawing/2016/5/9/chartex" xmlns:cx4="http://schemas.microsoft.com/office/drawing/2016/5/10/chartex" xmlns:cx5="http://schemas.microsoft.com/office/drawing/2016/5/11/chartex" xmlns:cx6="http://schemas.microsoft.com/office/drawing/2016/5/12/chartex" xmlns:cx7="http://schemas.microsoft.com/office/drawing/2016/5/13/chartex" xmlns:cx8="http://schemas.microsoft.com/office/drawing/2016/5/14/chartex" xmlns:mc="http://schemas.openxmlformats.org/markup-compatibility/2006" xmlns:aink="http://schemas.microsoft.com/office/drawing/2016/ink" xmlns:am3d="http://schemas.microsoft.com/office/drawing/2017/model3d" xmlns:o="urn:schemas-microsoft-com:office:office" xmlns:r="http://schemas.openxmlformats.org/officeDocument/2006/relationships" xmlns:m="http://schemas.openxmlformats.org/officeDocument/2006/math" xmlns:v="urn:schemas-microsoft-com:vml" xmlns:wp14="http://schemas.microsoft.com/office/word/2010/wordprocessingDrawing" xmlns:wp="http://schemas.openxmlformats.org/drawingml/2006/wordprocessingDrawing" xmlns:w10="urn:schemas-microsoft-com:office:word" xmlns:w="http://schemas.openxmlformats.org/wordprocessingml/2006/main" xmlns:w14="http://schemas.microsoft.com/office/word/2010/wordml" xmlns:w15="http://schemas.microsoft.com/office/word/2012/wordml" xmlns:w16cex="http://schemas.microsoft.com/office/word/2018/wordml/cex" xmlns:w16cid="http://schemas.microsoft.com/office/word/2016/wordml/cid" xmlns:w16="http://schemas.microsoft.com/office/word/2018/wordml" xmlns:w16sdtdh="http://schemas.microsoft.com/office/word/2020/wordml/sdtdatahash" xmlns:w16se="http://schemas.microsoft.com/office/word/2015/wordml/symex" xmlns:wpg="http://schemas.microsoft.com/office/word/2010/wordprocessingGroup" xmlns:wpi="http://schemas.microsoft.com/office/word/2010/wordprocessingInk" xmlns:wne="http://schemas.microsoft.com/office/word/2006/wordml" xmlns:wps="http://schemas.microsoft.com/office/word/2010/wordprocessingShape" mc:Ignorable="w14 w15 w16se w16cid w16 w16cex w16sdtdh wp14">
+<w:document xmlns:wpc="http://schemas.microsoft.com/office/word/2010/wordprocessingCanvas" xmlns:cx="http://schemas.microsoft.com/office/drawing/2014/chartex" xmlns:cx1="http://schemas.microsoft.com/office/drawing/2015/9/8/chartex" xmlns:cx2="http://schemas.microsoft.com/office/drawing/2015/10/21/chartex" xmlns:cx3="http://schemas.microsoft.com/office/drawing/2016/5/9/chartex" xmlns:cx4="http://schemas.microsoft.com/office/drawing/2016/5/10/chartex" xmlns:cx5="http://schemas.microsoft.com/office/drawing/2016/5/11/chartex" xmlns:cx6="http://schemas.microsoft.com/office/drawing/2016/5/12/chartex" xmlns:cx7="http://schemas.microsoft.com/office/drawing/2016/5/13/chartex" xmlns:cx8="http://schemas.microsoft.com/office/drawing/2016/5/14/chartex" xmlns:mc="http://schemas.openxmlformats.org/markup-compatibility/2006" xmlns:aink="http://schemas.microsoft.com/office/drawing/2016/ink" xmlns:am3d="http://schemas.microsoft.com/office/drawing/2017/model3d" xmlns:o="urn:schemas-microsoft-com:office:office" xmlns:oel="http://schemas.microsoft.com/office/2019/extlst" xmlns:r="http://schemas.openxmlformats.org/officeDocument/2006/relationships" xmlns:m="http://schemas.openxmlformats.org/officeDocument/2006/math" xmlns:v="urn:schemas-microsoft-com:vml" xmlns:wp14="http://schemas.microsoft.com/office/word/2010/wordprocessingDrawing" xmlns:wp="http://schemas.openxmlformats.org/drawingml/2006/wordprocessingDrawing" xmlns:w10="urn:schemas-microsoft-com:office:word" xmlns:w="http://schemas.openxmlformats.org/wordprocessingml/2006/main" xmlns:w14="http://schemas.microsoft.com/office/word/2010/wordml" xmlns:w15="http://schemas.microsoft.com/office/word/2012/wordml" xmlns:w16cex="http://schemas.microsoft.com/office/word/2018/wordml/cex" xmlns:w16cid="http://schemas.microsoft.com/office/word/2016/wordml/cid" xmlns:w16="http://schemas.microsoft.com/office/word/2018/wordml" xmlns:w16du="http://schemas.microsoft.com/office/word/2023/wordml/word16du" xmlns:w16sdtdh="http://schemas.microsoft.com/office/word/2020/wordml/sdtdatahash" xmlns:w16sdtfl="http://schemas.microsoft.com/office/word/2024/wordml/sdtformatlock" xmlns:w16se="http://schemas.microsoft.com/office/word/2015/wordml/symex" xmlns:wpg="http://schemas.microsoft.com/office/word/2010/wordprocessingGroup" xmlns:wpi="http://schemas.microsoft.com/office/word/2010/wordprocessingInk" xmlns:wne="http://schemas.microsoft.com/office/word/2006/wordml" xmlns:wps="http://schemas.microsoft.com/office/word/2010/wordprocessingShape" mc:Ignorable="w14 w15 w16se w16cid w16 w16cex w16sdtdh w16sdtfl w16du wp14">
   <w:body>
     <w:tbl>
       <w:tblPr>
@@ -187,27 +187,7 @@
                 <w:sz w:val="28"/>
                 <w:szCs w:val="28"/>
               </w:rPr>
-              <w:t>1</w:t>
-            </w:r>
-            <w:r>
-              <w:rPr>
-                <w:rFonts w:ascii="Times New Roman" w:hAnsi="Times New Roman" w:cs="Times New Roman"/>
-                <w:b/>
-                <w:noProof/>
-                <w:sz w:val="28"/>
-                <w:szCs w:val="28"/>
-              </w:rPr>
-              <w:t>.</w:t>
-            </w:r>
-            <w:r>
-              <w:rPr>
-                <w:rFonts w:ascii="Times New Roman" w:hAnsi="Times New Roman" w:cs="Times New Roman"/>
-                <w:b/>
-                <w:noProof/>
-                <w:sz w:val="28"/>
-                <w:szCs w:val="28"/>
-              </w:rPr>
-              <w:t>1</w:t>
+              <w:t>2.1</w:t>
             </w:r>
           </w:p>
         </w:tc>
@@ -430,7 +410,6 @@
                 <w:dataBinding w:prefixMappings="xmlns:ns0='http://schemas.microsoft.com/office/2006/metadata/properties' xmlns:ns1='http://www.w3.org/2001/XMLSchema-instance' xmlns:ns2='http://schemas.microsoft.com/office/infopath/2007/PartnerControls' xmlns:ns3='a1322699-2fbb-4cce-8aba-176c4fa97253' xmlns:ns4='http://schemas.microsoft.com/sharepoint/v3' xmlns:ns5='http://schemas.microsoft.com/sharepoint/v3/fields' xmlns:ns6='f0ff482e-aa3b-417e-9d65-5f4cb2656651' " w:xpath="/ns0:properties[1]/documentManagement[1]/ns3:Version_IGN[1]" w:storeItemID="{1159403A-C237-488E-8C5E-DABF9FCE7043}"/>
                 <w:text/>
               </w:sdtPr>
-              <w:sdtEndPr/>
               <w:sdtContent>
                 <w:r>
                   <w:rPr>
@@ -446,23 +425,7 @@
                     <w:b/>
                     <w:szCs w:val="18"/>
                   </w:rPr>
-                  <w:t>1</w:t>
-                </w:r>
-                <w:r>
-                  <w:rPr>
-                    <w:rFonts w:cs="Arial"/>
-                    <w:b/>
-                    <w:szCs w:val="18"/>
-                  </w:rPr>
-                  <w:t>.</w:t>
-                </w:r>
-                <w:r>
-                  <w:rPr>
-                    <w:rFonts w:cs="Arial"/>
-                    <w:b/>
-                    <w:szCs w:val="18"/>
-                  </w:rPr>
-                  <w:t>1</w:t>
+                  <w:t>2.1</w:t>
                 </w:r>
               </w:sdtContent>
             </w:sdt>
@@ -488,7 +451,6 @@
               <w:calendar w:val="gregorian"/>
             </w:date>
           </w:sdtPr>
-          <w:sdtEndPr/>
           <w:sdtContent>
             <w:tc>
               <w:tcPr>
@@ -922,7 +884,6 @@
                 <w:calendar w:val="gregorian"/>
               </w:date>
             </w:sdtPr>
-            <w:sdtEndPr/>
             <w:sdtContent>
               <w:p>
                 <w:pPr>
@@ -1444,6 +1405,90 @@
                 <w:szCs w:val="18"/>
               </w:rPr>
               <w:t>Adaptation à la version 1.1.1</w:t>
+            </w:r>
+          </w:p>
+        </w:tc>
+      </w:tr>
+      <w:tr>
+        <w:tc>
+          <w:tcPr>
+            <w:tcW w:w="1115" w:type="dxa"/>
+          </w:tcPr>
+          <w:p>
+            <w:pPr>
+              <w:ind w:firstLine="34"/>
+              <w:jc w:val="center"/>
+              <w:rPr>
+                <w:rFonts w:cs="Arial"/>
+                <w:szCs w:val="18"/>
+              </w:rPr>
+            </w:pPr>
+            <w:r>
+              <w:rPr>
+                <w:rFonts w:cs="Arial"/>
+                <w:szCs w:val="18"/>
+              </w:rPr>
+              <w:t>1.2.1</w:t>
+            </w:r>
+          </w:p>
+        </w:tc>
+        <w:tc>
+          <w:tcPr>
+            <w:tcW w:w="1514" w:type="dxa"/>
+          </w:tcPr>
+          <w:p>
+            <w:pPr>
+              <w:rPr>
+                <w:rFonts w:cs="Arial"/>
+                <w:szCs w:val="18"/>
+              </w:rPr>
+            </w:pPr>
+            <w:r>
+              <w:rPr>
+                <w:rFonts w:cs="Arial"/>
+                <w:szCs w:val="18"/>
+              </w:rPr>
+              <w:t>09/04/2026</w:t>
+            </w:r>
+          </w:p>
+        </w:tc>
+        <w:tc>
+          <w:tcPr>
+            <w:tcW w:w="2472" w:type="dxa"/>
+          </w:tcPr>
+          <w:p>
+            <w:pPr>
+              <w:rPr>
+                <w:rFonts w:cs="Arial"/>
+                <w:szCs w:val="18"/>
+              </w:rPr>
+            </w:pPr>
+            <w:r>
+              <w:rPr>
+                <w:rFonts w:cs="Arial"/>
+                <w:szCs w:val="18"/>
+              </w:rPr>
+              <w:t>Gérôme PECHEUR</w:t>
+            </w:r>
+          </w:p>
+        </w:tc>
+        <w:tc>
+          <w:tcPr>
+            <w:tcW w:w="4771" w:type="dxa"/>
+          </w:tcPr>
+          <w:p>
+            <w:pPr>
+              <w:rPr>
+                <w:rFonts w:cs="Arial"/>
+                <w:szCs w:val="18"/>
+              </w:rPr>
+            </w:pPr>
+            <w:r>
+              <w:rPr>
+                <w:rFonts w:cs="Arial"/>
+                <w:szCs w:val="18"/>
+              </w:rPr>
+              <w:t>Adaptation à la version 1.2.1</w:t>
             </w:r>
           </w:p>
         </w:tc>
@@ -2459,7 +2504,15 @@
         <w:t xml:space="preserve"> (minimum)</w:t>
       </w:r>
       <w:r>
-        <w:t xml:space="preserve"> auquel il fait accès pour modifier la BDTopo.</w:t>
+        <w:t xml:space="preserve"> auquel il fait accès pour modifier la </w:t>
+      </w:r>
+      <w:proofErr w:type="spellStart"/>
+      <w:r>
+        <w:t>BDTopo</w:t>
+      </w:r>
+      <w:proofErr w:type="spellEnd"/>
+      <w:r>
+        <w:t>.</w:t>
       </w:r>
     </w:p>
     <w:p>
@@ -2476,20 +2529,70 @@
       <w:r>
         <w:t xml:space="preserve">ouche </w:t>
       </w:r>
-      <w:r>
-        <w:t xml:space="preserve">troncon_de_route  éditable </w:t>
-      </w:r>
-      <w:r>
-        <w:t>de la BDTopo</w:t>
-      </w:r>
-      <w:r>
-        <w:t xml:space="preserve"> que l’on trouve dans les guichet en écriture directe BDTopo </w:t>
-      </w:r>
-      <w:r>
-        <w:t xml:space="preserve">‘sdis formation’, </w:t>
-      </w:r>
-      <w:r>
-        <w:t>‘sdis découverte’ et ‘sdis expert’.</w:t>
+      <w:proofErr w:type="spellStart"/>
+      <w:r>
+        <w:t>troncon_de_</w:t>
+      </w:r>
+      <w:proofErr w:type="gramStart"/>
+      <w:r>
+        <w:t>route</w:t>
+      </w:r>
+      <w:proofErr w:type="spellEnd"/>
+      <w:r>
+        <w:t>  éditable</w:t>
+      </w:r>
+      <w:proofErr w:type="gramEnd"/>
+      <w:r>
+        <w:t xml:space="preserve"> </w:t>
+      </w:r>
+      <w:r>
+        <w:t xml:space="preserve">de la </w:t>
+      </w:r>
+      <w:proofErr w:type="spellStart"/>
+      <w:r>
+        <w:t>BDTopo</w:t>
+      </w:r>
+      <w:proofErr w:type="spellEnd"/>
+      <w:r>
+        <w:t xml:space="preserve"> que l’on trouve dans les guichet en écriture directe </w:t>
+      </w:r>
+      <w:proofErr w:type="spellStart"/>
+      <w:r>
+        <w:t>BDTopo</w:t>
+      </w:r>
+      <w:proofErr w:type="spellEnd"/>
+      <w:r>
+        <w:t xml:space="preserve"> </w:t>
+      </w:r>
+      <w:r>
+        <w:t>‘</w:t>
+      </w:r>
+      <w:proofErr w:type="spellStart"/>
+      <w:r>
+        <w:t>sdis</w:t>
+      </w:r>
+      <w:proofErr w:type="spellEnd"/>
+      <w:r>
+        <w:t xml:space="preserve"> formation’, </w:t>
+      </w:r>
+      <w:r>
+        <w:t>‘</w:t>
+      </w:r>
+      <w:proofErr w:type="spellStart"/>
+      <w:r>
+        <w:t>sdis</w:t>
+      </w:r>
+      <w:proofErr w:type="spellEnd"/>
+      <w:r>
+        <w:t xml:space="preserve"> découverte’ et ‘</w:t>
+      </w:r>
+      <w:proofErr w:type="spellStart"/>
+      <w:r>
+        <w:t>sdis</w:t>
+      </w:r>
+      <w:proofErr w:type="spellEnd"/>
+      <w:r>
+        <w:t xml:space="preserve"> expert’.</w:t>
       </w:r>
     </w:p>
     <w:p>
@@ -2501,7 +2604,39 @@
         </w:numPr>
       </w:pPr>
       <w:r>
-        <w:t>Package openpyxl (voir installation en annexe à la fin de ce document).</w:t>
+        <w:t xml:space="preserve">Package </w:t>
+      </w:r>
+      <w:proofErr w:type="spellStart"/>
+      <w:r>
+        <w:t>openpyxl</w:t>
+      </w:r>
+      <w:proofErr w:type="spellEnd"/>
+      <w:r>
+        <w:t xml:space="preserve"> (voir installation en annexe à la fin de ce document).</w:t>
+      </w:r>
+    </w:p>
+    <w:p>
+      <w:pPr>
+        <w:pStyle w:val="Paragraphedeliste"/>
+        <w:numPr>
+          <w:ilvl w:val="0"/>
+          <w:numId w:val="10"/>
+        </w:numPr>
+      </w:pPr>
+      <w:r>
+        <w:t>Le plugin « maitre » doit préalablement être installé</w:t>
+      </w:r>
+    </w:p>
+    <w:p>
+      <w:pPr>
+        <w:pStyle w:val="Paragraphedeliste"/>
+        <w:numPr>
+          <w:ilvl w:val="0"/>
+          <w:numId w:val="10"/>
+        </w:numPr>
+      </w:pPr>
+      <w:r>
+        <w:t>Le plugin « chemin le plus court » doit aussi être installé pour utiliser ses fonctionnalités.</w:t>
       </w:r>
     </w:p>
     <w:p/>
@@ -2525,12 +2660,44 @@
     <w:p/>
     <w:p>
       <w:r>
-        <w:t>Rappel des spécifications de la BDTopo :</w:t>
-      </w:r>
-    </w:p>
-    <w:p>
-      <w:r>
-        <w:t>Le numéro ou le nom des routes (départementales, autoroutes, nationales, intercommunales, communales, chemins ruraux) est affiché dans les tronçons de route (CPX_Numéro, CPX_Numéro de route européenne, CPX_Toponyme route nommée)</w:t>
+        <w:t xml:space="preserve">Rappel des spécifications de la </w:t>
+      </w:r>
+      <w:proofErr w:type="spellStart"/>
+      <w:r>
+        <w:t>BDTopo</w:t>
+      </w:r>
+      <w:proofErr w:type="spellEnd"/>
+      <w:r>
+        <w:t> :</w:t>
+      </w:r>
+    </w:p>
+    <w:p>
+      <w:r>
+        <w:t>Le numéro ou le nom des routes (départementales, autoroutes, nationales, intercommunales, communales, chemins ruraux) est affiché dans les tronçons de route (</w:t>
+      </w:r>
+      <w:proofErr w:type="spellStart"/>
+      <w:r>
+        <w:t>CPX_Numéro</w:t>
+      </w:r>
+      <w:proofErr w:type="spellEnd"/>
+      <w:r>
+        <w:t xml:space="preserve">, </w:t>
+      </w:r>
+      <w:proofErr w:type="spellStart"/>
+      <w:r>
+        <w:t>CPX_Numéro</w:t>
+      </w:r>
+      <w:proofErr w:type="spellEnd"/>
+      <w:r>
+        <w:t xml:space="preserve"> de route européenne, </w:t>
+      </w:r>
+      <w:proofErr w:type="spellStart"/>
+      <w:r>
+        <w:t>CPX_Toponyme</w:t>
+      </w:r>
+      <w:proofErr w:type="spellEnd"/>
+      <w:r>
+        <w:t xml:space="preserve"> route nommée)</w:t>
       </w:r>
       <w:r>
         <w:t xml:space="preserve"> mais ces routes numérotées ou nommées sont gérées par des objets Route numérotées ou nommées.</w:t>
@@ -2553,8 +2720,16 @@
           <w:rPr>
             <w:rStyle w:val="Lienhypertexte"/>
           </w:rPr>
-          <w:t>spécifications BDTopo</w:t>
+          <w:t xml:space="preserve">spécifications </w:t>
         </w:r>
+        <w:proofErr w:type="spellStart"/>
+        <w:r>
+          <w:rPr>
+            <w:rStyle w:val="Lienhypertexte"/>
+          </w:rPr>
+          <w:t>BDTopo</w:t>
+        </w:r>
+        <w:proofErr w:type="spellEnd"/>
       </w:hyperlink>
       <w:r>
         <w:t>.</w:t>
@@ -3376,7 +3551,15 @@
         <w:t>l’interface affiche la liste des complexes associés</w:t>
       </w:r>
       <w:r>
-        <w:t xml:space="preserve"> si ils sont dans l’emprise du projet</w:t>
+        <w:t xml:space="preserve"> </w:t>
+      </w:r>
+      <w:proofErr w:type="gramStart"/>
+      <w:r>
+        <w:t>si ils</w:t>
+      </w:r>
+      <w:proofErr w:type="gramEnd"/>
+      <w:r>
+        <w:t xml:space="preserve"> sont dans l’emprise du projet</w:t>
       </w:r>
       <w:r>
         <w:t>.</w:t>
@@ -3766,8 +3949,21 @@
         <w:t xml:space="preserve"> lorsqu’on enregistrera les modifications</w:t>
       </w:r>
       <w:r>
-        <w:t xml:space="preserve"> par l’outil natif de QGis (disquette)   </w:t>
-      </w:r>
+        <w:t xml:space="preserve"> par l’outil natif de </w:t>
+      </w:r>
+      <w:proofErr w:type="spellStart"/>
+      <w:r>
+        <w:t>QGis</w:t>
+      </w:r>
+      <w:proofErr w:type="spellEnd"/>
+      <w:r>
+        <w:t xml:space="preserve"> (</w:t>
+      </w:r>
+      <w:proofErr w:type="gramStart"/>
+      <w:r>
+        <w:t xml:space="preserve">disquette)   </w:t>
+      </w:r>
+      <w:proofErr w:type="gramEnd"/>
       <w:r>
         <w:rPr>
           <w:noProof/>
@@ -3914,14 +4110,11 @@
         <w:jc w:val="center"/>
       </w:pPr>
       <w:r>
-        <w:rPr>
-          <w:noProof/>
-        </w:rPr>
         <w:drawing>
-          <wp:inline distT="0" distB="0" distL="0" distR="0" wp14:anchorId="400D2A83" wp14:editId="5359A50B">
-            <wp:extent cx="4429290" cy="1625942"/>
+          <wp:inline distT="0" distB="0" distL="0" distR="0" wp14:anchorId="3F49CAC2" wp14:editId="51E270F2">
+            <wp:extent cx="3105150" cy="3818067"/>
             <wp:effectExtent l="0" t="0" r="0" b="0"/>
-            <wp:docPr id="39" name="Image 39"/>
+            <wp:docPr id="1101342390" name="Image 1" descr="Une image contenant texte, Appareils électroniques, capture d’écran, logiciel&#10;&#10;Le contenu généré par l’IA peut être incorrect."/>
             <wp:cNvGraphicFramePr>
               <a:graphicFrameLocks xmlns:a="http://schemas.openxmlformats.org/drawingml/2006/main" noChangeAspect="1"/>
             </wp:cNvGraphicFramePr>
@@ -3929,17 +4122,11 @@
               <a:graphicData uri="http://schemas.openxmlformats.org/drawingml/2006/picture">
                 <pic:pic xmlns:pic="http://schemas.openxmlformats.org/drawingml/2006/picture">
                   <pic:nvPicPr>
-                    <pic:cNvPr id="39" name="Image 39"/>
+                    <pic:cNvPr id="1101342390" name="Image 1" descr="Une image contenant texte, Appareils électroniques, capture d’écran, logiciel&#10;&#10;Le contenu généré par l’IA peut être incorrect."/>
                     <pic:cNvPicPr/>
                   </pic:nvPicPr>
                   <pic:blipFill>
-                    <a:blip r:embed="rId26">
-                      <a:extLst>
-                        <a:ext uri="{28A0092B-C50C-407E-A947-70E740481C1C}">
-                          <a14:useLocalDpi xmlns:a14="http://schemas.microsoft.com/office/drawing/2010/main" val="0"/>
-                        </a:ext>
-                      </a:extLst>
-                    </a:blip>
+                    <a:blip r:embed="rId26"/>
                     <a:stretch>
                       <a:fillRect/>
                     </a:stretch>
@@ -3947,7 +4134,7 @@
                   <pic:spPr>
                     <a:xfrm>
                       <a:off x="0" y="0"/>
-                      <a:ext cx="4465166" cy="1639112"/>
+                      <a:ext cx="3111651" cy="3826061"/>
                     </a:xfrm>
                     <a:prstGeom prst="rect">
                       <a:avLst/>
@@ -3978,43 +4165,43 @@
     <w:p/>
     <w:p/>
     <w:p/>
+    <w:p>
+      <w:pPr>
+        <w:pStyle w:val="Titre1"/>
+      </w:pPr>
+      <w:bookmarkStart w:id="17" w:name="_Toc204093316"/>
+      <w:r>
+        <w:t>Annexes</w:t>
+      </w:r>
+      <w:bookmarkEnd w:id="17"/>
+    </w:p>
     <w:p/>
-    <w:p/>
-    <w:p/>
-    <w:p/>
-    <w:p/>
-    <w:p/>
-    <w:p/>
-    <w:p/>
-    <w:p/>
-    <w:p/>
-    <w:p/>
-    <w:p/>
-    <w:p/>
-    <w:p>
-      <w:pPr>
-        <w:pStyle w:val="Titre1"/>
-      </w:pPr>
-      <w:bookmarkStart w:id="17" w:name="_Toc204093316"/>
-      <w:r>
-        <w:t>Annexes</w:t>
-      </w:r>
-      <w:bookmarkEnd w:id="17"/>
-    </w:p>
-    <w:p/>
     <w:p>
       <w:pPr>
         <w:pStyle w:val="Titre2"/>
       </w:pPr>
       <w:bookmarkStart w:id="18" w:name="_Toc204093317"/>
       <w:r>
-        <w:t>Package openpyxl</w:t>
+        <w:t xml:space="preserve">Package </w:t>
+      </w:r>
+      <w:proofErr w:type="spellStart"/>
+      <w:r>
+        <w:t>openpyxl</w:t>
       </w:r>
       <w:bookmarkEnd w:id="18"/>
-    </w:p>
-    <w:p>
-      <w:r>
-        <w:t>Si le package « openpyxl » n’est pas installé sur le poste le message d’erreur ci-dessous apparait lors d’une transaction.</w:t>
+      <w:proofErr w:type="spellEnd"/>
+    </w:p>
+    <w:p>
+      <w:r>
+        <w:t>Si le package « </w:t>
+      </w:r>
+      <w:proofErr w:type="spellStart"/>
+      <w:r>
+        <w:t>openpyxl</w:t>
+      </w:r>
+      <w:proofErr w:type="spellEnd"/>
+      <w:r>
+        <w:t> » n’est pas installé sur le poste le message d’erreur ci-dessous apparait lors d’une transaction.</w:t>
       </w:r>
     </w:p>
     <w:p/>
@@ -4215,8 +4402,29 @@
         <w:t>python-qgis-ltr.bat</w:t>
       </w:r>
       <w:r>
-        <w:t xml:space="preserve"> -m pip install openpyxl</w:t>
-      </w:r>
+        <w:t xml:space="preserve"> -m </w:t>
+      </w:r>
+      <w:proofErr w:type="spellStart"/>
+      <w:r>
+        <w:t>pip</w:t>
+      </w:r>
+      <w:proofErr w:type="spellEnd"/>
+      <w:r>
+        <w:t xml:space="preserve"> </w:t>
+      </w:r>
+      <w:proofErr w:type="spellStart"/>
+      <w:r>
+        <w:t>install</w:t>
+      </w:r>
+      <w:proofErr w:type="spellEnd"/>
+      <w:r>
+        <w:t xml:space="preserve"> </w:t>
+      </w:r>
+      <w:proofErr w:type="spellStart"/>
+      <w:r>
+        <w:t>openpyxl</w:t>
+      </w:r>
+      <w:proofErr w:type="spellEnd"/>
     </w:p>
     <w:p>
       <w:pPr>
@@ -4298,7 +4506,7 @@
 </file>
 
 <file path=word/endnotes.xml><?xml version="1.0" encoding="utf-8"?>
-<w:endnotes xmlns:wpc="http://schemas.microsoft.com/office/word/2010/wordprocessingCanvas" xmlns:cx="http://schemas.microsoft.com/office/drawing/2014/chartex" xmlns:cx1="http://schemas.microsoft.com/office/drawing/2015/9/8/chartex" xmlns:cx2="http://schemas.microsoft.com/office/drawing/2015/10/21/chartex" xmlns:cx3="http://schemas.microsoft.com/office/drawing/2016/5/9/chartex" xmlns:cx4="http://schemas.microsoft.com/office/drawing/2016/5/10/chartex" xmlns:cx5="http://schemas.microsoft.com/office/drawing/2016/5/11/chartex" xmlns:cx6="http://schemas.microsoft.com/office/drawing/2016/5/12/chartex" xmlns:cx7="http://schemas.microsoft.com/office/drawing/2016/5/13/chartex" xmlns:cx8="http://schemas.microsoft.com/office/drawing/2016/5/14/chartex" xmlns:mc="http://schemas.openxmlformats.org/markup-compatibility/2006" xmlns:aink="http://schemas.microsoft.com/office/drawing/2016/ink" xmlns:am3d="http://schemas.microsoft.com/office/drawing/2017/model3d" xmlns:o="urn:schemas-microsoft-com:office:office" xmlns:r="http://schemas.openxmlformats.org/officeDocument/2006/relationships" xmlns:m="http://schemas.openxmlformats.org/officeDocument/2006/math" xmlns:v="urn:schemas-microsoft-com:vml" xmlns:wp14="http://schemas.microsoft.com/office/word/2010/wordprocessingDrawing" xmlns:wp="http://schemas.openxmlformats.org/drawingml/2006/wordprocessingDrawing" xmlns:w10="urn:schemas-microsoft-com:office:word" xmlns:w="http://schemas.openxmlformats.org/wordprocessingml/2006/main" xmlns:w14="http://schemas.microsoft.com/office/word/2010/wordml" xmlns:w15="http://schemas.microsoft.com/office/word/2012/wordml" xmlns:w16cex="http://schemas.microsoft.com/office/word/2018/wordml/cex" xmlns:w16cid="http://schemas.microsoft.com/office/word/2016/wordml/cid" xmlns:w16="http://schemas.microsoft.com/office/word/2018/wordml" xmlns:w16sdtdh="http://schemas.microsoft.com/office/word/2020/wordml/sdtdatahash" xmlns:w16se="http://schemas.microsoft.com/office/word/2015/wordml/symex" xmlns:wpg="http://schemas.microsoft.com/office/word/2010/wordprocessingGroup" xmlns:wpi="http://schemas.microsoft.com/office/word/2010/wordprocessingInk" xmlns:wne="http://schemas.microsoft.com/office/word/2006/wordml" xmlns:wps="http://schemas.microsoft.com/office/word/2010/wordprocessingShape" mc:Ignorable="w14 w15 w16se w16cid w16 w16cex w16sdtdh wp14">
+<w:endnotes xmlns:wpc="http://schemas.microsoft.com/office/word/2010/wordprocessingCanvas" xmlns:cx="http://schemas.microsoft.com/office/drawing/2014/chartex" xmlns:cx1="http://schemas.microsoft.com/office/drawing/2015/9/8/chartex" xmlns:cx2="http://schemas.microsoft.com/office/drawing/2015/10/21/chartex" xmlns:cx3="http://schemas.microsoft.com/office/drawing/2016/5/9/chartex" xmlns:cx4="http://schemas.microsoft.com/office/drawing/2016/5/10/chartex" xmlns:cx5="http://schemas.microsoft.com/office/drawing/2016/5/11/chartex" xmlns:cx6="http://schemas.microsoft.com/office/drawing/2016/5/12/chartex" xmlns:cx7="http://schemas.microsoft.com/office/drawing/2016/5/13/chartex" xmlns:cx8="http://schemas.microsoft.com/office/drawing/2016/5/14/chartex" xmlns:mc="http://schemas.openxmlformats.org/markup-compatibility/2006" xmlns:aink="http://schemas.microsoft.com/office/drawing/2016/ink" xmlns:am3d="http://schemas.microsoft.com/office/drawing/2017/model3d" xmlns:o="urn:schemas-microsoft-com:office:office" xmlns:oel="http://schemas.microsoft.com/office/2019/extlst" xmlns:r="http://schemas.openxmlformats.org/officeDocument/2006/relationships" xmlns:m="http://schemas.openxmlformats.org/officeDocument/2006/math" xmlns:v="urn:schemas-microsoft-com:vml" xmlns:wp14="http://schemas.microsoft.com/office/word/2010/wordprocessingDrawing" xmlns:wp="http://schemas.openxmlformats.org/drawingml/2006/wordprocessingDrawing" xmlns:w10="urn:schemas-microsoft-com:office:word" xmlns:w="http://schemas.openxmlformats.org/wordprocessingml/2006/main" xmlns:w14="http://schemas.microsoft.com/office/word/2010/wordml" xmlns:w15="http://schemas.microsoft.com/office/word/2012/wordml" xmlns:w16cex="http://schemas.microsoft.com/office/word/2018/wordml/cex" xmlns:w16cid="http://schemas.microsoft.com/office/word/2016/wordml/cid" xmlns:w16="http://schemas.microsoft.com/office/word/2018/wordml" xmlns:w16du="http://schemas.microsoft.com/office/word/2023/wordml/word16du" xmlns:w16sdtdh="http://schemas.microsoft.com/office/word/2020/wordml/sdtdatahash" xmlns:w16sdtfl="http://schemas.microsoft.com/office/word/2024/wordml/sdtformatlock" xmlns:w16se="http://schemas.microsoft.com/office/word/2015/wordml/symex" xmlns:wpg="http://schemas.microsoft.com/office/word/2010/wordprocessingGroup" xmlns:wpi="http://schemas.microsoft.com/office/word/2010/wordprocessingInk" xmlns:wne="http://schemas.microsoft.com/office/word/2006/wordml" xmlns:wps="http://schemas.microsoft.com/office/word/2010/wordprocessingShape" mc:Ignorable="w14 w15 w16se w16cid w16 w16cex w16sdtdh w16sdtfl w16du wp14">
   <w:endnote w:type="separator" w:id="-1">
     <w:p>
       <w:r>
@@ -4317,7 +4525,7 @@
 </file>
 
 <file path=word/footer1.xml><?xml version="1.0" encoding="utf-8"?>
-<w:ftr xmlns:wpc="http://schemas.microsoft.com/office/word/2010/wordprocessingCanvas" xmlns:cx="http://schemas.microsoft.com/office/drawing/2014/chartex" xmlns:cx1="http://schemas.microsoft.com/office/drawing/2015/9/8/chartex" xmlns:cx2="http://schemas.microsoft.com/office/drawing/2015/10/21/chartex" xmlns:cx3="http://schemas.microsoft.com/office/drawing/2016/5/9/chartex" xmlns:cx4="http://schemas.microsoft.com/office/drawing/2016/5/10/chartex" xmlns:cx5="http://schemas.microsoft.com/office/drawing/2016/5/11/chartex" xmlns:cx6="http://schemas.microsoft.com/office/drawing/2016/5/12/chartex" xmlns:cx7="http://schemas.microsoft.com/office/drawing/2016/5/13/chartex" xmlns:cx8="http://schemas.microsoft.com/office/drawing/2016/5/14/chartex" xmlns:mc="http://schemas.openxmlformats.org/markup-compatibility/2006" xmlns:aink="http://schemas.microsoft.com/office/drawing/2016/ink" xmlns:am3d="http://schemas.microsoft.com/office/drawing/2017/model3d" xmlns:o="urn:schemas-microsoft-com:office:office" xmlns:r="http://schemas.openxmlformats.org/officeDocument/2006/relationships" xmlns:m="http://schemas.openxmlformats.org/officeDocument/2006/math" xmlns:v="urn:schemas-microsoft-com:vml" xmlns:wp14="http://schemas.microsoft.com/office/word/2010/wordprocessingDrawing" xmlns:wp="http://schemas.openxmlformats.org/drawingml/2006/wordprocessingDrawing" xmlns:w10="urn:schemas-microsoft-com:office:word" xmlns:w="http://schemas.openxmlformats.org/wordprocessingml/2006/main" xmlns:w14="http://schemas.microsoft.com/office/word/2010/wordml" xmlns:w15="http://schemas.microsoft.com/office/word/2012/wordml" xmlns:w16cex="http://schemas.microsoft.com/office/word/2018/wordml/cex" xmlns:w16cid="http://schemas.microsoft.com/office/word/2016/wordml/cid" xmlns:w16="http://schemas.microsoft.com/office/word/2018/wordml" xmlns:w16sdtdh="http://schemas.microsoft.com/office/word/2020/wordml/sdtdatahash" xmlns:w16se="http://schemas.microsoft.com/office/word/2015/wordml/symex" xmlns:wpg="http://schemas.microsoft.com/office/word/2010/wordprocessingGroup" xmlns:wpi="http://schemas.microsoft.com/office/word/2010/wordprocessingInk" xmlns:wne="http://schemas.microsoft.com/office/word/2006/wordml" xmlns:wps="http://schemas.microsoft.com/office/word/2010/wordprocessingShape" mc:Ignorable="w14 w15 w16se w16cid w16 w16cex w16sdtdh wp14">
+<w:ftr xmlns:wpc="http://schemas.microsoft.com/office/word/2010/wordprocessingCanvas" xmlns:cx="http://schemas.microsoft.com/office/drawing/2014/chartex" xmlns:cx1="http://schemas.microsoft.com/office/drawing/2015/9/8/chartex" xmlns:cx2="http://schemas.microsoft.com/office/drawing/2015/10/21/chartex" xmlns:cx3="http://schemas.microsoft.com/office/drawing/2016/5/9/chartex" xmlns:cx4="http://schemas.microsoft.com/office/drawing/2016/5/10/chartex" xmlns:cx5="http://schemas.microsoft.com/office/drawing/2016/5/11/chartex" xmlns:cx6="http://schemas.microsoft.com/office/drawing/2016/5/12/chartex" xmlns:cx7="http://schemas.microsoft.com/office/drawing/2016/5/13/chartex" xmlns:cx8="http://schemas.microsoft.com/office/drawing/2016/5/14/chartex" xmlns:mc="http://schemas.openxmlformats.org/markup-compatibility/2006" xmlns:aink="http://schemas.microsoft.com/office/drawing/2016/ink" xmlns:am3d="http://schemas.microsoft.com/office/drawing/2017/model3d" xmlns:o="urn:schemas-microsoft-com:office:office" xmlns:oel="http://schemas.microsoft.com/office/2019/extlst" xmlns:r="http://schemas.openxmlformats.org/officeDocument/2006/relationships" xmlns:m="http://schemas.openxmlformats.org/officeDocument/2006/math" xmlns:v="urn:schemas-microsoft-com:vml" xmlns:wp14="http://schemas.microsoft.com/office/word/2010/wordprocessingDrawing" xmlns:wp="http://schemas.openxmlformats.org/drawingml/2006/wordprocessingDrawing" xmlns:w10="urn:schemas-microsoft-com:office:word" xmlns:w="http://schemas.openxmlformats.org/wordprocessingml/2006/main" xmlns:w14="http://schemas.microsoft.com/office/word/2010/wordml" xmlns:w15="http://schemas.microsoft.com/office/word/2012/wordml" xmlns:w16cex="http://schemas.microsoft.com/office/word/2018/wordml/cex" xmlns:w16cid="http://schemas.microsoft.com/office/word/2016/wordml/cid" xmlns:w16="http://schemas.microsoft.com/office/word/2018/wordml" xmlns:w16du="http://schemas.microsoft.com/office/word/2023/wordml/word16du" xmlns:w16sdtdh="http://schemas.microsoft.com/office/word/2020/wordml/sdtdatahash" xmlns:w16sdtfl="http://schemas.microsoft.com/office/word/2024/wordml/sdtformatlock" xmlns:w16se="http://schemas.microsoft.com/office/word/2015/wordml/symex" xmlns:wpg="http://schemas.microsoft.com/office/word/2010/wordprocessingGroup" xmlns:wpi="http://schemas.microsoft.com/office/word/2010/wordprocessingInk" xmlns:wne="http://schemas.microsoft.com/office/word/2006/wordml" xmlns:wps="http://schemas.microsoft.com/office/word/2010/wordprocessingShape" mc:Ignorable="w14 w15 w16se w16cid w16 w16cex w16sdtdh w16sdtfl w16du wp14">
   <w:tbl>
     <w:tblPr>
       <w:tblW w:w="10228" w:type="dxa"/>
@@ -4526,7 +4734,6 @@
               <w:calendar w:val="gregorian"/>
             </w:date>
           </w:sdtPr>
-          <w:sdtEndPr/>
           <w:sdtContent>
             <w:p>
               <w:pPr>
@@ -4753,7 +4960,7 @@
 </file>
 
 <file path=word/footer2.xml><?xml version="1.0" encoding="utf-8"?>
-<w:ftr xmlns:wpc="http://schemas.microsoft.com/office/word/2010/wordprocessingCanvas" xmlns:cx="http://schemas.microsoft.com/office/drawing/2014/chartex" xmlns:cx1="http://schemas.microsoft.com/office/drawing/2015/9/8/chartex" xmlns:cx2="http://schemas.microsoft.com/office/drawing/2015/10/21/chartex" xmlns:cx3="http://schemas.microsoft.com/office/drawing/2016/5/9/chartex" xmlns:cx4="http://schemas.microsoft.com/office/drawing/2016/5/10/chartex" xmlns:cx5="http://schemas.microsoft.com/office/drawing/2016/5/11/chartex" xmlns:cx6="http://schemas.microsoft.com/office/drawing/2016/5/12/chartex" xmlns:cx7="http://schemas.microsoft.com/office/drawing/2016/5/13/chartex" xmlns:cx8="http://schemas.microsoft.com/office/drawing/2016/5/14/chartex" xmlns:mc="http://schemas.openxmlformats.org/markup-compatibility/2006" xmlns:aink="http://schemas.microsoft.com/office/drawing/2016/ink" xmlns:am3d="http://schemas.microsoft.com/office/drawing/2017/model3d" xmlns:o="urn:schemas-microsoft-com:office:office" xmlns:r="http://schemas.openxmlformats.org/officeDocument/2006/relationships" xmlns:m="http://schemas.openxmlformats.org/officeDocument/2006/math" xmlns:v="urn:schemas-microsoft-com:vml" xmlns:wp14="http://schemas.microsoft.com/office/word/2010/wordprocessingDrawing" xmlns:wp="http://schemas.openxmlformats.org/drawingml/2006/wordprocessingDrawing" xmlns:w10="urn:schemas-microsoft-com:office:word" xmlns:w="http://schemas.openxmlformats.org/wordprocessingml/2006/main" xmlns:w14="http://schemas.microsoft.com/office/word/2010/wordml" xmlns:w15="http://schemas.microsoft.com/office/word/2012/wordml" xmlns:w16cex="http://schemas.microsoft.com/office/word/2018/wordml/cex" xmlns:w16cid="http://schemas.microsoft.com/office/word/2016/wordml/cid" xmlns:w16="http://schemas.microsoft.com/office/word/2018/wordml" xmlns:w16sdtdh="http://schemas.microsoft.com/office/word/2020/wordml/sdtdatahash" xmlns:w16se="http://schemas.microsoft.com/office/word/2015/wordml/symex" xmlns:wpg="http://schemas.microsoft.com/office/word/2010/wordprocessingGroup" xmlns:wpi="http://schemas.microsoft.com/office/word/2010/wordprocessingInk" xmlns:wne="http://schemas.microsoft.com/office/word/2006/wordml" xmlns:wps="http://schemas.microsoft.com/office/word/2010/wordprocessingShape" mc:Ignorable="w14 w15 w16se w16cid w16 w16cex w16sdtdh wp14">
+<w:ftr xmlns:wpc="http://schemas.microsoft.com/office/word/2010/wordprocessingCanvas" xmlns:cx="http://schemas.microsoft.com/office/drawing/2014/chartex" xmlns:cx1="http://schemas.microsoft.com/office/drawing/2015/9/8/chartex" xmlns:cx2="http://schemas.microsoft.com/office/drawing/2015/10/21/chartex" xmlns:cx3="http://schemas.microsoft.com/office/drawing/2016/5/9/chartex" xmlns:cx4="http://schemas.microsoft.com/office/drawing/2016/5/10/chartex" xmlns:cx5="http://schemas.microsoft.com/office/drawing/2016/5/11/chartex" xmlns:cx6="http://schemas.microsoft.com/office/drawing/2016/5/12/chartex" xmlns:cx7="http://schemas.microsoft.com/office/drawing/2016/5/13/chartex" xmlns:cx8="http://schemas.microsoft.com/office/drawing/2016/5/14/chartex" xmlns:mc="http://schemas.openxmlformats.org/markup-compatibility/2006" xmlns:aink="http://schemas.microsoft.com/office/drawing/2016/ink" xmlns:am3d="http://schemas.microsoft.com/office/drawing/2017/model3d" xmlns:o="urn:schemas-microsoft-com:office:office" xmlns:oel="http://schemas.microsoft.com/office/2019/extlst" xmlns:r="http://schemas.openxmlformats.org/officeDocument/2006/relationships" xmlns:m="http://schemas.openxmlformats.org/officeDocument/2006/math" xmlns:v="urn:schemas-microsoft-com:vml" xmlns:wp14="http://schemas.microsoft.com/office/word/2010/wordprocessingDrawing" xmlns:wp="http://schemas.openxmlformats.org/drawingml/2006/wordprocessingDrawing" xmlns:w10="urn:schemas-microsoft-com:office:word" xmlns:w="http://schemas.openxmlformats.org/wordprocessingml/2006/main" xmlns:w14="http://schemas.microsoft.com/office/word/2010/wordml" xmlns:w15="http://schemas.microsoft.com/office/word/2012/wordml" xmlns:w16cex="http://schemas.microsoft.com/office/word/2018/wordml/cex" xmlns:w16cid="http://schemas.microsoft.com/office/word/2016/wordml/cid" xmlns:w16="http://schemas.microsoft.com/office/word/2018/wordml" xmlns:w16du="http://schemas.microsoft.com/office/word/2023/wordml/word16du" xmlns:w16sdtdh="http://schemas.microsoft.com/office/word/2020/wordml/sdtdatahash" xmlns:w16sdtfl="http://schemas.microsoft.com/office/word/2024/wordml/sdtformatlock" xmlns:w16se="http://schemas.microsoft.com/office/word/2015/wordml/symex" xmlns:wpg="http://schemas.microsoft.com/office/word/2010/wordprocessingGroup" xmlns:wpi="http://schemas.microsoft.com/office/word/2010/wordprocessingInk" xmlns:wne="http://schemas.microsoft.com/office/word/2006/wordml" xmlns:wps="http://schemas.microsoft.com/office/word/2010/wordprocessingShape" mc:Ignorable="w14 w15 w16se w16cid w16 w16cex w16sdtdh w16sdtfl w16du wp14">
   <w:p>
     <w:pPr>
       <w:pStyle w:val="Pieddepage"/>
@@ -4801,7 +5008,7 @@
 </file>
 
 <file path=word/footnotes.xml><?xml version="1.0" encoding="utf-8"?>
-<w:footnotes xmlns:wpc="http://schemas.microsoft.com/office/word/2010/wordprocessingCanvas" xmlns:cx="http://schemas.microsoft.com/office/drawing/2014/chartex" xmlns:cx1="http://schemas.microsoft.com/office/drawing/2015/9/8/chartex" xmlns:cx2="http://schemas.microsoft.com/office/drawing/2015/10/21/chartex" xmlns:cx3="http://schemas.microsoft.com/office/drawing/2016/5/9/chartex" xmlns:cx4="http://schemas.microsoft.com/office/drawing/2016/5/10/chartex" xmlns:cx5="http://schemas.microsoft.com/office/drawing/2016/5/11/chartex" xmlns:cx6="http://schemas.microsoft.com/office/drawing/2016/5/12/chartex" xmlns:cx7="http://schemas.microsoft.com/office/drawing/2016/5/13/chartex" xmlns:cx8="http://schemas.microsoft.com/office/drawing/2016/5/14/chartex" xmlns:mc="http://schemas.openxmlformats.org/markup-compatibility/2006" xmlns:aink="http://schemas.microsoft.com/office/drawing/2016/ink" xmlns:am3d="http://schemas.microsoft.com/office/drawing/2017/model3d" xmlns:o="urn:schemas-microsoft-com:office:office" xmlns:r="http://schemas.openxmlformats.org/officeDocument/2006/relationships" xmlns:m="http://schemas.openxmlformats.org/officeDocument/2006/math" xmlns:v="urn:schemas-microsoft-com:vml" xmlns:wp14="http://schemas.microsoft.com/office/word/2010/wordprocessingDrawing" xmlns:wp="http://schemas.openxmlformats.org/drawingml/2006/wordprocessingDrawing" xmlns:w10="urn:schemas-microsoft-com:office:word" xmlns:w="http://schemas.openxmlformats.org/wordprocessingml/2006/main" xmlns:w14="http://schemas.microsoft.com/office/word/2010/wordml" xmlns:w15="http://schemas.microsoft.com/office/word/2012/wordml" xmlns:w16cex="http://schemas.microsoft.com/office/word/2018/wordml/cex" xmlns:w16cid="http://schemas.microsoft.com/office/word/2016/wordml/cid" xmlns:w16="http://schemas.microsoft.com/office/word/2018/wordml" xmlns:w16sdtdh="http://schemas.microsoft.com/office/word/2020/wordml/sdtdatahash" xmlns:w16se="http://schemas.microsoft.com/office/word/2015/wordml/symex" xmlns:wpg="http://schemas.microsoft.com/office/word/2010/wordprocessingGroup" xmlns:wpi="http://schemas.microsoft.com/office/word/2010/wordprocessingInk" xmlns:wne="http://schemas.microsoft.com/office/word/2006/wordml" xmlns:wps="http://schemas.microsoft.com/office/word/2010/wordprocessingShape" mc:Ignorable="w14 w15 w16se w16cid w16 w16cex w16sdtdh wp14">
+<w:footnotes xmlns:wpc="http://schemas.microsoft.com/office/word/2010/wordprocessingCanvas" xmlns:cx="http://schemas.microsoft.com/office/drawing/2014/chartex" xmlns:cx1="http://schemas.microsoft.com/office/drawing/2015/9/8/chartex" xmlns:cx2="http://schemas.microsoft.com/office/drawing/2015/10/21/chartex" xmlns:cx3="http://schemas.microsoft.com/office/drawing/2016/5/9/chartex" xmlns:cx4="http://schemas.microsoft.com/office/drawing/2016/5/10/chartex" xmlns:cx5="http://schemas.microsoft.com/office/drawing/2016/5/11/chartex" xmlns:cx6="http://schemas.microsoft.com/office/drawing/2016/5/12/chartex" xmlns:cx7="http://schemas.microsoft.com/office/drawing/2016/5/13/chartex" xmlns:cx8="http://schemas.microsoft.com/office/drawing/2016/5/14/chartex" xmlns:mc="http://schemas.openxmlformats.org/markup-compatibility/2006" xmlns:aink="http://schemas.microsoft.com/office/drawing/2016/ink" xmlns:am3d="http://schemas.microsoft.com/office/drawing/2017/model3d" xmlns:o="urn:schemas-microsoft-com:office:office" xmlns:oel="http://schemas.microsoft.com/office/2019/extlst" xmlns:r="http://schemas.openxmlformats.org/officeDocument/2006/relationships" xmlns:m="http://schemas.openxmlformats.org/officeDocument/2006/math" xmlns:v="urn:schemas-microsoft-com:vml" xmlns:wp14="http://schemas.microsoft.com/office/word/2010/wordprocessingDrawing" xmlns:wp="http://schemas.openxmlformats.org/drawingml/2006/wordprocessingDrawing" xmlns:w10="urn:schemas-microsoft-com:office:word" xmlns:w="http://schemas.openxmlformats.org/wordprocessingml/2006/main" xmlns:w14="http://schemas.microsoft.com/office/word/2010/wordml" xmlns:w15="http://schemas.microsoft.com/office/word/2012/wordml" xmlns:w16cex="http://schemas.microsoft.com/office/word/2018/wordml/cex" xmlns:w16cid="http://schemas.microsoft.com/office/word/2016/wordml/cid" xmlns:w16="http://schemas.microsoft.com/office/word/2018/wordml" xmlns:w16du="http://schemas.microsoft.com/office/word/2023/wordml/word16du" xmlns:w16sdtdh="http://schemas.microsoft.com/office/word/2020/wordml/sdtdatahash" xmlns:w16sdtfl="http://schemas.microsoft.com/office/word/2024/wordml/sdtformatlock" xmlns:w16se="http://schemas.microsoft.com/office/word/2015/wordml/symex" xmlns:wpg="http://schemas.microsoft.com/office/word/2010/wordprocessingGroup" xmlns:wpi="http://schemas.microsoft.com/office/word/2010/wordprocessingInk" xmlns:wne="http://schemas.microsoft.com/office/word/2006/wordml" xmlns:wps="http://schemas.microsoft.com/office/word/2010/wordprocessingShape" mc:Ignorable="w14 w15 w16se w16cid w16 w16cex w16sdtdh w16sdtfl w16du wp14">
   <w:footnote w:type="separator" w:id="-1">
     <w:p>
       <w:r>
@@ -4820,7 +5027,7 @@
 </file>
 
 <file path=word/numbering.xml><?xml version="1.0" encoding="utf-8"?>
-<w:numbering xmlns:wpc="http://schemas.microsoft.com/office/word/2010/wordprocessingCanvas" xmlns:cx="http://schemas.microsoft.com/office/drawing/2014/chartex" xmlns:cx1="http://schemas.microsoft.com/office/drawing/2015/9/8/chartex" xmlns:cx2="http://schemas.microsoft.com/office/drawing/2015/10/21/chartex" xmlns:cx3="http://schemas.microsoft.com/office/drawing/2016/5/9/chartex" xmlns:cx4="http://schemas.microsoft.com/office/drawing/2016/5/10/chartex" xmlns:cx5="http://schemas.microsoft.com/office/drawing/2016/5/11/chartex" xmlns:cx6="http://schemas.microsoft.com/office/drawing/2016/5/12/chartex" xmlns:cx7="http://schemas.microsoft.com/office/drawing/2016/5/13/chartex" xmlns:cx8="http://schemas.microsoft.com/office/drawing/2016/5/14/chartex" xmlns:mc="http://schemas.openxmlformats.org/markup-compatibility/2006" xmlns:aink="http://schemas.microsoft.com/office/drawing/2016/ink" xmlns:am3d="http://schemas.microsoft.com/office/drawing/2017/model3d" xmlns:o="urn:schemas-microsoft-com:office:office" xmlns:r="http://schemas.openxmlformats.org/officeDocument/2006/relationships" xmlns:m="http://schemas.openxmlformats.org/officeDocument/2006/math" xmlns:v="urn:schemas-microsoft-com:vml" xmlns:wp14="http://schemas.microsoft.com/office/word/2010/wordprocessingDrawing" xmlns:wp="http://schemas.openxmlformats.org/drawingml/2006/wordprocessingDrawing" xmlns:w10="urn:schemas-microsoft-com:office:word" xmlns:w="http://schemas.openxmlformats.org/wordprocessingml/2006/main" xmlns:w14="http://schemas.microsoft.com/office/word/2010/wordml" xmlns:w15="http://schemas.microsoft.com/office/word/2012/wordml" xmlns:w16cex="http://schemas.microsoft.com/office/word/2018/wordml/cex" xmlns:w16cid="http://schemas.microsoft.com/office/word/2016/wordml/cid" xmlns:w16="http://schemas.microsoft.com/office/word/2018/wordml" xmlns:w16sdtdh="http://schemas.microsoft.com/office/word/2020/wordml/sdtdatahash" xmlns:w16se="http://schemas.microsoft.com/office/word/2015/wordml/symex" xmlns:wpg="http://schemas.microsoft.com/office/word/2010/wordprocessingGroup" xmlns:wpi="http://schemas.microsoft.com/office/word/2010/wordprocessingInk" xmlns:wne="http://schemas.microsoft.com/office/word/2006/wordml" xmlns:wps="http://schemas.microsoft.com/office/word/2010/wordprocessingShape" mc:Ignorable="w14 w15 w16se w16cid w16 w16cex w16sdtdh wp14">
+<w:numbering xmlns:wpc="http://schemas.microsoft.com/office/word/2010/wordprocessingCanvas" xmlns:cx="http://schemas.microsoft.com/office/drawing/2014/chartex" xmlns:cx1="http://schemas.microsoft.com/office/drawing/2015/9/8/chartex" xmlns:cx2="http://schemas.microsoft.com/office/drawing/2015/10/21/chartex" xmlns:cx3="http://schemas.microsoft.com/office/drawing/2016/5/9/chartex" xmlns:cx4="http://schemas.microsoft.com/office/drawing/2016/5/10/chartex" xmlns:cx5="http://schemas.microsoft.com/office/drawing/2016/5/11/chartex" xmlns:cx6="http://schemas.microsoft.com/office/drawing/2016/5/12/chartex" xmlns:cx7="http://schemas.microsoft.com/office/drawing/2016/5/13/chartex" xmlns:cx8="http://schemas.microsoft.com/office/drawing/2016/5/14/chartex" xmlns:mc="http://schemas.openxmlformats.org/markup-compatibility/2006" xmlns:aink="http://schemas.microsoft.com/office/drawing/2016/ink" xmlns:am3d="http://schemas.microsoft.com/office/drawing/2017/model3d" xmlns:o="urn:schemas-microsoft-com:office:office" xmlns:oel="http://schemas.microsoft.com/office/2019/extlst" xmlns:r="http://schemas.openxmlformats.org/officeDocument/2006/relationships" xmlns:m="http://schemas.openxmlformats.org/officeDocument/2006/math" xmlns:v="urn:schemas-microsoft-com:vml" xmlns:wp14="http://schemas.microsoft.com/office/word/2010/wordprocessingDrawing" xmlns:wp="http://schemas.openxmlformats.org/drawingml/2006/wordprocessingDrawing" xmlns:w10="urn:schemas-microsoft-com:office:word" xmlns:w="http://schemas.openxmlformats.org/wordprocessingml/2006/main" xmlns:w14="http://schemas.microsoft.com/office/word/2010/wordml" xmlns:w15="http://schemas.microsoft.com/office/word/2012/wordml" xmlns:w16cex="http://schemas.microsoft.com/office/word/2018/wordml/cex" xmlns:w16cid="http://schemas.microsoft.com/office/word/2016/wordml/cid" xmlns:w16="http://schemas.microsoft.com/office/word/2018/wordml" xmlns:w16du="http://schemas.microsoft.com/office/word/2023/wordml/word16du" xmlns:w16sdtdh="http://schemas.microsoft.com/office/word/2020/wordml/sdtdatahash" xmlns:w16sdtfl="http://schemas.microsoft.com/office/word/2024/wordml/sdtformatlock" xmlns:w16se="http://schemas.microsoft.com/office/word/2015/wordml/symex" xmlns:wpg="http://schemas.microsoft.com/office/word/2010/wordprocessingGroup" xmlns:wpi="http://schemas.microsoft.com/office/word/2010/wordprocessingInk" xmlns:wne="http://schemas.microsoft.com/office/word/2006/wordml" xmlns:wps="http://schemas.microsoft.com/office/word/2010/wordprocessingShape" mc:Ignorable="w14 w15 w16se w16cid w16 w16cex w16sdtdh w16sdtfl w16du wp14">
   <w:abstractNum w:abstractNumId="0" w15:restartNumberingAfterBreak="0">
     <w:nsid w:val="2A192A7F"/>
     <w:multiLevelType w:val="multilevel"/>
@@ -5950,34 +6157,34 @@
       </w:rPr>
     </w:lvl>
   </w:abstractNum>
-  <w:num w:numId="1">
+  <w:num w:numId="1" w16cid:durableId="963081492">
     <w:abstractNumId w:val="6"/>
   </w:num>
-  <w:num w:numId="2">
+  <w:num w:numId="2" w16cid:durableId="1183276220">
     <w:abstractNumId w:val="0"/>
   </w:num>
-  <w:num w:numId="3">
+  <w:num w:numId="3" w16cid:durableId="62532531">
     <w:abstractNumId w:val="1"/>
   </w:num>
-  <w:num w:numId="4">
+  <w:num w:numId="4" w16cid:durableId="692729446">
     <w:abstractNumId w:val="0"/>
   </w:num>
-  <w:num w:numId="5">
+  <w:num w:numId="5" w16cid:durableId="414977165">
     <w:abstractNumId w:val="3"/>
   </w:num>
-  <w:num w:numId="6">
+  <w:num w:numId="6" w16cid:durableId="993148183">
     <w:abstractNumId w:val="2"/>
   </w:num>
-  <w:num w:numId="7">
+  <w:num w:numId="7" w16cid:durableId="1736123851">
     <w:abstractNumId w:val="8"/>
   </w:num>
-  <w:num w:numId="8">
+  <w:num w:numId="8" w16cid:durableId="1425110354">
     <w:abstractNumId w:val="4"/>
   </w:num>
-  <w:num w:numId="9">
+  <w:num w:numId="9" w16cid:durableId="1655723463">
     <w:abstractNumId w:val="7"/>
   </w:num>
-  <w:num w:numId="10">
+  <w:num w:numId="10" w16cid:durableId="717583251">
     <w:abstractNumId w:val="5"/>
   </w:num>
   <w:numIdMacAtCleanup w:val="6"/>
@@ -5985,7 +6192,7 @@
 </file>
 
 <file path=word/styles.xml><?xml version="1.0" encoding="utf-8"?>
-<w:styles xmlns:mc="http://schemas.openxmlformats.org/markup-compatibility/2006" xmlns:r="http://schemas.openxmlformats.org/officeDocument/2006/relationships" xmlns:w="http://schemas.openxmlformats.org/wordprocessingml/2006/main" xmlns:w14="http://schemas.microsoft.com/office/word/2010/wordml" xmlns:w15="http://schemas.microsoft.com/office/word/2012/wordml" xmlns:w16cex="http://schemas.microsoft.com/office/word/2018/wordml/cex" xmlns:w16cid="http://schemas.microsoft.com/office/word/2016/wordml/cid" xmlns:w16="http://schemas.microsoft.com/office/word/2018/wordml" xmlns:w16sdtdh="http://schemas.microsoft.com/office/word/2020/wordml/sdtdatahash" xmlns:w16se="http://schemas.microsoft.com/office/word/2015/wordml/symex" mc:Ignorable="w14 w15 w16se w16cid w16 w16cex w16sdtdh">
+<w:styles xmlns:mc="http://schemas.openxmlformats.org/markup-compatibility/2006" xmlns:r="http://schemas.openxmlformats.org/officeDocument/2006/relationships" xmlns:w="http://schemas.openxmlformats.org/wordprocessingml/2006/main" xmlns:w14="http://schemas.microsoft.com/office/word/2010/wordml" xmlns:w15="http://schemas.microsoft.com/office/word/2012/wordml" xmlns:w16cex="http://schemas.microsoft.com/office/word/2018/wordml/cex" xmlns:w16cid="http://schemas.microsoft.com/office/word/2016/wordml/cid" xmlns:w16="http://schemas.microsoft.com/office/word/2018/wordml" xmlns:w16du="http://schemas.microsoft.com/office/word/2023/wordml/word16du" xmlns:w16sdtdh="http://schemas.microsoft.com/office/word/2020/wordml/sdtdatahash" xmlns:w16sdtfl="http://schemas.microsoft.com/office/word/2024/wordml/sdtformatlock" xmlns:w16se="http://schemas.microsoft.com/office/word/2015/wordml/symex" mc:Ignorable="w14 w15 w16se w16cid w16 w16cex w16sdtdh w16sdtfl w16du">
   <w:docDefaults>
     <w:rPrDefault>
       <w:rPr>
@@ -7628,7 +7835,7 @@
 </file>
 
 <file path=word/glossary/document.xml><?xml version="1.0" encoding="utf-8"?>
-<w:glossaryDocument xmlns:wpc="http://schemas.microsoft.com/office/word/2010/wordprocessingCanvas" xmlns:cx="http://schemas.microsoft.com/office/drawing/2014/chartex" xmlns:cx1="http://schemas.microsoft.com/office/drawing/2015/9/8/chartex" xmlns:cx2="http://schemas.microsoft.com/office/drawing/2015/10/21/chartex" xmlns:cx3="http://schemas.microsoft.com/office/drawing/2016/5/9/chartex" xmlns:cx4="http://schemas.microsoft.com/office/drawing/2016/5/10/chartex" xmlns:cx5="http://schemas.microsoft.com/office/drawing/2016/5/11/chartex" xmlns:cx6="http://schemas.microsoft.com/office/drawing/2016/5/12/chartex" xmlns:cx7="http://schemas.microsoft.com/office/drawing/2016/5/13/chartex" xmlns:cx8="http://schemas.microsoft.com/office/drawing/2016/5/14/chartex" xmlns:mc="http://schemas.openxmlformats.org/markup-compatibility/2006" xmlns:aink="http://schemas.microsoft.com/office/drawing/2016/ink" xmlns:am3d="http://schemas.microsoft.com/office/drawing/2017/model3d" xmlns:o="urn:schemas-microsoft-com:office:office" xmlns:r="http://schemas.openxmlformats.org/officeDocument/2006/relationships" xmlns:m="http://schemas.openxmlformats.org/officeDocument/2006/math" xmlns:v="urn:schemas-microsoft-com:vml" xmlns:wp14="http://schemas.microsoft.com/office/word/2010/wordprocessingDrawing" xmlns:wp="http://schemas.openxmlformats.org/drawingml/2006/wordprocessingDrawing" xmlns:w10="urn:schemas-microsoft-com:office:word" xmlns:w="http://schemas.openxmlformats.org/wordprocessingml/2006/main" xmlns:w14="http://schemas.microsoft.com/office/word/2010/wordml" xmlns:w15="http://schemas.microsoft.com/office/word/2012/wordml" xmlns:w16cex="http://schemas.microsoft.com/office/word/2018/wordml/cex" xmlns:w16cid="http://schemas.microsoft.com/office/word/2016/wordml/cid" xmlns:w16="http://schemas.microsoft.com/office/word/2018/wordml" xmlns:w16sdtdh="http://schemas.microsoft.com/office/word/2020/wordml/sdtdatahash" xmlns:w16se="http://schemas.microsoft.com/office/word/2015/wordml/symex" xmlns:wpg="http://schemas.microsoft.com/office/word/2010/wordprocessingGroup" xmlns:wpi="http://schemas.microsoft.com/office/word/2010/wordprocessingInk" xmlns:wne="http://schemas.microsoft.com/office/word/2006/wordml" xmlns:wps="http://schemas.microsoft.com/office/word/2010/wordprocessingShape" mc:Ignorable="w14 w15 w16se w16cid w16 w16cex w16sdtdh wp14">
+<w:glossaryDocument xmlns:wpc="http://schemas.microsoft.com/office/word/2010/wordprocessingCanvas" xmlns:cx="http://schemas.microsoft.com/office/drawing/2014/chartex" xmlns:cx1="http://schemas.microsoft.com/office/drawing/2015/9/8/chartex" xmlns:cx2="http://schemas.microsoft.com/office/drawing/2015/10/21/chartex" xmlns:cx3="http://schemas.microsoft.com/office/drawing/2016/5/9/chartex" xmlns:cx4="http://schemas.microsoft.com/office/drawing/2016/5/10/chartex" xmlns:cx5="http://schemas.microsoft.com/office/drawing/2016/5/11/chartex" xmlns:cx6="http://schemas.microsoft.com/office/drawing/2016/5/12/chartex" xmlns:cx7="http://schemas.microsoft.com/office/drawing/2016/5/13/chartex" xmlns:cx8="http://schemas.microsoft.com/office/drawing/2016/5/14/chartex" xmlns:mc="http://schemas.openxmlformats.org/markup-compatibility/2006" xmlns:aink="http://schemas.microsoft.com/office/drawing/2016/ink" xmlns:am3d="http://schemas.microsoft.com/office/drawing/2017/model3d" xmlns:o="urn:schemas-microsoft-com:office:office" xmlns:oel="http://schemas.microsoft.com/office/2019/extlst" xmlns:r="http://schemas.openxmlformats.org/officeDocument/2006/relationships" xmlns:m="http://schemas.openxmlformats.org/officeDocument/2006/math" xmlns:v="urn:schemas-microsoft-com:vml" xmlns:wp14="http://schemas.microsoft.com/office/word/2010/wordprocessingDrawing" xmlns:wp="http://schemas.openxmlformats.org/drawingml/2006/wordprocessingDrawing" xmlns:w10="urn:schemas-microsoft-com:office:word" xmlns:w="http://schemas.openxmlformats.org/wordprocessingml/2006/main" xmlns:w14="http://schemas.microsoft.com/office/word/2010/wordml" xmlns:w15="http://schemas.microsoft.com/office/word/2012/wordml" xmlns:w16cex="http://schemas.microsoft.com/office/word/2018/wordml/cex" xmlns:w16cid="http://schemas.microsoft.com/office/word/2016/wordml/cid" xmlns:w16="http://schemas.microsoft.com/office/word/2018/wordml" xmlns:w16du="http://schemas.microsoft.com/office/word/2023/wordml/word16du" xmlns:w16sdtdh="http://schemas.microsoft.com/office/word/2020/wordml/sdtdatahash" xmlns:w16sdtfl="http://schemas.microsoft.com/office/word/2024/wordml/sdtformatlock" xmlns:w16se="http://schemas.microsoft.com/office/word/2015/wordml/symex" xmlns:wpg="http://schemas.microsoft.com/office/word/2010/wordprocessingGroup" xmlns:wpi="http://schemas.microsoft.com/office/word/2010/wordprocessingInk" xmlns:wne="http://schemas.microsoft.com/office/word/2006/wordml" xmlns:wps="http://schemas.microsoft.com/office/word/2010/wordprocessingShape" mc:Ignorable="w14 w15 w16se w16cid w16 w16cex w16sdtdh w16sdtfl w16du wp14">
   <w:docParts>
     <w:docPart>
       <w:docPartPr>
@@ -7722,7 +7929,7 @@
 </file>
 
 <file path=word/glossary/fontTable.xml><?xml version="1.0" encoding="utf-8"?>
-<w:fonts xmlns:mc="http://schemas.openxmlformats.org/markup-compatibility/2006" xmlns:r="http://schemas.openxmlformats.org/officeDocument/2006/relationships" xmlns:w="http://schemas.openxmlformats.org/wordprocessingml/2006/main" xmlns:w14="http://schemas.microsoft.com/office/word/2010/wordml" xmlns:w15="http://schemas.microsoft.com/office/word/2012/wordml" xmlns:w16cex="http://schemas.microsoft.com/office/word/2018/wordml/cex" xmlns:w16cid="http://schemas.microsoft.com/office/word/2016/wordml/cid" xmlns:w16="http://schemas.microsoft.com/office/word/2018/wordml" xmlns:w16sdtdh="http://schemas.microsoft.com/office/word/2020/wordml/sdtdatahash" xmlns:w16se="http://schemas.microsoft.com/office/word/2015/wordml/symex" mc:Ignorable="w14 w15 w16se w16cid w16 w16cex w16sdtdh">
+<w:fonts xmlns:mc="http://schemas.openxmlformats.org/markup-compatibility/2006" xmlns:r="http://schemas.openxmlformats.org/officeDocument/2006/relationships" xmlns:w="http://schemas.openxmlformats.org/wordprocessingml/2006/main" xmlns:w14="http://schemas.microsoft.com/office/word/2010/wordml" xmlns:w15="http://schemas.microsoft.com/office/word/2012/wordml" xmlns:w16cex="http://schemas.microsoft.com/office/word/2018/wordml/cex" xmlns:w16cid="http://schemas.microsoft.com/office/word/2016/wordml/cid" xmlns:w16="http://schemas.microsoft.com/office/word/2018/wordml" xmlns:w16du="http://schemas.microsoft.com/office/word/2023/wordml/word16du" xmlns:w16sdtdh="http://schemas.microsoft.com/office/word/2020/wordml/sdtdatahash" xmlns:w16sdtfl="http://schemas.microsoft.com/office/word/2024/wordml/sdtformatlock" xmlns:w16se="http://schemas.microsoft.com/office/word/2015/wordml/symex" mc:Ignorable="w14 w15 w16se w16cid w16 w16cex w16sdtdh w16sdtfl w16du">
   <w:font w:name="Times New Roman">
     <w:panose1 w:val="02020603050405020304"/>
     <w:charset w:val="00"/>
@@ -7797,7 +8004,7 @@
 </file>
 
 <file path=word/glossary/settings.xml><?xml version="1.0" encoding="utf-8"?>
-<w:settings xmlns:mc="http://schemas.openxmlformats.org/markup-compatibility/2006" xmlns:o="urn:schemas-microsoft-com:office:office" xmlns:r="http://schemas.openxmlformats.org/officeDocument/2006/relationships" xmlns:m="http://schemas.openxmlformats.org/officeDocument/2006/math" xmlns:v="urn:schemas-microsoft-com:vml" xmlns:w10="urn:schemas-microsoft-com:office:word" xmlns:w="http://schemas.openxmlformats.org/wordprocessingml/2006/main" xmlns:w14="http://schemas.microsoft.com/office/word/2010/wordml" xmlns:w15="http://schemas.microsoft.com/office/word/2012/wordml" xmlns:w16cex="http://schemas.microsoft.com/office/word/2018/wordml/cex" xmlns:w16cid="http://schemas.microsoft.com/office/word/2016/wordml/cid" xmlns:w16="http://schemas.microsoft.com/office/word/2018/wordml" xmlns:w16sdtdh="http://schemas.microsoft.com/office/word/2020/wordml/sdtdatahash" xmlns:w16se="http://schemas.microsoft.com/office/word/2015/wordml/symex" xmlns:sl="http://schemas.openxmlformats.org/schemaLibrary/2006/main" mc:Ignorable="w14 w15 w16se w16cid w16 w16cex w16sdtdh">
+<w:settings xmlns:mc="http://schemas.openxmlformats.org/markup-compatibility/2006" xmlns:o="urn:schemas-microsoft-com:office:office" xmlns:r="http://schemas.openxmlformats.org/officeDocument/2006/relationships" xmlns:m="http://schemas.openxmlformats.org/officeDocument/2006/math" xmlns:v="urn:schemas-microsoft-com:vml" xmlns:w10="urn:schemas-microsoft-com:office:word" xmlns:w="http://schemas.openxmlformats.org/wordprocessingml/2006/main" xmlns:w14="http://schemas.microsoft.com/office/word/2010/wordml" xmlns:w15="http://schemas.microsoft.com/office/word/2012/wordml" xmlns:w16cex="http://schemas.microsoft.com/office/word/2018/wordml/cex" xmlns:w16cid="http://schemas.microsoft.com/office/word/2016/wordml/cid" xmlns:w16="http://schemas.microsoft.com/office/word/2018/wordml" xmlns:w16du="http://schemas.microsoft.com/office/word/2023/wordml/word16du" xmlns:w16sdtdh="http://schemas.microsoft.com/office/word/2020/wordml/sdtdatahash" xmlns:w16sdtfl="http://schemas.microsoft.com/office/word/2024/wordml/sdtformatlock" xmlns:w16se="http://schemas.microsoft.com/office/word/2015/wordml/symex" xmlns:sl="http://schemas.openxmlformats.org/schemaLibrary/2006/main" mc:Ignorable="w14 w15 w16se w16cid w16 w16cex w16sdtdh w16sdtfl w16du">
   <w:view w:val="normal"/>
   <w:defaultTabStop w:val="708"/>
   <w:hyphenationZone w:val="425"/>
@@ -7814,6 +8021,7 @@
     <w:rsidRoot w:val="00CA38A7"/>
     <w:rsid w:val="00065F3B"/>
     <w:rsid w:val="000D4DEE"/>
+    <w:rsid w:val="000E56D7"/>
     <w:rsid w:val="00126B47"/>
     <w:rsid w:val="00162DC9"/>
     <w:rsid w:val="001944C2"/>
@@ -7837,6 +8045,7 @@
     <w:rsid w:val="008E3192"/>
     <w:rsid w:val="00A07F9B"/>
     <w:rsid w:val="00AA7EBC"/>
+    <w:rsid w:val="00AD2CDE"/>
     <w:rsid w:val="00B34875"/>
     <w:rsid w:val="00B82D9E"/>
     <w:rsid w:val="00BD0A3D"/>
@@ -7881,7 +8090,7 @@
 </file>
 
 <file path=word/glossary/styles.xml><?xml version="1.0" encoding="utf-8"?>
-<w:styles xmlns:mc="http://schemas.openxmlformats.org/markup-compatibility/2006" xmlns:r="http://schemas.openxmlformats.org/officeDocument/2006/relationships" xmlns:w="http://schemas.openxmlformats.org/wordprocessingml/2006/main" xmlns:w14="http://schemas.microsoft.com/office/word/2010/wordml" xmlns:w15="http://schemas.microsoft.com/office/word/2012/wordml" xmlns:w16cex="http://schemas.microsoft.com/office/word/2018/wordml/cex" xmlns:w16cid="http://schemas.microsoft.com/office/word/2016/wordml/cid" xmlns:w16="http://schemas.microsoft.com/office/word/2018/wordml" xmlns:w16sdtdh="http://schemas.microsoft.com/office/word/2020/wordml/sdtdatahash" xmlns:w16se="http://schemas.microsoft.com/office/word/2015/wordml/symex" mc:Ignorable="w14 w15 w16se w16cid w16 w16cex w16sdtdh">
+<w:styles xmlns:mc="http://schemas.openxmlformats.org/markup-compatibility/2006" xmlns:r="http://schemas.openxmlformats.org/officeDocument/2006/relationships" xmlns:w="http://schemas.openxmlformats.org/wordprocessingml/2006/main" xmlns:w14="http://schemas.microsoft.com/office/word/2010/wordml" xmlns:w15="http://schemas.microsoft.com/office/word/2012/wordml" xmlns:w16cex="http://schemas.microsoft.com/office/word/2018/wordml/cex" xmlns:w16cid="http://schemas.microsoft.com/office/word/2016/wordml/cid" xmlns:w16="http://schemas.microsoft.com/office/word/2018/wordml" xmlns:w16du="http://schemas.microsoft.com/office/word/2023/wordml/word16du" xmlns:w16sdtdh="http://schemas.microsoft.com/office/word/2020/wordml/sdtdatahash" xmlns:w16sdtfl="http://schemas.microsoft.com/office/word/2024/wordml/sdtformatlock" xmlns:w16se="http://schemas.microsoft.com/office/word/2015/wordml/symex" mc:Ignorable="w14 w15 w16se w16cid w16 w16cex w16sdtdh w16sdtfl w16du">
   <w:docDefaults>
     <w:rPrDefault>
       <w:rPr>
@@ -8332,7 +8541,7 @@
 </file>
 
 <file path=word/glossary/webSettings.xml><?xml version="1.0" encoding="utf-8"?>
-<w:webSettings xmlns:mc="http://schemas.openxmlformats.org/markup-compatibility/2006" xmlns:r="http://schemas.openxmlformats.org/officeDocument/2006/relationships" xmlns:w="http://schemas.openxmlformats.org/wordprocessingml/2006/main" xmlns:w14="http://schemas.microsoft.com/office/word/2010/wordml" xmlns:w15="http://schemas.microsoft.com/office/word/2012/wordml" xmlns:w16cex="http://schemas.microsoft.com/office/word/2018/wordml/cex" xmlns:w16cid="http://schemas.microsoft.com/office/word/2016/wordml/cid" xmlns:w16="http://schemas.microsoft.com/office/word/2018/wordml" xmlns:w16sdtdh="http://schemas.microsoft.com/office/word/2020/wordml/sdtdatahash" xmlns:w16se="http://schemas.microsoft.com/office/word/2015/wordml/symex" mc:Ignorable="w14 w15 w16se w16cid w16 w16cex w16sdtdh">
+<w:webSettings xmlns:mc="http://schemas.openxmlformats.org/markup-compatibility/2006" xmlns:r="http://schemas.openxmlformats.org/officeDocument/2006/relationships" xmlns:w="http://schemas.openxmlformats.org/wordprocessingml/2006/main" xmlns:w14="http://schemas.microsoft.com/office/word/2010/wordml" xmlns:w15="http://schemas.microsoft.com/office/word/2012/wordml" xmlns:w16cex="http://schemas.microsoft.com/office/word/2018/wordml/cex" xmlns:w16cid="http://schemas.microsoft.com/office/word/2016/wordml/cid" xmlns:w16="http://schemas.microsoft.com/office/word/2018/wordml" xmlns:w16du="http://schemas.microsoft.com/office/word/2023/wordml/word16du" xmlns:w16sdtdh="http://schemas.microsoft.com/office/word/2020/wordml/sdtdatahash" xmlns:w16sdtfl="http://schemas.microsoft.com/office/word/2024/wordml/sdtformatlock" xmlns:w16se="http://schemas.microsoft.com/office/word/2015/wordml/symex" mc:Ignorable="w14 w15 w16se w16cid w16 w16cex w16sdtdh w16sdtfl w16du">
   <w:optimizeForBrowser/>
   <w:allowPNG/>
 </w:webSettings>
@@ -8624,6 +8833,15 @@
 </file>
 
 <file path=customXml/item1.xml><?xml version="1.0" encoding="utf-8"?>
+<?mso-contentType ?>
+<FormTemplates xmlns="http://schemas.microsoft.com/sharepoint/v3/contenttype/forms">
+  <Display>DocumentLibraryForm</Display>
+  <Edit>DocumentLibraryForm</Edit>
+  <New>DocumentLibraryForm</New>
+</FormTemplates>
+</file>
+
+<file path=customXml/item2.xml><?xml version="1.0" encoding="utf-8"?>
 <p:properties xmlns:p="http://schemas.microsoft.com/office/2006/metadata/properties" xmlns:xsi="http://www.w3.org/2001/XMLSchema-instance" xmlns:pc="http://schemas.microsoft.com/office/infopath/2007/PartnerControls">
   <documentManagement>
     <lcf76f155ced4ddcb4097134ff3c332f xmlns="b295003c-aa87-407e-9024-fdee4e88f6fa">
@@ -8633,16 +8851,11 @@
 </p:properties>
 </file>
 
-<file path=customXml/item2.xml><?xml version="1.0" encoding="utf-8"?>
-<?mso-contentType ?>
-<FormTemplates xmlns="http://schemas.microsoft.com/sharepoint/v3/contenttype/forms">
-  <Display>DocumentLibraryForm</Display>
-  <Edit>DocumentLibraryForm</Edit>
-  <New>DocumentLibraryForm</New>
-</FormTemplates>
+<file path=customXml/item3.xml><?xml version="1.0" encoding="utf-8"?>
+<b:Sources xmlns:b="http://schemas.openxmlformats.org/officeDocument/2006/bibliography" xmlns="http://schemas.openxmlformats.org/officeDocument/2006/bibliography" SelectedStyle="\APA.XSL" StyleName="APA"/>
 </file>
 
-<file path=customXml/item3.xml><?xml version="1.0" encoding="utf-8"?>
+<file path=customXml/item4.xml><?xml version="1.0" encoding="utf-8"?>
 <ct:contentTypeSchema xmlns:ct="http://schemas.microsoft.com/office/2006/metadata/contentType" xmlns:ma="http://schemas.microsoft.com/office/2006/metadata/properties/metaAttributes" ct:_="" ma:_="" ma:contentTypeName="Document" ma:contentTypeID="0x010100A3FA4CB5114F4B43B99F0B6DC8751D90" ma:contentTypeVersion="10" ma:contentTypeDescription="Crée un document." ma:contentTypeScope="" ma:versionID="501205be520febb413c56432ff8e6df1">
   <xsd:schema xmlns:xsd="http://www.w3.org/2001/XMLSchema" xmlns:xs="http://www.w3.org/2001/XMLSchema" xmlns:p="http://schemas.microsoft.com/office/2006/metadata/properties" xmlns:ns2="b295003c-aa87-407e-9024-fdee4e88f6fa" targetNamespace="http://schemas.microsoft.com/office/2006/metadata/properties" ma:root="true" ma:fieldsID="0378f5bf275aa5e8e5bb75b38d3da7db" ns2:_="">
     <xsd:import namespace="b295003c-aa87-407e-9024-fdee4e88f6fa"/>
@@ -8820,11 +9033,15 @@
 </ct:contentTypeSchema>
 </file>
 
-<file path=customXml/item4.xml><?xml version="1.0" encoding="utf-8"?>
-<b:Sources xmlns:b="http://schemas.openxmlformats.org/officeDocument/2006/bibliography" xmlns="http://schemas.openxmlformats.org/officeDocument/2006/bibliography" SelectedStyle="\APA.XSL" StyleName="APA"/>
+<file path=customXml/itemProps1.xml><?xml version="1.0" encoding="utf-8"?>
+<ds:datastoreItem xmlns:ds="http://schemas.openxmlformats.org/officeDocument/2006/customXml" ds:itemID="{EEE2973D-7DD7-4773-855D-5CAD81242BDE}">
+  <ds:schemaRefs>
+    <ds:schemaRef ds:uri="http://schemas.microsoft.com/sharepoint/v3/contenttype/forms"/>
+  </ds:schemaRefs>
+</ds:datastoreItem>
 </file>
 
-<file path=customXml/itemProps1.xml><?xml version="1.0" encoding="utf-8"?>
+<file path=customXml/itemProps2.xml><?xml version="1.0" encoding="utf-8"?>
 <ds:datastoreItem xmlns:ds="http://schemas.openxmlformats.org/officeDocument/2006/customXml" ds:itemID="{1159403A-C237-488E-8C5E-DABF9FCE7043}">
   <ds:schemaRefs>
     <ds:schemaRef ds:uri="http://schemas.microsoft.com/office/2006/metadata/properties"/>
@@ -8834,15 +9051,15 @@
 </ds:datastoreItem>
 </file>
 
-<file path=customXml/itemProps2.xml><?xml version="1.0" encoding="utf-8"?>
-<ds:datastoreItem xmlns:ds="http://schemas.openxmlformats.org/officeDocument/2006/customXml" ds:itemID="{EEE2973D-7DD7-4773-855D-5CAD81242BDE}">
+<file path=customXml/itemProps3.xml><?xml version="1.0" encoding="utf-8"?>
+<ds:datastoreItem xmlns:ds="http://schemas.openxmlformats.org/officeDocument/2006/customXml" ds:itemID="{0FF0F878-5F0F-460C-9013-40E72731A637}">
   <ds:schemaRefs>
-    <ds:schemaRef ds:uri="http://schemas.microsoft.com/sharepoint/v3/contenttype/forms"/>
+    <ds:schemaRef ds:uri="http://schemas.openxmlformats.org/officeDocument/2006/bibliography"/>
   </ds:schemaRefs>
 </ds:datastoreItem>
 </file>
 
-<file path=customXml/itemProps3.xml><?xml version="1.0" encoding="utf-8"?>
+<file path=customXml/itemProps4.xml><?xml version="1.0" encoding="utf-8"?>
 <ds:datastoreItem xmlns:ds="http://schemas.openxmlformats.org/officeDocument/2006/customXml" ds:itemID="{B747A848-EED6-42A4-AAA3-C39C067A5137}">
   <ds:schemaRefs>
     <ds:schemaRef ds:uri="http://schemas.microsoft.com/office/2006/metadata/contentType"/>
@@ -8858,12 +9075,4 @@
     <ds:schemaRef ds:uri="http://schemas.microsoft.com/internal/obd"/>
   </ds:schemaRefs>
 </ds:datastoreItem>
-</file>
-
-<file path=customXml/itemProps4.xml><?xml version="1.0" encoding="utf-8"?>
-<ds:datastoreItem xmlns:ds="http://schemas.openxmlformats.org/officeDocument/2006/customXml" ds:itemID="{0FF0F878-5F0F-460C-9013-40E72731A637}">
-  <ds:schemaRefs>
-    <ds:schemaRef ds:uri="http://schemas.openxmlformats.org/officeDocument/2006/bibliography"/>
-  </ds:schemaRefs>
-</ds:datastoreItem>
 </file>
</xml_diff>

<commit_message>
correction bugs : Fixes #9, #10
</commit_message>
<xml_diff>
--- a/assistant complexe.docx
+++ b/assistant complexe.docx
@@ -187,7 +187,7 @@
                 <w:sz w:val="28"/>
                 <w:szCs w:val="28"/>
               </w:rPr>
-              <w:t>2.1</w:t>
+              <w:t>3.0</w:t>
             </w:r>
           </w:p>
         </w:tc>
@@ -425,7 +425,23 @@
                     <w:b/>
                     <w:szCs w:val="18"/>
                   </w:rPr>
-                  <w:t>2.1</w:t>
+                  <w:t>3</w:t>
+                </w:r>
+                <w:r>
+                  <w:rPr>
+                    <w:rFonts w:cs="Arial"/>
+                    <w:b/>
+                    <w:szCs w:val="18"/>
+                  </w:rPr>
+                  <w:t>.</w:t>
+                </w:r>
+                <w:r>
+                  <w:rPr>
+                    <w:rFonts w:cs="Arial"/>
+                    <w:b/>
+                    <w:szCs w:val="18"/>
+                  </w:rPr>
+                  <w:t>0</w:t>
                 </w:r>
               </w:sdtContent>
             </w:sdt>
@@ -1493,6 +1509,97 @@
           </w:p>
         </w:tc>
       </w:tr>
+      <w:tr>
+        <w:tc>
+          <w:tcPr>
+            <w:tcW w:w="1115" w:type="dxa"/>
+          </w:tcPr>
+          <w:p>
+            <w:pPr>
+              <w:ind w:firstLine="34"/>
+              <w:jc w:val="center"/>
+              <w:rPr>
+                <w:rFonts w:cs="Arial"/>
+                <w:szCs w:val="18"/>
+              </w:rPr>
+            </w:pPr>
+            <w:r>
+              <w:rPr>
+                <w:rFonts w:cs="Arial"/>
+                <w:szCs w:val="18"/>
+              </w:rPr>
+              <w:t>1.3.0</w:t>
+            </w:r>
+          </w:p>
+        </w:tc>
+        <w:tc>
+          <w:tcPr>
+            <w:tcW w:w="1514" w:type="dxa"/>
+          </w:tcPr>
+          <w:p>
+            <w:pPr>
+              <w:rPr>
+                <w:rFonts w:cs="Arial"/>
+                <w:szCs w:val="18"/>
+              </w:rPr>
+            </w:pPr>
+            <w:r>
+              <w:rPr>
+                <w:rFonts w:cs="Arial"/>
+                <w:szCs w:val="18"/>
+              </w:rPr>
+              <w:t>15/04/2026</w:t>
+            </w:r>
+          </w:p>
+        </w:tc>
+        <w:tc>
+          <w:tcPr>
+            <w:tcW w:w="2472" w:type="dxa"/>
+          </w:tcPr>
+          <w:p>
+            <w:pPr>
+              <w:rPr>
+                <w:rFonts w:cs="Arial"/>
+                <w:szCs w:val="18"/>
+              </w:rPr>
+            </w:pPr>
+            <w:r>
+              <w:rPr>
+                <w:rFonts w:cs="Arial"/>
+                <w:szCs w:val="18"/>
+              </w:rPr>
+              <w:t>Gérôme PECHEUR</w:t>
+            </w:r>
+          </w:p>
+        </w:tc>
+        <w:tc>
+          <w:tcPr>
+            <w:tcW w:w="4771" w:type="dxa"/>
+          </w:tcPr>
+          <w:p>
+            <w:pPr>
+              <w:rPr>
+                <w:rFonts w:cs="Arial"/>
+                <w:szCs w:val="18"/>
+              </w:rPr>
+            </w:pPr>
+            <w:r>
+              <w:rPr>
+                <w:rFonts w:cs="Arial"/>
+                <w:szCs w:val="18"/>
+              </w:rPr>
+              <w:t>Adaptation à la version 1.</w:t>
+            </w:r>
+            <w:r>
+              <w:rPr>
+                <w:rFonts w:cs="Arial"/>
+                <w:szCs w:val="18"/>
+              </w:rPr>
+              <w:t>3.0</w:t>
+            </w:r>
+          </w:p>
+        </w:tc>
+      </w:tr>
     </w:tbl>
     <w:p>
       <w:pPr>
@@ -1546,8 +1653,10 @@
             <w:rPr>
               <w:rFonts w:asciiTheme="minorHAnsi" w:eastAsiaTheme="minorEastAsia" w:hAnsiTheme="minorHAnsi" w:cstheme="minorBidi"/>
               <w:smallCaps w:val="0"/>
-              <w:sz w:val="22"/>
-              <w:szCs w:val="22"/>
+              <w:kern w:val="2"/>
+              <w:sz w:val="24"/>
+              <w:szCs w:val="24"/>
+              <w14:ligatures w14:val="standardContextual"/>
             </w:rPr>
           </w:pPr>
           <w:r>
@@ -1559,7 +1668,7 @@
           <w:r>
             <w:fldChar w:fldCharType="separate"/>
           </w:r>
-          <w:hyperlink w:anchor="_Toc204093306" w:history="1">
+          <w:hyperlink w:anchor="_Toc227170881" w:history="1">
             <w:r>
               <w:rPr>
                 <w:rStyle w:val="Lienhypertexte"/>
@@ -1570,8 +1679,10 @@
               <w:rPr>
                 <w:rFonts w:asciiTheme="minorHAnsi" w:eastAsiaTheme="minorEastAsia" w:hAnsiTheme="minorHAnsi" w:cstheme="minorBidi"/>
                 <w:smallCaps w:val="0"/>
-                <w:sz w:val="22"/>
-                <w:szCs w:val="22"/>
+                <w:kern w:val="2"/>
+                <w:sz w:val="24"/>
+                <w:szCs w:val="24"/>
+                <w14:ligatures w14:val="standardContextual"/>
               </w:rPr>
               <w:tab/>
             </w:r>
@@ -1597,7 +1708,7 @@
               <w:rPr>
                 <w:webHidden/>
               </w:rPr>
-              <w:instrText xml:space="preserve"> PAGEREF _Toc204093306 \h </w:instrText>
+              <w:instrText xml:space="preserve"> PAGEREF _Toc227170881 \h </w:instrText>
             </w:r>
             <w:r>
               <w:rPr>
@@ -1630,11 +1741,13 @@
             <w:rPr>
               <w:rFonts w:asciiTheme="minorHAnsi" w:eastAsiaTheme="minorEastAsia" w:hAnsiTheme="minorHAnsi" w:cstheme="minorBidi"/>
               <w:smallCaps w:val="0"/>
-              <w:sz w:val="22"/>
-              <w:szCs w:val="22"/>
+              <w:kern w:val="2"/>
+              <w:sz w:val="24"/>
+              <w:szCs w:val="24"/>
+              <w14:ligatures w14:val="standardContextual"/>
             </w:rPr>
           </w:pPr>
-          <w:hyperlink w:anchor="_Toc204093307" w:history="1">
+          <w:hyperlink w:anchor="_Toc227170882" w:history="1">
             <w:r>
               <w:rPr>
                 <w:rStyle w:val="Lienhypertexte"/>
@@ -1645,8 +1758,10 @@
               <w:rPr>
                 <w:rFonts w:asciiTheme="minorHAnsi" w:eastAsiaTheme="minorEastAsia" w:hAnsiTheme="minorHAnsi" w:cstheme="minorBidi"/>
                 <w:smallCaps w:val="0"/>
-                <w:sz w:val="22"/>
-                <w:szCs w:val="22"/>
+                <w:kern w:val="2"/>
+                <w:sz w:val="24"/>
+                <w:szCs w:val="24"/>
+                <w14:ligatures w14:val="standardContextual"/>
               </w:rPr>
               <w:tab/>
             </w:r>
@@ -1672,7 +1787,7 @@
               <w:rPr>
                 <w:webHidden/>
               </w:rPr>
-              <w:instrText xml:space="preserve"> PAGEREF _Toc204093307 \h </w:instrText>
+              <w:instrText xml:space="preserve"> PAGEREF _Toc227170882 \h </w:instrText>
             </w:r>
             <w:r>
               <w:rPr>
@@ -1705,11 +1820,13 @@
             <w:rPr>
               <w:rFonts w:asciiTheme="minorHAnsi" w:eastAsiaTheme="minorEastAsia" w:hAnsiTheme="minorHAnsi" w:cstheme="minorBidi"/>
               <w:smallCaps w:val="0"/>
-              <w:sz w:val="22"/>
-              <w:szCs w:val="22"/>
+              <w:kern w:val="2"/>
+              <w:sz w:val="24"/>
+              <w:szCs w:val="24"/>
+              <w14:ligatures w14:val="standardContextual"/>
             </w:rPr>
           </w:pPr>
-          <w:hyperlink w:anchor="_Toc204093308" w:history="1">
+          <w:hyperlink w:anchor="_Toc227170883" w:history="1">
             <w:r>
               <w:rPr>
                 <w:rStyle w:val="Lienhypertexte"/>
@@ -1720,8 +1837,10 @@
               <w:rPr>
                 <w:rFonts w:asciiTheme="minorHAnsi" w:eastAsiaTheme="minorEastAsia" w:hAnsiTheme="minorHAnsi" w:cstheme="minorBidi"/>
                 <w:smallCaps w:val="0"/>
-                <w:sz w:val="22"/>
-                <w:szCs w:val="22"/>
+                <w:kern w:val="2"/>
+                <w:sz w:val="24"/>
+                <w:szCs w:val="24"/>
+                <w14:ligatures w14:val="standardContextual"/>
               </w:rPr>
               <w:tab/>
             </w:r>
@@ -1747,7 +1866,7 @@
               <w:rPr>
                 <w:webHidden/>
               </w:rPr>
-              <w:instrText xml:space="preserve"> PAGEREF _Toc204093308 \h </w:instrText>
+              <w:instrText xml:space="preserve"> PAGEREF _Toc227170883 \h </w:instrText>
             </w:r>
             <w:r>
               <w:rPr>
@@ -1780,11 +1899,13 @@
             <w:rPr>
               <w:rFonts w:asciiTheme="minorHAnsi" w:eastAsiaTheme="minorEastAsia" w:hAnsiTheme="minorHAnsi" w:cstheme="minorBidi"/>
               <w:smallCaps w:val="0"/>
-              <w:sz w:val="22"/>
-              <w:szCs w:val="22"/>
+              <w:kern w:val="2"/>
+              <w:sz w:val="24"/>
+              <w:szCs w:val="24"/>
+              <w14:ligatures w14:val="standardContextual"/>
             </w:rPr>
           </w:pPr>
-          <w:hyperlink w:anchor="_Toc204093309" w:history="1">
+          <w:hyperlink w:anchor="_Toc227170884" w:history="1">
             <w:r>
               <w:rPr>
                 <w:rStyle w:val="Lienhypertexte"/>
@@ -1795,8 +1916,10 @@
               <w:rPr>
                 <w:rFonts w:asciiTheme="minorHAnsi" w:eastAsiaTheme="minorEastAsia" w:hAnsiTheme="minorHAnsi" w:cstheme="minorBidi"/>
                 <w:smallCaps w:val="0"/>
-                <w:sz w:val="22"/>
-                <w:szCs w:val="22"/>
+                <w:kern w:val="2"/>
+                <w:sz w:val="24"/>
+                <w:szCs w:val="24"/>
+                <w14:ligatures w14:val="standardContextual"/>
               </w:rPr>
               <w:tab/>
             </w:r>
@@ -1822,7 +1945,7 @@
               <w:rPr>
                 <w:webHidden/>
               </w:rPr>
-              <w:instrText xml:space="preserve"> PAGEREF _Toc204093309 \h </w:instrText>
+              <w:instrText xml:space="preserve"> PAGEREF _Toc227170884 \h </w:instrText>
             </w:r>
             <w:r>
               <w:rPr>
@@ -1855,11 +1978,13 @@
             <w:rPr>
               <w:rFonts w:asciiTheme="minorHAnsi" w:eastAsiaTheme="minorEastAsia" w:hAnsiTheme="minorHAnsi" w:cstheme="minorBidi"/>
               <w:smallCaps w:val="0"/>
-              <w:sz w:val="22"/>
-              <w:szCs w:val="22"/>
+              <w:kern w:val="2"/>
+              <w:sz w:val="24"/>
+              <w:szCs w:val="24"/>
+              <w14:ligatures w14:val="standardContextual"/>
             </w:rPr>
           </w:pPr>
-          <w:hyperlink w:anchor="_Toc204093310" w:history="1">
+          <w:hyperlink w:anchor="_Toc227170885" w:history="1">
             <w:r>
               <w:rPr>
                 <w:rStyle w:val="Lienhypertexte"/>
@@ -1870,8 +1995,10 @@
               <w:rPr>
                 <w:rFonts w:asciiTheme="minorHAnsi" w:eastAsiaTheme="minorEastAsia" w:hAnsiTheme="minorHAnsi" w:cstheme="minorBidi"/>
                 <w:smallCaps w:val="0"/>
-                <w:sz w:val="22"/>
-                <w:szCs w:val="22"/>
+                <w:kern w:val="2"/>
+                <w:sz w:val="24"/>
+                <w:szCs w:val="24"/>
+                <w14:ligatures w14:val="standardContextual"/>
               </w:rPr>
               <w:tab/>
             </w:r>
@@ -1897,7 +2024,7 @@
               <w:rPr>
                 <w:webHidden/>
               </w:rPr>
-              <w:instrText xml:space="preserve"> PAGEREF _Toc204093310 \h </w:instrText>
+              <w:instrText xml:space="preserve"> PAGEREF _Toc227170885 \h </w:instrText>
             </w:r>
             <w:r>
               <w:rPr>
@@ -1929,11 +2056,13 @@
             <w:pStyle w:val="TM2"/>
             <w:rPr>
               <w:rFonts w:asciiTheme="minorHAnsi" w:eastAsiaTheme="minorEastAsia" w:hAnsiTheme="minorHAnsi" w:cstheme="minorBidi"/>
-              <w:sz w:val="22"/>
-              <w:szCs w:val="22"/>
+              <w:kern w:val="2"/>
+              <w:sz w:val="24"/>
+              <w:szCs w:val="24"/>
+              <w14:ligatures w14:val="standardContextual"/>
             </w:rPr>
           </w:pPr>
-          <w:hyperlink w:anchor="_Toc204093311" w:history="1">
+          <w:hyperlink w:anchor="_Toc227170886" w:history="1">
             <w:r>
               <w:rPr>
                 <w:rStyle w:val="Lienhypertexte"/>
@@ -1943,8 +2072,10 @@
             <w:r>
               <w:rPr>
                 <w:rFonts w:asciiTheme="minorHAnsi" w:eastAsiaTheme="minorEastAsia" w:hAnsiTheme="minorHAnsi" w:cstheme="minorBidi"/>
-                <w:sz w:val="22"/>
-                <w:szCs w:val="22"/>
+                <w:kern w:val="2"/>
+                <w:sz w:val="24"/>
+                <w:szCs w:val="24"/>
+                <w14:ligatures w14:val="standardContextual"/>
               </w:rPr>
               <w:tab/>
             </w:r>
@@ -1970,7 +2101,7 @@
               <w:rPr>
                 <w:webHidden/>
               </w:rPr>
-              <w:instrText xml:space="preserve"> PAGEREF _Toc204093311 \h </w:instrText>
+              <w:instrText xml:space="preserve"> PAGEREF _Toc227170886 \h </w:instrText>
             </w:r>
             <w:r>
               <w:rPr>
@@ -2002,11 +2133,13 @@
             <w:pStyle w:val="TM2"/>
             <w:rPr>
               <w:rFonts w:asciiTheme="minorHAnsi" w:eastAsiaTheme="minorEastAsia" w:hAnsiTheme="minorHAnsi" w:cstheme="minorBidi"/>
-              <w:sz w:val="22"/>
-              <w:szCs w:val="22"/>
+              <w:kern w:val="2"/>
+              <w:sz w:val="24"/>
+              <w:szCs w:val="24"/>
+              <w14:ligatures w14:val="standardContextual"/>
             </w:rPr>
           </w:pPr>
-          <w:hyperlink w:anchor="_Toc204093312" w:history="1">
+          <w:hyperlink w:anchor="_Toc227170887" w:history="1">
             <w:r>
               <w:rPr>
                 <w:rStyle w:val="Lienhypertexte"/>
@@ -2016,8 +2149,10 @@
             <w:r>
               <w:rPr>
                 <w:rFonts w:asciiTheme="minorHAnsi" w:eastAsiaTheme="minorEastAsia" w:hAnsiTheme="minorHAnsi" w:cstheme="minorBidi"/>
-                <w:sz w:val="22"/>
-                <w:szCs w:val="22"/>
+                <w:kern w:val="2"/>
+                <w:sz w:val="24"/>
+                <w:szCs w:val="24"/>
+                <w14:ligatures w14:val="standardContextual"/>
               </w:rPr>
               <w:tab/>
             </w:r>
@@ -2043,7 +2178,7 @@
               <w:rPr>
                 <w:webHidden/>
               </w:rPr>
-              <w:instrText xml:space="preserve"> PAGEREF _Toc204093312 \h </w:instrText>
+              <w:instrText xml:space="preserve"> PAGEREF _Toc227170887 \h </w:instrText>
             </w:r>
             <w:r>
               <w:rPr>
@@ -2076,11 +2211,13 @@
             <w:rPr>
               <w:rFonts w:asciiTheme="minorHAnsi" w:eastAsiaTheme="minorEastAsia" w:hAnsiTheme="minorHAnsi" w:cstheme="minorBidi"/>
               <w:smallCaps w:val="0"/>
-              <w:sz w:val="22"/>
-              <w:szCs w:val="22"/>
+              <w:kern w:val="2"/>
+              <w:sz w:val="24"/>
+              <w:szCs w:val="24"/>
+              <w14:ligatures w14:val="standardContextual"/>
             </w:rPr>
           </w:pPr>
-          <w:hyperlink w:anchor="_Toc204093313" w:history="1">
+          <w:hyperlink w:anchor="_Toc227170888" w:history="1">
             <w:r>
               <w:rPr>
                 <w:rStyle w:val="Lienhypertexte"/>
@@ -2091,8 +2228,10 @@
               <w:rPr>
                 <w:rFonts w:asciiTheme="minorHAnsi" w:eastAsiaTheme="minorEastAsia" w:hAnsiTheme="minorHAnsi" w:cstheme="minorBidi"/>
                 <w:smallCaps w:val="0"/>
-                <w:sz w:val="22"/>
-                <w:szCs w:val="22"/>
+                <w:kern w:val="2"/>
+                <w:sz w:val="24"/>
+                <w:szCs w:val="24"/>
+                <w14:ligatures w14:val="standardContextual"/>
               </w:rPr>
               <w:tab/>
             </w:r>
@@ -2118,7 +2257,7 @@
               <w:rPr>
                 <w:webHidden/>
               </w:rPr>
-              <w:instrText xml:space="preserve"> PAGEREF _Toc204093313 \h </w:instrText>
+              <w:instrText xml:space="preserve"> PAGEREF _Toc227170888 \h </w:instrText>
             </w:r>
             <w:r>
               <w:rPr>
@@ -2151,11 +2290,13 @@
             <w:rPr>
               <w:rFonts w:asciiTheme="minorHAnsi" w:eastAsiaTheme="minorEastAsia" w:hAnsiTheme="minorHAnsi" w:cstheme="minorBidi"/>
               <w:smallCaps w:val="0"/>
-              <w:sz w:val="22"/>
-              <w:szCs w:val="22"/>
+              <w:kern w:val="2"/>
+              <w:sz w:val="24"/>
+              <w:szCs w:val="24"/>
+              <w14:ligatures w14:val="standardContextual"/>
             </w:rPr>
           </w:pPr>
-          <w:hyperlink w:anchor="_Toc204093314" w:history="1">
+          <w:hyperlink w:anchor="_Toc227170889" w:history="1">
             <w:r>
               <w:rPr>
                 <w:rStyle w:val="Lienhypertexte"/>
@@ -2166,8 +2307,10 @@
               <w:rPr>
                 <w:rFonts w:asciiTheme="minorHAnsi" w:eastAsiaTheme="minorEastAsia" w:hAnsiTheme="minorHAnsi" w:cstheme="minorBidi"/>
                 <w:smallCaps w:val="0"/>
-                <w:sz w:val="22"/>
-                <w:szCs w:val="22"/>
+                <w:kern w:val="2"/>
+                <w:sz w:val="24"/>
+                <w:szCs w:val="24"/>
+                <w14:ligatures w14:val="standardContextual"/>
               </w:rPr>
               <w:tab/>
             </w:r>
@@ -2193,7 +2336,7 @@
               <w:rPr>
                 <w:webHidden/>
               </w:rPr>
-              <w:instrText xml:space="preserve"> PAGEREF _Toc204093314 \h </w:instrText>
+              <w:instrText xml:space="preserve"> PAGEREF _Toc227170889 \h </w:instrText>
             </w:r>
             <w:r>
               <w:rPr>
@@ -2225,11 +2368,13 @@
             <w:pStyle w:val="TM2"/>
             <w:rPr>
               <w:rFonts w:asciiTheme="minorHAnsi" w:eastAsiaTheme="minorEastAsia" w:hAnsiTheme="minorHAnsi" w:cstheme="minorBidi"/>
-              <w:sz w:val="22"/>
-              <w:szCs w:val="22"/>
+              <w:kern w:val="2"/>
+              <w:sz w:val="24"/>
+              <w:szCs w:val="24"/>
+              <w14:ligatures w14:val="standardContextual"/>
             </w:rPr>
           </w:pPr>
-          <w:hyperlink w:anchor="_Toc204093315" w:history="1">
+          <w:hyperlink w:anchor="_Toc227170890" w:history="1">
             <w:r>
               <w:rPr>
                 <w:rStyle w:val="Lienhypertexte"/>
@@ -2239,8 +2384,10 @@
             <w:r>
               <w:rPr>
                 <w:rFonts w:asciiTheme="minorHAnsi" w:eastAsiaTheme="minorEastAsia" w:hAnsiTheme="minorHAnsi" w:cstheme="minorBidi"/>
-                <w:sz w:val="22"/>
-                <w:szCs w:val="22"/>
+                <w:kern w:val="2"/>
+                <w:sz w:val="24"/>
+                <w:szCs w:val="24"/>
+                <w14:ligatures w14:val="standardContextual"/>
               </w:rPr>
               <w:tab/>
             </w:r>
@@ -2266,7 +2413,7 @@
               <w:rPr>
                 <w:webHidden/>
               </w:rPr>
-              <w:instrText xml:space="preserve"> PAGEREF _Toc204093315 \h </w:instrText>
+              <w:instrText xml:space="preserve"> PAGEREF _Toc227170890 \h </w:instrText>
             </w:r>
             <w:r>
               <w:rPr>
@@ -2299,11 +2446,13 @@
             <w:rPr>
               <w:rFonts w:asciiTheme="minorHAnsi" w:eastAsiaTheme="minorEastAsia" w:hAnsiTheme="minorHAnsi" w:cstheme="minorBidi"/>
               <w:smallCaps w:val="0"/>
-              <w:sz w:val="22"/>
-              <w:szCs w:val="22"/>
+              <w:kern w:val="2"/>
+              <w:sz w:val="24"/>
+              <w:szCs w:val="24"/>
+              <w14:ligatures w14:val="standardContextual"/>
             </w:rPr>
           </w:pPr>
-          <w:hyperlink w:anchor="_Toc204093316" w:history="1">
+          <w:hyperlink w:anchor="_Toc227170891" w:history="1">
             <w:r>
               <w:rPr>
                 <w:rStyle w:val="Lienhypertexte"/>
@@ -2314,8 +2463,10 @@
               <w:rPr>
                 <w:rFonts w:asciiTheme="minorHAnsi" w:eastAsiaTheme="minorEastAsia" w:hAnsiTheme="minorHAnsi" w:cstheme="minorBidi"/>
                 <w:smallCaps w:val="0"/>
-                <w:sz w:val="22"/>
-                <w:szCs w:val="22"/>
+                <w:kern w:val="2"/>
+                <w:sz w:val="24"/>
+                <w:szCs w:val="24"/>
+                <w14:ligatures w14:val="standardContextual"/>
               </w:rPr>
               <w:tab/>
             </w:r>
@@ -2341,7 +2492,7 @@
               <w:rPr>
                 <w:webHidden/>
               </w:rPr>
-              <w:instrText xml:space="preserve"> PAGEREF _Toc204093316 \h </w:instrText>
+              <w:instrText xml:space="preserve"> PAGEREF _Toc227170891 \h </w:instrText>
             </w:r>
             <w:r>
               <w:rPr>
@@ -2373,11 +2524,13 @@
             <w:pStyle w:val="TM2"/>
             <w:rPr>
               <w:rFonts w:asciiTheme="minorHAnsi" w:eastAsiaTheme="minorEastAsia" w:hAnsiTheme="minorHAnsi" w:cstheme="minorBidi"/>
-              <w:sz w:val="22"/>
-              <w:szCs w:val="22"/>
+              <w:kern w:val="2"/>
+              <w:sz w:val="24"/>
+              <w:szCs w:val="24"/>
+              <w14:ligatures w14:val="standardContextual"/>
             </w:rPr>
           </w:pPr>
-          <w:hyperlink w:anchor="_Toc204093317" w:history="1">
+          <w:hyperlink w:anchor="_Toc227170892" w:history="1">
             <w:r>
               <w:rPr>
                 <w:rStyle w:val="Lienhypertexte"/>
@@ -2387,8 +2540,10 @@
             <w:r>
               <w:rPr>
                 <w:rFonts w:asciiTheme="minorHAnsi" w:eastAsiaTheme="minorEastAsia" w:hAnsiTheme="minorHAnsi" w:cstheme="minorBidi"/>
-                <w:sz w:val="22"/>
-                <w:szCs w:val="22"/>
+                <w:kern w:val="2"/>
+                <w:sz w:val="24"/>
+                <w:szCs w:val="24"/>
+                <w14:ligatures w14:val="standardContextual"/>
               </w:rPr>
               <w:tab/>
             </w:r>
@@ -2414,7 +2569,7 @@
               <w:rPr>
                 <w:webHidden/>
               </w:rPr>
-              <w:instrText xml:space="preserve"> PAGEREF _Toc204093317 \h </w:instrText>
+              <w:instrText xml:space="preserve"> PAGEREF _Toc227170892 \h </w:instrText>
             </w:r>
             <w:r>
               <w:rPr>
@@ -2467,7 +2622,7 @@
       <w:pPr>
         <w:pStyle w:val="Titre1"/>
       </w:pPr>
-      <w:bookmarkStart w:id="0" w:name="_Toc204093306"/>
+      <w:bookmarkStart w:id="0" w:name="_Toc227170881"/>
       <w:r>
         <w:t>Prérequis</w:t>
       </w:r>
@@ -2554,7 +2709,13 @@
       </w:r>
       <w:proofErr w:type="spellEnd"/>
       <w:r>
-        <w:t xml:space="preserve"> que l’on trouve dans les guichet en écriture directe </w:t>
+        <w:t xml:space="preserve"> que l’on trouve dans </w:t>
+      </w:r>
+      <w:r>
+        <w:t>les guichets</w:t>
+      </w:r>
+      <w:r>
+        <w:t xml:space="preserve"> en écriture directe </w:t>
       </w:r>
       <w:proofErr w:type="spellStart"/>
       <w:r>
@@ -2651,7 +2812,7 @@
       <w:pPr>
         <w:pStyle w:val="Titre1"/>
       </w:pPr>
-      <w:bookmarkStart w:id="1" w:name="_Toc204093307"/>
+      <w:bookmarkStart w:id="1" w:name="_Toc227170882"/>
       <w:r>
         <w:t>Résumé</w:t>
       </w:r>
@@ -2750,7 +2911,7 @@
       <w:pPr>
         <w:pStyle w:val="Titre1"/>
       </w:pPr>
-      <w:bookmarkStart w:id="2" w:name="_Toc204093308"/>
+      <w:bookmarkStart w:id="2" w:name="_Toc227170883"/>
       <w:r>
         <w:t>Installation</w:t>
       </w:r>
@@ -2831,7 +2992,7 @@
       <w:pPr>
         <w:pStyle w:val="Titre1"/>
       </w:pPr>
-      <w:bookmarkStart w:id="3" w:name="_Toc204093309"/>
+      <w:bookmarkStart w:id="3" w:name="_Toc227170884"/>
       <w:r>
         <w:t>Présentation</w:t>
       </w:r>
@@ -2844,14 +3005,11 @@
         <w:jc w:val="center"/>
       </w:pPr>
       <w:r>
-        <w:rPr>
-          <w:noProof/>
-        </w:rPr>
         <w:drawing>
-          <wp:inline distT="0" distB="0" distL="0" distR="0" wp14:anchorId="5D45B29E" wp14:editId="55E246D1">
+          <wp:inline distT="0" distB="0" distL="0" distR="0" wp14:anchorId="4CABEE91" wp14:editId="7AEC202B">
             <wp:extent cx="4420217" cy="1924319"/>
             <wp:effectExtent l="0" t="0" r="0" b="0"/>
-            <wp:docPr id="5" name="Image 5"/>
+            <wp:docPr id="2039918439" name="Image 1"/>
             <wp:cNvGraphicFramePr>
               <a:graphicFrameLocks xmlns:a="http://schemas.openxmlformats.org/drawingml/2006/main" noChangeAspect="1"/>
             </wp:cNvGraphicFramePr>
@@ -2859,7 +3017,7 @@
               <a:graphicData uri="http://schemas.openxmlformats.org/drawingml/2006/picture">
                 <pic:pic xmlns:pic="http://schemas.openxmlformats.org/drawingml/2006/picture">
                   <pic:nvPicPr>
-                    <pic:cNvPr id="1" name=""/>
+                    <pic:cNvPr id="2039918439" name=""/>
                     <pic:cNvPicPr/>
                   </pic:nvPicPr>
                   <pic:blipFill>
@@ -3317,8 +3475,8 @@
       <w:bookmarkStart w:id="7" w:name="_Toc223756091"/>
       <w:bookmarkStart w:id="8" w:name="_Toc223425647"/>
       <w:bookmarkStart w:id="9" w:name="_Toc223756092"/>
-      <w:bookmarkStart w:id="10" w:name="_Toc204093310"/>
-      <w:bookmarkStart w:id="11" w:name="_Toc215049623"/>
+      <w:bookmarkStart w:id="10" w:name="_Toc215049623"/>
+      <w:bookmarkStart w:id="11" w:name="_Toc227170885"/>
       <w:bookmarkEnd w:id="4"/>
       <w:bookmarkEnd w:id="5"/>
       <w:bookmarkEnd w:id="6"/>
@@ -3332,7 +3490,7 @@
       <w:r>
         <w:t>élection</w:t>
       </w:r>
-      <w:bookmarkEnd w:id="10"/>
+      <w:bookmarkEnd w:id="11"/>
     </w:p>
     <w:p/>
     <w:p>
@@ -3349,7 +3507,7 @@
       <w:pPr>
         <w:pStyle w:val="Titre2"/>
       </w:pPr>
-      <w:bookmarkStart w:id="12" w:name="_Toc204093311"/>
+      <w:bookmarkStart w:id="12" w:name="_Toc227170886"/>
       <w:r>
         <w:t>Sélection unique</w:t>
       </w:r>
@@ -3375,7 +3533,7 @@
       <w:pPr>
         <w:pStyle w:val="Titre2"/>
       </w:pPr>
-      <w:bookmarkStart w:id="13" w:name="_Toc204093312"/>
+      <w:bookmarkStart w:id="13" w:name="_Toc227170887"/>
       <w:r>
         <w:t>Sélection multiple</w:t>
       </w:r>
@@ -3523,7 +3681,7 @@
       <w:pPr>
         <w:pStyle w:val="Titre1"/>
       </w:pPr>
-      <w:bookmarkStart w:id="14" w:name="_Toc204093313"/>
+      <w:bookmarkStart w:id="14" w:name="_Toc227170888"/>
       <w:r>
         <w:t>Modifications</w:t>
       </w:r>
@@ -3553,11 +3711,9 @@
       <w:r>
         <w:t xml:space="preserve"> </w:t>
       </w:r>
-      <w:proofErr w:type="gramStart"/>
-      <w:r>
-        <w:t>si ils</w:t>
-      </w:r>
-      <w:proofErr w:type="gramEnd"/>
+      <w:r>
+        <w:t>s’ils</w:t>
+      </w:r>
       <w:r>
         <w:t xml:space="preserve"> sont dans l’emprise du projet</w:t>
       </w:r>
@@ -3592,10 +3748,10 @@
           <w:noProof/>
         </w:rPr>
         <w:drawing>
-          <wp:inline distT="0" distB="0" distL="0" distR="0" wp14:anchorId="69687751" wp14:editId="3F82E59C">
-            <wp:extent cx="4206240" cy="1829988"/>
-            <wp:effectExtent l="0" t="0" r="3810" b="0"/>
-            <wp:docPr id="15" name="Image 15"/>
+          <wp:inline distT="0" distB="0" distL="0" distR="0" wp14:anchorId="11BF739A" wp14:editId="32FDDEBC">
+            <wp:extent cx="3819525" cy="1662811"/>
+            <wp:effectExtent l="0" t="0" r="0" b="0"/>
+            <wp:docPr id="1781274192" name="Image 1"/>
             <wp:cNvGraphicFramePr>
               <a:graphicFrameLocks xmlns:a="http://schemas.openxmlformats.org/drawingml/2006/main" noChangeAspect="1"/>
             </wp:cNvGraphicFramePr>
@@ -3603,7 +3759,63 @@
               <a:graphicData uri="http://schemas.openxmlformats.org/drawingml/2006/picture">
                 <pic:pic xmlns:pic="http://schemas.openxmlformats.org/drawingml/2006/picture">
                   <pic:nvPicPr>
-                    <pic:cNvPr id="1" name=""/>
+                    <pic:cNvPr id="1781274192" name=""/>
+                    <pic:cNvPicPr/>
+                  </pic:nvPicPr>
+                  <pic:blipFill>
+                    <a:blip r:embed="rId14"/>
+                    <a:stretch>
+                      <a:fillRect/>
+                    </a:stretch>
+                  </pic:blipFill>
+                  <pic:spPr>
+                    <a:xfrm>
+                      <a:off x="0" y="0"/>
+                      <a:ext cx="3825940" cy="1665604"/>
+                    </a:xfrm>
+                    <a:prstGeom prst="rect">
+                      <a:avLst/>
+                    </a:prstGeom>
+                  </pic:spPr>
+                </pic:pic>
+              </a:graphicData>
+            </a:graphic>
+          </wp:inline>
+        </w:drawing>
+      </w:r>
+    </w:p>
+    <w:p/>
+    <w:p>
+      <w:pPr>
+        <w:pStyle w:val="Paragraphedeliste"/>
+        <w:numPr>
+          <w:ilvl w:val="0"/>
+          <w:numId w:val="7"/>
+        </w:numPr>
+      </w:pPr>
+      <w:r>
+        <w:t>On sélectionne le complexe à modifier. La case à cocher passe automatiquement à « cochée »</w:t>
+      </w:r>
+    </w:p>
+    <w:p/>
+    <w:p>
+      <w:pPr>
+        <w:ind w:left="737"/>
+      </w:pPr>
+      <w:r>
+        <w:drawing>
+          <wp:inline distT="0" distB="0" distL="0" distR="0" wp14:anchorId="5E0D011E" wp14:editId="62BCE3A6">
+            <wp:extent cx="3819525" cy="1662811"/>
+            <wp:effectExtent l="0" t="0" r="0" b="0"/>
+            <wp:docPr id="397659307" name="Image 1"/>
+            <wp:cNvGraphicFramePr>
+              <a:graphicFrameLocks xmlns:a="http://schemas.openxmlformats.org/drawingml/2006/main" noChangeAspect="1"/>
+            </wp:cNvGraphicFramePr>
+            <a:graphic xmlns:a="http://schemas.openxmlformats.org/drawingml/2006/main">
+              <a:graphicData uri="http://schemas.openxmlformats.org/drawingml/2006/picture">
+                <pic:pic xmlns:pic="http://schemas.openxmlformats.org/drawingml/2006/picture">
+                  <pic:nvPicPr>
+                    <pic:cNvPr id="397659307" name=""/>
                     <pic:cNvPicPr/>
                   </pic:nvPicPr>
                   <pic:blipFill>
@@ -3615,7 +3827,7 @@
                   <pic:spPr>
                     <a:xfrm>
                       <a:off x="0" y="0"/>
-                      <a:ext cx="4217095" cy="1834710"/>
+                      <a:ext cx="3831718" cy="1668119"/>
                     </a:xfrm>
                     <a:prstGeom prst="rect">
                       <a:avLst/>
@@ -3628,7 +3840,21 @@
         </w:drawing>
       </w:r>
     </w:p>
-    <w:p/>
+    <w:p>
+      <w:pPr>
+        <w:ind w:left="737"/>
+      </w:pPr>
+    </w:p>
+    <w:p>
+      <w:pPr>
+        <w:ind w:left="737"/>
+      </w:pPr>
+    </w:p>
+    <w:p>
+      <w:pPr>
+        <w:ind w:left="737"/>
+      </w:pPr>
+    </w:p>
     <w:p>
       <w:pPr>
         <w:pStyle w:val="Paragraphedeliste"/>
@@ -3638,79 +3864,7 @@
         </w:numPr>
       </w:pPr>
       <w:r>
-        <w:t>On sélectionne le complexe à modifier. La case à cocher passe automatiquement à « cochée »</w:t>
-      </w:r>
-    </w:p>
-    <w:p/>
-    <w:p>
-      <w:pPr>
-        <w:ind w:left="737"/>
-      </w:pPr>
-      <w:r>
-        <w:rPr>
-          <w:noProof/>
-        </w:rPr>
-        <w:drawing>
-          <wp:inline distT="0" distB="0" distL="0" distR="0" wp14:anchorId="0B6BB38A" wp14:editId="600AA340">
-            <wp:extent cx="4206240" cy="1849295"/>
-            <wp:effectExtent l="0" t="0" r="3810" b="0"/>
-            <wp:docPr id="17" name="Image 17"/>
-            <wp:cNvGraphicFramePr>
-              <a:graphicFrameLocks xmlns:a="http://schemas.openxmlformats.org/drawingml/2006/main" noChangeAspect="1"/>
-            </wp:cNvGraphicFramePr>
-            <a:graphic xmlns:a="http://schemas.openxmlformats.org/drawingml/2006/main">
-              <a:graphicData uri="http://schemas.openxmlformats.org/drawingml/2006/picture">
-                <pic:pic xmlns:pic="http://schemas.openxmlformats.org/drawingml/2006/picture">
-                  <pic:nvPicPr>
-                    <pic:cNvPr id="1" name=""/>
-                    <pic:cNvPicPr/>
-                  </pic:nvPicPr>
-                  <pic:blipFill>
-                    <a:blip r:embed="rId23"/>
-                    <a:stretch>
-                      <a:fillRect/>
-                    </a:stretch>
-                  </pic:blipFill>
-                  <pic:spPr>
-                    <a:xfrm>
-                      <a:off x="0" y="0"/>
-                      <a:ext cx="4212184" cy="1851908"/>
-                    </a:xfrm>
-                    <a:prstGeom prst="rect">
-                      <a:avLst/>
-                    </a:prstGeom>
-                  </pic:spPr>
-                </pic:pic>
-              </a:graphicData>
-            </a:graphic>
-          </wp:inline>
-        </w:drawing>
-      </w:r>
-    </w:p>
-    <w:p>
-      <w:pPr>
-        <w:ind w:left="737"/>
-      </w:pPr>
-    </w:p>
-    <w:p>
-      <w:pPr>
-        <w:ind w:left="737"/>
-      </w:pPr>
-    </w:p>
-    <w:p>
-      <w:pPr>
-        <w:ind w:left="737"/>
-      </w:pPr>
-    </w:p>
-    <w:p>
-      <w:pPr>
-        <w:pStyle w:val="Paragraphedeliste"/>
-        <w:numPr>
-          <w:ilvl w:val="0"/>
-          <w:numId w:val="7"/>
-        </w:numPr>
-      </w:pPr>
-      <w:r>
+        <w:lastRenderedPageBreak/>
         <w:t>Le complexe étant fixé on peut :</w:t>
       </w:r>
     </w:p>
@@ -3984,7 +4138,7 @@
                     <pic:cNvPicPr/>
                   </pic:nvPicPr>
                   <pic:blipFill>
-                    <a:blip r:embed="rId24"/>
+                    <a:blip r:embed="rId23"/>
                     <a:stretch>
                       <a:fillRect/>
                     </a:stretch>
@@ -4017,7 +4171,7 @@
       <w:pPr>
         <w:pStyle w:val="Titre1"/>
       </w:pPr>
-      <w:bookmarkStart w:id="15" w:name="_Toc204093314"/>
+      <w:bookmarkStart w:id="15" w:name="_Toc227170889"/>
       <w:r>
         <w:t>Extra</w:t>
       </w:r>
@@ -4026,7 +4180,7 @@
       </w:r>
       <w:bookmarkEnd w:id="15"/>
     </w:p>
-    <w:bookmarkEnd w:id="11"/>
+    <w:bookmarkEnd w:id="10"/>
     <w:p>
       <w:pPr>
         <w:spacing w:line="276" w:lineRule="auto"/>
@@ -4036,7 +4190,7 @@
       <w:pPr>
         <w:pStyle w:val="Titre2"/>
       </w:pPr>
-      <w:bookmarkStart w:id="16" w:name="_Toc204093315"/>
+      <w:bookmarkStart w:id="16" w:name="_Toc227170890"/>
       <w:r>
         <w:t>A propos de</w:t>
       </w:r>
@@ -4074,7 +4228,7 @@
                     <pic:cNvPicPr/>
                   </pic:nvPicPr>
                   <pic:blipFill>
-                    <a:blip r:embed="rId25">
+                    <a:blip r:embed="rId24">
                       <a:extLst>
                         <a:ext uri="{28A0092B-C50C-407E-A947-70E740481C1C}">
                           <a14:useLocalDpi xmlns:a14="http://schemas.microsoft.com/office/drawing/2010/main" val="0"/>
@@ -4111,10 +4265,10 @@
       </w:pPr>
       <w:r>
         <w:drawing>
-          <wp:inline distT="0" distB="0" distL="0" distR="0" wp14:anchorId="3F49CAC2" wp14:editId="51E270F2">
-            <wp:extent cx="3105150" cy="3818067"/>
-            <wp:effectExtent l="0" t="0" r="0" b="0"/>
-            <wp:docPr id="1101342390" name="Image 1" descr="Une image contenant texte, Appareils électroniques, capture d’écran, logiciel&#10;&#10;Le contenu généré par l’IA peut être incorrect."/>
+          <wp:inline distT="0" distB="0" distL="0" distR="0" wp14:anchorId="696896B0" wp14:editId="13F8DB89">
+            <wp:extent cx="3200400" cy="3935186"/>
+            <wp:effectExtent l="0" t="0" r="0" b="8255"/>
+            <wp:docPr id="514181466" name="Image 1"/>
             <wp:cNvGraphicFramePr>
               <a:graphicFrameLocks xmlns:a="http://schemas.openxmlformats.org/drawingml/2006/main" noChangeAspect="1"/>
             </wp:cNvGraphicFramePr>
@@ -4122,11 +4276,11 @@
               <a:graphicData uri="http://schemas.openxmlformats.org/drawingml/2006/picture">
                 <pic:pic xmlns:pic="http://schemas.openxmlformats.org/drawingml/2006/picture">
                   <pic:nvPicPr>
-                    <pic:cNvPr id="1101342390" name="Image 1" descr="Une image contenant texte, Appareils électroniques, capture d’écran, logiciel&#10;&#10;Le contenu généré par l’IA peut être incorrect."/>
+                    <pic:cNvPr id="514181466" name=""/>
                     <pic:cNvPicPr/>
                   </pic:nvPicPr>
                   <pic:blipFill>
-                    <a:blip r:embed="rId26"/>
+                    <a:blip r:embed="rId25"/>
                     <a:stretch>
                       <a:fillRect/>
                     </a:stretch>
@@ -4134,7 +4288,7 @@
                   <pic:spPr>
                     <a:xfrm>
                       <a:off x="0" y="0"/>
-                      <a:ext cx="3111651" cy="3826061"/>
+                      <a:ext cx="3204017" cy="3939633"/>
                     </a:xfrm>
                     <a:prstGeom prst="rect">
                       <a:avLst/>
@@ -4151,11 +4305,6 @@
       </w:r>
     </w:p>
     <w:p>
-      <w:pPr>
-        <w:jc w:val="center"/>
-      </w:pPr>
-    </w:p>
-    <w:p>
       <w:r>
         <w:t>Cette boite permet de suivre l’évolution des différentes versions ainsi que d’afficher cette documentation.</w:t>
       </w:r>
@@ -4169,8 +4318,9 @@
       <w:pPr>
         <w:pStyle w:val="Titre1"/>
       </w:pPr>
-      <w:bookmarkStart w:id="17" w:name="_Toc204093316"/>
-      <w:r>
+      <w:bookmarkStart w:id="17" w:name="_Toc227170891"/>
+      <w:r>
+        <w:lastRenderedPageBreak/>
         <w:t>Annexes</w:t>
       </w:r>
       <w:bookmarkEnd w:id="17"/>
@@ -4180,7 +4330,7 @@
       <w:pPr>
         <w:pStyle w:val="Titre2"/>
       </w:pPr>
-      <w:bookmarkStart w:id="18" w:name="_Toc204093317"/>
+      <w:bookmarkStart w:id="18" w:name="_Toc227170892"/>
       <w:r>
         <w:t xml:space="preserve">Package </w:t>
       </w:r>
@@ -4294,7 +4444,7 @@
                     <pic:cNvPicPr/>
                   </pic:nvPicPr>
                   <pic:blipFill>
-                    <a:blip r:embed="rId27">
+                    <a:blip r:embed="rId26">
                       <a:extLst>
                         <a:ext uri="{28A0092B-C50C-407E-A947-70E740481C1C}">
                           <a14:useLocalDpi xmlns:a14="http://schemas.microsoft.com/office/drawing/2010/main" val="0"/>
@@ -4362,7 +4512,7 @@
                     <pic:cNvPicPr/>
                   </pic:nvPicPr>
                   <pic:blipFill>
-                    <a:blip r:embed="rId28">
+                    <a:blip r:embed="rId27">
                       <a:extLst>
                         <a:ext uri="{28A0092B-C50C-407E-A947-70E740481C1C}">
                           <a14:useLocalDpi xmlns:a14="http://schemas.microsoft.com/office/drawing/2010/main" val="0"/>
@@ -4455,7 +4605,7 @@
                     <pic:cNvPicPr/>
                   </pic:nvPicPr>
                   <pic:blipFill>
-                    <a:blip r:embed="rId29">
+                    <a:blip r:embed="rId28">
                       <a:extLst>
                         <a:ext uri="{28A0092B-C50C-407E-A947-70E740481C1C}">
                           <a14:useLocalDpi xmlns:a14="http://schemas.microsoft.com/office/drawing/2010/main" val="0"/>
@@ -4494,8 +4644,8 @@
     </w:p>
     <w:p/>
     <w:sectPr>
-      <w:footerReference w:type="default" r:id="rId30"/>
-      <w:footerReference w:type="first" r:id="rId31"/>
+      <w:footerReference w:type="default" r:id="rId29"/>
+      <w:footerReference w:type="first" r:id="rId30"/>
       <w:pgSz w:w="11906" w:h="16838" w:code="9"/>
       <w:pgMar w:top="851" w:right="924" w:bottom="1616" w:left="1134" w:header="709" w:footer="607" w:gutter="0"/>
       <w:cols w:space="708"/>
@@ -7993,12 +8143,17 @@
     <w:pitch w:val="variable"/>
     <w:sig w:usb0="00000287" w:usb1="00000800" w:usb2="00000000" w:usb3="00000000" w:csb0="0000009F" w:csb1="00000000"/>
   </w:font>
-  <w:font w:name="Calibri Light">
-    <w:panose1 w:val="020F0302020204030204"/>
+  <w:font w:name="Aptos">
     <w:charset w:val="00"/>
     <w:family w:val="swiss"/>
     <w:pitch w:val="variable"/>
-    <w:sig w:usb0="E4002EFF" w:usb1="C200247B" w:usb2="00000009" w:usb3="00000000" w:csb0="000001FF" w:csb1="00000000"/>
+    <w:sig w:usb0="20000287" w:usb1="00000003" w:usb2="00000000" w:usb3="00000000" w:csb0="0000019F" w:csb1="00000000"/>
+  </w:font>
+  <w:font w:name="Aptos Display">
+    <w:charset w:val="00"/>
+    <w:family w:val="swiss"/>
+    <w:pitch w:val="variable"/>
+    <w:sig w:usb0="20000287" w:usb1="00000003" w:usb2="00000000" w:usb3="00000000" w:csb0="0000019F" w:csb1="00000000"/>
   </w:font>
 </w:fonts>
 </file>
@@ -8025,6 +8180,7 @@
     <w:rsid w:val="00126B47"/>
     <w:rsid w:val="00162DC9"/>
     <w:rsid w:val="001944C2"/>
+    <w:rsid w:val="001A11C1"/>
     <w:rsid w:val="001E19F5"/>
     <w:rsid w:val="00227E5E"/>
     <w:rsid w:val="00284162"/>
@@ -8035,6 +8191,7 @@
     <w:rsid w:val="0054019A"/>
     <w:rsid w:val="00596E3A"/>
     <w:rsid w:val="005A3F1B"/>
+    <w:rsid w:val="005D1A25"/>
     <w:rsid w:val="006723B4"/>
     <w:rsid w:val="006C3956"/>
     <w:rsid w:val="006D3CE9"/>
@@ -8833,15 +8990,6 @@
 </file>
 
 <file path=customXml/item1.xml><?xml version="1.0" encoding="utf-8"?>
-<?mso-contentType ?>
-<FormTemplates xmlns="http://schemas.microsoft.com/sharepoint/v3/contenttype/forms">
-  <Display>DocumentLibraryForm</Display>
-  <Edit>DocumentLibraryForm</Edit>
-  <New>DocumentLibraryForm</New>
-</FormTemplates>
-</file>
-
-<file path=customXml/item2.xml><?xml version="1.0" encoding="utf-8"?>
 <p:properties xmlns:p="http://schemas.microsoft.com/office/2006/metadata/properties" xmlns:xsi="http://www.w3.org/2001/XMLSchema-instance" xmlns:pc="http://schemas.microsoft.com/office/infopath/2007/PartnerControls">
   <documentManagement>
     <lcf76f155ced4ddcb4097134ff3c332f xmlns="b295003c-aa87-407e-9024-fdee4e88f6fa">
@@ -8851,11 +8999,16 @@
 </p:properties>
 </file>
 
-<file path=customXml/item3.xml><?xml version="1.0" encoding="utf-8"?>
-<b:Sources xmlns:b="http://schemas.openxmlformats.org/officeDocument/2006/bibliography" xmlns="http://schemas.openxmlformats.org/officeDocument/2006/bibliography" SelectedStyle="\APA.XSL" StyleName="APA"/>
+<file path=customXml/item2.xml><?xml version="1.0" encoding="utf-8"?>
+<?mso-contentType ?>
+<FormTemplates xmlns="http://schemas.microsoft.com/sharepoint/v3/contenttype/forms">
+  <Display>DocumentLibraryForm</Display>
+  <Edit>DocumentLibraryForm</Edit>
+  <New>DocumentLibraryForm</New>
+</FormTemplates>
 </file>
 
-<file path=customXml/item4.xml><?xml version="1.0" encoding="utf-8"?>
+<file path=customXml/item3.xml><?xml version="1.0" encoding="utf-8"?>
 <ct:contentTypeSchema xmlns:ct="http://schemas.microsoft.com/office/2006/metadata/contentType" xmlns:ma="http://schemas.microsoft.com/office/2006/metadata/properties/metaAttributes" ct:_="" ma:_="" ma:contentTypeName="Document" ma:contentTypeID="0x010100A3FA4CB5114F4B43B99F0B6DC8751D90" ma:contentTypeVersion="10" ma:contentTypeDescription="Crée un document." ma:contentTypeScope="" ma:versionID="501205be520febb413c56432ff8e6df1">
   <xsd:schema xmlns:xsd="http://www.w3.org/2001/XMLSchema" xmlns:xs="http://www.w3.org/2001/XMLSchema" xmlns:p="http://schemas.microsoft.com/office/2006/metadata/properties" xmlns:ns2="b295003c-aa87-407e-9024-fdee4e88f6fa" targetNamespace="http://schemas.microsoft.com/office/2006/metadata/properties" ma:root="true" ma:fieldsID="0378f5bf275aa5e8e5bb75b38d3da7db" ns2:_="">
     <xsd:import namespace="b295003c-aa87-407e-9024-fdee4e88f6fa"/>
@@ -9033,15 +9186,11 @@
 </ct:contentTypeSchema>
 </file>
 
-<file path=customXml/itemProps1.xml><?xml version="1.0" encoding="utf-8"?>
-<ds:datastoreItem xmlns:ds="http://schemas.openxmlformats.org/officeDocument/2006/customXml" ds:itemID="{EEE2973D-7DD7-4773-855D-5CAD81242BDE}">
-  <ds:schemaRefs>
-    <ds:schemaRef ds:uri="http://schemas.microsoft.com/sharepoint/v3/contenttype/forms"/>
-  </ds:schemaRefs>
-</ds:datastoreItem>
+<file path=customXml/item4.xml><?xml version="1.0" encoding="utf-8"?>
+<b:Sources xmlns:b="http://schemas.openxmlformats.org/officeDocument/2006/bibliography" xmlns="http://schemas.openxmlformats.org/officeDocument/2006/bibliography" SelectedStyle="\APA.XSL" StyleName="APA"/>
 </file>
 
-<file path=customXml/itemProps2.xml><?xml version="1.0" encoding="utf-8"?>
+<file path=customXml/itemProps1.xml><?xml version="1.0" encoding="utf-8"?>
 <ds:datastoreItem xmlns:ds="http://schemas.openxmlformats.org/officeDocument/2006/customXml" ds:itemID="{1159403A-C237-488E-8C5E-DABF9FCE7043}">
   <ds:schemaRefs>
     <ds:schemaRef ds:uri="http://schemas.microsoft.com/office/2006/metadata/properties"/>
@@ -9051,15 +9200,15 @@
 </ds:datastoreItem>
 </file>
 
-<file path=customXml/itemProps3.xml><?xml version="1.0" encoding="utf-8"?>
-<ds:datastoreItem xmlns:ds="http://schemas.openxmlformats.org/officeDocument/2006/customXml" ds:itemID="{0FF0F878-5F0F-460C-9013-40E72731A637}">
+<file path=customXml/itemProps2.xml><?xml version="1.0" encoding="utf-8"?>
+<ds:datastoreItem xmlns:ds="http://schemas.openxmlformats.org/officeDocument/2006/customXml" ds:itemID="{EEE2973D-7DD7-4773-855D-5CAD81242BDE}">
   <ds:schemaRefs>
-    <ds:schemaRef ds:uri="http://schemas.openxmlformats.org/officeDocument/2006/bibliography"/>
+    <ds:schemaRef ds:uri="http://schemas.microsoft.com/sharepoint/v3/contenttype/forms"/>
   </ds:schemaRefs>
 </ds:datastoreItem>
 </file>
 
-<file path=customXml/itemProps4.xml><?xml version="1.0" encoding="utf-8"?>
+<file path=customXml/itemProps3.xml><?xml version="1.0" encoding="utf-8"?>
 <ds:datastoreItem xmlns:ds="http://schemas.openxmlformats.org/officeDocument/2006/customXml" ds:itemID="{B747A848-EED6-42A4-AAA3-C39C067A5137}">
   <ds:schemaRefs>
     <ds:schemaRef ds:uri="http://schemas.microsoft.com/office/2006/metadata/contentType"/>
@@ -9075,4 +9224,12 @@
     <ds:schemaRef ds:uri="http://schemas.microsoft.com/internal/obd"/>
   </ds:schemaRefs>
 </ds:datastoreItem>
+</file>
+
+<file path=customXml/itemProps4.xml><?xml version="1.0" encoding="utf-8"?>
+<ds:datastoreItem xmlns:ds="http://schemas.openxmlformats.org/officeDocument/2006/customXml" ds:itemID="{0FF0F878-5F0F-460C-9013-40E72731A637}">
+  <ds:schemaRefs>
+    <ds:schemaRef ds:uri="http://schemas.openxmlformats.org/officeDocument/2006/bibliography"/>
+  </ds:schemaRefs>
+</ds:datastoreItem>
 </file>
</xml_diff>

<commit_message>
ajour doc format markdown
</commit_message>
<xml_diff>
--- a/assistant complexe.docx
+++ b/assistant complexe.docx
@@ -153,42 +153,11 @@
           </w:p>
           <w:p>
             <w:pPr>
-              <w:jc w:val="center"/>
               <w:rPr>
                 <w:sz w:val="28"/>
                 <w:szCs w:val="28"/>
               </w:rPr>
             </w:pPr>
-            <w:r>
-              <w:rPr>
-                <w:rFonts w:ascii="Times New Roman" w:hAnsi="Times New Roman" w:cs="Times New Roman"/>
-                <w:b/>
-                <w:noProof/>
-                <w:sz w:val="28"/>
-                <w:szCs w:val="28"/>
-              </w:rPr>
-              <w:t>V</w:t>
-            </w:r>
-            <w:r>
-              <w:rPr>
-                <w:rFonts w:ascii="Times New Roman" w:hAnsi="Times New Roman" w:cs="Times New Roman"/>
-                <w:b/>
-                <w:noProof/>
-                <w:sz w:val="28"/>
-                <w:szCs w:val="28"/>
-              </w:rPr>
-              <w:t>1.</w:t>
-            </w:r>
-            <w:r>
-              <w:rPr>
-                <w:rFonts w:ascii="Times New Roman" w:hAnsi="Times New Roman" w:cs="Times New Roman"/>
-                <w:b/>
-                <w:noProof/>
-                <w:sz w:val="28"/>
-                <w:szCs w:val="28"/>
-              </w:rPr>
-              <w:t>3.0</w:t>
-            </w:r>
           </w:p>
         </w:tc>
       </w:tr>
@@ -1588,14 +1557,7 @@
                 <w:rFonts w:cs="Arial"/>
                 <w:szCs w:val="18"/>
               </w:rPr>
-              <w:t>Adaptation à la version 1.</w:t>
-            </w:r>
-            <w:r>
-              <w:rPr>
-                <w:rFonts w:cs="Arial"/>
-                <w:szCs w:val="18"/>
-              </w:rPr>
-              <w:t>3.0</w:t>
+              <w:t>Adaptation à la version 1.3.0</w:t>
             </w:r>
           </w:p>
         </w:tc>
@@ -3005,6 +2967,9 @@
         <w:jc w:val="center"/>
       </w:pPr>
       <w:r>
+        <w:rPr>
+          <w:noProof/>
+        </w:rPr>
         <w:drawing>
           <wp:inline distT="0" distB="0" distL="0" distR="0" wp14:anchorId="4CABEE91" wp14:editId="7AEC202B">
             <wp:extent cx="4420217" cy="1924319"/>
@@ -3475,8 +3440,8 @@
       <w:bookmarkStart w:id="7" w:name="_Toc223756091"/>
       <w:bookmarkStart w:id="8" w:name="_Toc223425647"/>
       <w:bookmarkStart w:id="9" w:name="_Toc223756092"/>
-      <w:bookmarkStart w:id="10" w:name="_Toc215049623"/>
-      <w:bookmarkStart w:id="11" w:name="_Toc227170885"/>
+      <w:bookmarkStart w:id="10" w:name="_Toc227170885"/>
+      <w:bookmarkStart w:id="11" w:name="_Toc215049623"/>
       <w:bookmarkEnd w:id="4"/>
       <w:bookmarkEnd w:id="5"/>
       <w:bookmarkEnd w:id="6"/>
@@ -3490,7 +3455,7 @@
       <w:r>
         <w:t>élection</w:t>
       </w:r>
-      <w:bookmarkEnd w:id="11"/>
+      <w:bookmarkEnd w:id="10"/>
     </w:p>
     <w:p/>
     <w:p>
@@ -3803,6 +3768,9 @@
         <w:ind w:left="737"/>
       </w:pPr>
       <w:r>
+        <w:rPr>
+          <w:noProof/>
+        </w:rPr>
         <w:drawing>
           <wp:inline distT="0" distB="0" distL="0" distR="0" wp14:anchorId="5E0D011E" wp14:editId="62BCE3A6">
             <wp:extent cx="3819525" cy="1662811"/>
@@ -4180,7 +4148,7 @@
       </w:r>
       <w:bookmarkEnd w:id="15"/>
     </w:p>
-    <w:bookmarkEnd w:id="10"/>
+    <w:bookmarkEnd w:id="11"/>
     <w:p>
       <w:pPr>
         <w:spacing w:line="276" w:lineRule="auto"/>
@@ -4264,6 +4232,9 @@
         <w:jc w:val="center"/>
       </w:pPr>
       <w:r>
+        <w:rPr>
+          <w:noProof/>
+        </w:rPr>
         <w:drawing>
           <wp:inline distT="0" distB="0" distL="0" distR="0" wp14:anchorId="696896B0" wp14:editId="13F8DB89">
             <wp:extent cx="3200400" cy="3935186"/>
@@ -8201,6 +8172,7 @@
     <w:rsid w:val="00867085"/>
     <w:rsid w:val="008E3192"/>
     <w:rsid w:val="00A07F9B"/>
+    <w:rsid w:val="00A3613D"/>
     <w:rsid w:val="00AA7EBC"/>
     <w:rsid w:val="00AD2CDE"/>
     <w:rsid w:val="00B34875"/>
@@ -8208,6 +8180,7 @@
     <w:rsid w:val="00BD0A3D"/>
     <w:rsid w:val="00C13EA8"/>
     <w:rsid w:val="00C2639B"/>
+    <w:rsid w:val="00C42B23"/>
     <w:rsid w:val="00C47703"/>
     <w:rsid w:val="00CA38A7"/>
     <w:rsid w:val="00CD254D"/>
@@ -8990,6 +8963,15 @@
 </file>
 
 <file path=customXml/item1.xml><?xml version="1.0" encoding="utf-8"?>
+<?mso-contentType ?>
+<FormTemplates xmlns="http://schemas.microsoft.com/sharepoint/v3/contenttype/forms">
+  <Display>DocumentLibraryForm</Display>
+  <Edit>DocumentLibraryForm</Edit>
+  <New>DocumentLibraryForm</New>
+</FormTemplates>
+</file>
+
+<file path=customXml/item2.xml><?xml version="1.0" encoding="utf-8"?>
 <p:properties xmlns:p="http://schemas.microsoft.com/office/2006/metadata/properties" xmlns:xsi="http://www.w3.org/2001/XMLSchema-instance" xmlns:pc="http://schemas.microsoft.com/office/infopath/2007/PartnerControls">
   <documentManagement>
     <lcf76f155ced4ddcb4097134ff3c332f xmlns="b295003c-aa87-407e-9024-fdee4e88f6fa">
@@ -8999,16 +8981,11 @@
 </p:properties>
 </file>
 
-<file path=customXml/item2.xml><?xml version="1.0" encoding="utf-8"?>
-<?mso-contentType ?>
-<FormTemplates xmlns="http://schemas.microsoft.com/sharepoint/v3/contenttype/forms">
-  <Display>DocumentLibraryForm</Display>
-  <Edit>DocumentLibraryForm</Edit>
-  <New>DocumentLibraryForm</New>
-</FormTemplates>
+<file path=customXml/item3.xml><?xml version="1.0" encoding="utf-8"?>
+<b:Sources xmlns:b="http://schemas.openxmlformats.org/officeDocument/2006/bibliography" xmlns="http://schemas.openxmlformats.org/officeDocument/2006/bibliography" SelectedStyle="\APA.XSL" StyleName="APA"/>
 </file>
 
-<file path=customXml/item3.xml><?xml version="1.0" encoding="utf-8"?>
+<file path=customXml/item4.xml><?xml version="1.0" encoding="utf-8"?>
 <ct:contentTypeSchema xmlns:ct="http://schemas.microsoft.com/office/2006/metadata/contentType" xmlns:ma="http://schemas.microsoft.com/office/2006/metadata/properties/metaAttributes" ct:_="" ma:_="" ma:contentTypeName="Document" ma:contentTypeID="0x010100A3FA4CB5114F4B43B99F0B6DC8751D90" ma:contentTypeVersion="10" ma:contentTypeDescription="Crée un document." ma:contentTypeScope="" ma:versionID="501205be520febb413c56432ff8e6df1">
   <xsd:schema xmlns:xsd="http://www.w3.org/2001/XMLSchema" xmlns:xs="http://www.w3.org/2001/XMLSchema" xmlns:p="http://schemas.microsoft.com/office/2006/metadata/properties" xmlns:ns2="b295003c-aa87-407e-9024-fdee4e88f6fa" targetNamespace="http://schemas.microsoft.com/office/2006/metadata/properties" ma:root="true" ma:fieldsID="0378f5bf275aa5e8e5bb75b38d3da7db" ns2:_="">
     <xsd:import namespace="b295003c-aa87-407e-9024-fdee4e88f6fa"/>
@@ -9186,11 +9163,15 @@
 </ct:contentTypeSchema>
 </file>
 
-<file path=customXml/item4.xml><?xml version="1.0" encoding="utf-8"?>
-<b:Sources xmlns:b="http://schemas.openxmlformats.org/officeDocument/2006/bibliography" xmlns="http://schemas.openxmlformats.org/officeDocument/2006/bibliography" SelectedStyle="\APA.XSL" StyleName="APA"/>
+<file path=customXml/itemProps1.xml><?xml version="1.0" encoding="utf-8"?>
+<ds:datastoreItem xmlns:ds="http://schemas.openxmlformats.org/officeDocument/2006/customXml" ds:itemID="{EEE2973D-7DD7-4773-855D-5CAD81242BDE}">
+  <ds:schemaRefs>
+    <ds:schemaRef ds:uri="http://schemas.microsoft.com/sharepoint/v3/contenttype/forms"/>
+  </ds:schemaRefs>
+</ds:datastoreItem>
 </file>
 
-<file path=customXml/itemProps1.xml><?xml version="1.0" encoding="utf-8"?>
+<file path=customXml/itemProps2.xml><?xml version="1.0" encoding="utf-8"?>
 <ds:datastoreItem xmlns:ds="http://schemas.openxmlformats.org/officeDocument/2006/customXml" ds:itemID="{1159403A-C237-488E-8C5E-DABF9FCE7043}">
   <ds:schemaRefs>
     <ds:schemaRef ds:uri="http://schemas.microsoft.com/office/2006/metadata/properties"/>
@@ -9200,15 +9181,15 @@
 </ds:datastoreItem>
 </file>
 
-<file path=customXml/itemProps2.xml><?xml version="1.0" encoding="utf-8"?>
-<ds:datastoreItem xmlns:ds="http://schemas.openxmlformats.org/officeDocument/2006/customXml" ds:itemID="{EEE2973D-7DD7-4773-855D-5CAD81242BDE}">
+<file path=customXml/itemProps3.xml><?xml version="1.0" encoding="utf-8"?>
+<ds:datastoreItem xmlns:ds="http://schemas.openxmlformats.org/officeDocument/2006/customXml" ds:itemID="{0FF0F878-5F0F-460C-9013-40E72731A637}">
   <ds:schemaRefs>
-    <ds:schemaRef ds:uri="http://schemas.microsoft.com/sharepoint/v3/contenttype/forms"/>
+    <ds:schemaRef ds:uri="http://schemas.openxmlformats.org/officeDocument/2006/bibliography"/>
   </ds:schemaRefs>
 </ds:datastoreItem>
 </file>
 
-<file path=customXml/itemProps3.xml><?xml version="1.0" encoding="utf-8"?>
+<file path=customXml/itemProps4.xml><?xml version="1.0" encoding="utf-8"?>
 <ds:datastoreItem xmlns:ds="http://schemas.openxmlformats.org/officeDocument/2006/customXml" ds:itemID="{B747A848-EED6-42A4-AAA3-C39C067A5137}">
   <ds:schemaRefs>
     <ds:schemaRef ds:uri="http://schemas.microsoft.com/office/2006/metadata/contentType"/>
@@ -9224,12 +9205,4 @@
     <ds:schemaRef ds:uri="http://schemas.microsoft.com/internal/obd"/>
   </ds:schemaRefs>
 </ds:datastoreItem>
-</file>
-
-<file path=customXml/itemProps4.xml><?xml version="1.0" encoding="utf-8"?>
-<ds:datastoreItem xmlns:ds="http://schemas.openxmlformats.org/officeDocument/2006/customXml" ds:itemID="{0FF0F878-5F0F-460C-9013-40E72731A637}">
-  <ds:schemaRefs>
-    <ds:schemaRef ds:uri="http://schemas.openxmlformats.org/officeDocument/2006/bibliography"/>
-  </ds:schemaRefs>
-</ds:datastoreItem>
 </file>
</xml_diff>